<commit_message>
Avance análisis apps DI
</commit_message>
<xml_diff>
--- a/Desarrollo_de_Interfaces/UD1_Fundamentos_y_Disenyo_de_Interfaces_de_Usuario/Análisis_3_apps.docx
+++ b/Desarrollo_de_Interfaces/UD1_Fundamentos_y_Disenyo_de_Interfaces_de_Usuario/Análisis_3_apps.docx
@@ -1187,26 +1187,58 @@
     <w:p>
       <w:pPr>
         <w:pStyle w:val="Ttulo"/>
-        <w:ind w:left="-284" w:right="-143"/>
-      </w:pPr>
-      <w:r>
+        <w:ind w:left="-426" w:right="-427"/>
+        <w:rPr>
+          <w:sz w:val="32"/>
+          <w:szCs w:val="32"/>
+        </w:rPr>
+      </w:pPr>
+      <w:r>
+        <w:rPr>
+          <w:sz w:val="32"/>
+          <w:szCs w:val="32"/>
+        </w:rPr>
         <w:lastRenderedPageBreak/>
         <w:t xml:space="preserve">UD1 </w:t>
       </w:r>
       <w:r>
+        <w:rPr>
+          <w:sz w:val="32"/>
+          <w:szCs w:val="32"/>
+        </w:rPr>
         <w:t>Fundamentos y Diseño de Interfaces de Usuario</w:t>
       </w:r>
     </w:p>
     <w:p>
       <w:pPr>
         <w:pStyle w:val="Subttulo"/>
-        <w:ind w:left="-284" w:right="-143"/>
-      </w:pPr>
-      <w:r>
+        <w:ind w:left="-284" w:right="-427"/>
+        <w:jc w:val="center"/>
+        <w:rPr>
+          <w:sz w:val="24"/>
+          <w:szCs w:val="24"/>
+        </w:rPr>
+      </w:pPr>
+      <w:r>
+        <w:rPr>
+          <w:sz w:val="24"/>
+          <w:szCs w:val="24"/>
+        </w:rPr>
         <w:t>Actividad 1</w:t>
       </w:r>
       <w:r>
-        <w:t xml:space="preserve"> – Análisis de aplicaciones</w:t>
+        <w:rPr>
+          <w:sz w:val="24"/>
+          <w:szCs w:val="24"/>
+        </w:rPr>
+        <w:t xml:space="preserve"> – Análisis de </w:t>
+      </w:r>
+      <w:r>
+        <w:rPr>
+          <w:sz w:val="24"/>
+          <w:szCs w:val="24"/>
+        </w:rPr>
+        <w:t>3 apps para su interfaz de usuario</w:t>
       </w:r>
     </w:p>
     <w:p>
@@ -1216,7 +1248,7 @@
           <w:ilvl w:val="0"/>
           <w:numId w:val="2"/>
         </w:numPr>
-        <w:ind w:left="-284" w:right="-143"/>
+        <w:ind w:left="-284" w:right="-427"/>
         <w:rPr>
           <w:lang w:val="en-GB"/>
         </w:rPr>
@@ -1234,7 +1266,19 @@
         <w:rPr>
           <w:lang w:val="en-GB"/>
         </w:rPr>
-        <w:t xml:space="preserve"> (App de Salud y Fitness)</w:t>
+        <w:t xml:space="preserve"> (App de S</w:t>
+      </w:r>
+      <w:r>
+        <w:rPr>
+          <w:lang w:val="en-GB"/>
+        </w:rPr>
+        <w:t>alu</w:t>
+      </w:r>
+      <w:r>
+        <w:rPr>
+          <w:lang w:val="en-GB"/>
+        </w:rPr>
+        <w:t>d y Fitness)</w:t>
       </w:r>
       <w:bookmarkEnd w:id="0"/>
     </w:p>
@@ -1245,6 +1289,7 @@
           <w:ilvl w:val="0"/>
           <w:numId w:val="7"/>
         </w:numPr>
+        <w:ind w:right="-427"/>
       </w:pPr>
       <w:r>
         <w:t>G</w:t>
@@ -1260,6 +1305,7 @@
           <w:ilvl w:val="0"/>
           <w:numId w:val="7"/>
         </w:numPr>
+        <w:ind w:right="-427"/>
       </w:pPr>
       <w:r>
         <w:t>Botón de inicio de sesión/registro</w:t>
@@ -1272,6 +1318,7 @@
           <w:ilvl w:val="0"/>
           <w:numId w:val="7"/>
         </w:numPr>
+        <w:ind w:right="-427"/>
       </w:pPr>
       <w:r>
         <w:t>Listado de ejercicios de la rutina de hoy</w:t>
@@ -1284,6 +1331,7 @@
           <w:ilvl w:val="0"/>
           <w:numId w:val="7"/>
         </w:numPr>
+        <w:ind w:right="-427"/>
       </w:pPr>
       <w:r>
         <w:t>Edición de datos personales (peso, altura)</w:t>
@@ -1296,6 +1344,7 @@
           <w:ilvl w:val="0"/>
           <w:numId w:val="7"/>
         </w:numPr>
+        <w:ind w:right="-427"/>
       </w:pPr>
       <w:r>
         <w:t>Cronómetro para entrenar</w:t>
@@ -1308,6 +1357,7 @@
           <w:ilvl w:val="0"/>
           <w:numId w:val="7"/>
         </w:numPr>
+        <w:ind w:right="-427"/>
       </w:pPr>
       <w:r>
         <w:t>Sección de logros y medallas</w:t>
@@ -1320,6 +1370,7 @@
           <w:ilvl w:val="0"/>
           <w:numId w:val="7"/>
         </w:numPr>
+        <w:ind w:right="-427"/>
       </w:pPr>
       <w:r>
         <w:t xml:space="preserve">Ajustes de la </w:t>
@@ -1340,6 +1391,7 @@
           <w:ilvl w:val="0"/>
           <w:numId w:val="7"/>
         </w:numPr>
+        <w:ind w:right="-427"/>
       </w:pPr>
       <w:r>
         <w:t>Buscador global de recetas</w:t>
@@ -1352,6 +1404,7 @@
           <w:ilvl w:val="0"/>
           <w:numId w:val="7"/>
         </w:numPr>
+        <w:ind w:right="-427"/>
       </w:pPr>
       <w:r>
         <w:t>Formulario para añadir comida personalizada</w:t>
@@ -1364,6 +1417,7 @@
           <w:ilvl w:val="0"/>
           <w:numId w:val="7"/>
         </w:numPr>
+        <w:ind w:right="-427"/>
       </w:pPr>
       <w:r>
         <w:t>Centro de ayuda (</w:t>
@@ -1384,6 +1438,7 @@
           <w:ilvl w:val="0"/>
           <w:numId w:val="7"/>
         </w:numPr>
+        <w:ind w:right="-427"/>
       </w:pPr>
       <w:r>
         <w:t>Botón de “Añadir entrenamiento rápido”</w:t>
@@ -1396,6 +1451,7 @@
           <w:ilvl w:val="0"/>
           <w:numId w:val="7"/>
         </w:numPr>
+        <w:ind w:right="-427"/>
       </w:pPr>
       <w:r>
         <w:t>Panel de control principal (</w:t>
@@ -1409,10 +1465,15 @@
         <w:t>)</w:t>
       </w:r>
     </w:p>
-    <w:p/>
+    <w:p>
+      <w:pPr>
+        <w:ind w:right="-427"/>
+      </w:pPr>
+    </w:p>
     <w:p>
       <w:pPr>
         <w:pStyle w:val="Ttulo2"/>
+        <w:ind w:left="-709" w:right="-427"/>
       </w:pPr>
       <w:bookmarkStart w:id="1" w:name="_Toc240331161"/>
       <w:r>
@@ -1439,20 +1500,29 @@
     </w:p>
     <w:p>
       <w:pPr>
-        <w:ind w:left="-426" w:right="-143" w:firstLine="0"/>
-      </w:pPr>
-      <w:r>
-        <w:t>Los elementos se agrupan por afinidad lógica, separando lo que es de uso inmediato (Nivel 1) de los detalles (Nivel 2 o +)</w:t>
-      </w:r>
-    </w:p>
-    <w:p>
-      <w:pPr>
-        <w:ind w:left="-426" w:right="-143" w:firstLine="0"/>
-      </w:pPr>
-    </w:p>
-    <w:p>
-      <w:pPr>
-        <w:ind w:left="-426" w:right="-143" w:firstLine="0"/>
+        <w:ind w:right="-427" w:firstLine="0"/>
+      </w:pPr>
+      <w:r>
+        <w:t>Los elementos se agrupan por afinidad lógica, separando lo que es de uso inmediato (Nivel 1) de los detalles (Nivel 2</w:t>
+      </w:r>
+      <w:r>
+        <w:t xml:space="preserve"> o secundarios</w:t>
+      </w:r>
+      <w:r>
+        <w:t>)</w:t>
+      </w:r>
+      <w:r>
+        <w:t>.</w:t>
+      </w:r>
+    </w:p>
+    <w:p>
+      <w:pPr>
+        <w:ind w:left="-426" w:right="-427" w:firstLine="0"/>
+      </w:pPr>
+    </w:p>
+    <w:p>
+      <w:pPr>
+        <w:ind w:left="-426" w:right="-427" w:firstLine="0"/>
         <w:rPr>
           <w:b/>
           <w:bCs/>
@@ -1468,20 +1538,28 @@
     </w:p>
     <w:p>
       <w:pPr>
-        <w:ind w:left="-426" w:right="-143" w:firstLine="0"/>
-      </w:pPr>
-      <w:r>
+        <w:ind w:left="-426" w:right="-427" w:firstLine="0"/>
+        <w:rPr>
+          <w:sz w:val="20"/>
+          <w:szCs w:val="20"/>
+        </w:rPr>
+      </w:pPr>
+      <w:r>
+        <w:rPr>
+          <w:sz w:val="20"/>
+          <w:szCs w:val="20"/>
+        </w:rPr>
         <w:t>Botón de inicio de sesión/registro</w:t>
       </w:r>
     </w:p>
     <w:p>
       <w:pPr>
-        <w:ind w:left="-426" w:right="-143" w:firstLine="0"/>
-      </w:pPr>
-    </w:p>
-    <w:p>
-      <w:pPr>
-        <w:ind w:left="-426" w:right="-143" w:firstLine="0"/>
+        <w:ind w:left="-426" w:right="-427" w:firstLine="0"/>
+      </w:pPr>
+    </w:p>
+    <w:p>
+      <w:pPr>
+        <w:ind w:left="-426" w:right="-427" w:firstLine="0"/>
         <w:rPr>
           <w:b/>
           <w:bCs/>
@@ -1504,44 +1582,76 @@
     </w:p>
     <w:p>
       <w:pPr>
-        <w:ind w:left="-426" w:right="-143" w:firstLine="0"/>
-      </w:pPr>
-      <w:r>
+        <w:ind w:left="-426" w:right="-427" w:firstLine="0"/>
+        <w:rPr>
+          <w:sz w:val="20"/>
+          <w:szCs w:val="20"/>
+        </w:rPr>
+      </w:pPr>
+      <w:r>
+        <w:rPr>
+          <w:sz w:val="20"/>
+          <w:szCs w:val="20"/>
+        </w:rPr>
         <w:t>Panel de control principal (</w:t>
       </w:r>
       <w:proofErr w:type="spellStart"/>
       <w:r>
+        <w:rPr>
+          <w:sz w:val="20"/>
+          <w:szCs w:val="20"/>
+        </w:rPr>
         <w:t>Dashboard</w:t>
       </w:r>
       <w:proofErr w:type="spellEnd"/>
       <w:r>
+        <w:rPr>
+          <w:sz w:val="20"/>
+          <w:szCs w:val="20"/>
+        </w:rPr>
         <w:t>)</w:t>
       </w:r>
     </w:p>
     <w:p>
       <w:pPr>
-        <w:ind w:left="-426" w:right="-143" w:firstLine="0"/>
-      </w:pPr>
-      <w:r>
+        <w:ind w:left="-426" w:right="-427" w:firstLine="0"/>
+        <w:rPr>
+          <w:sz w:val="20"/>
+          <w:szCs w:val="20"/>
+        </w:rPr>
+      </w:pPr>
+      <w:r>
+        <w:rPr>
+          <w:sz w:val="20"/>
+          <w:szCs w:val="20"/>
+        </w:rPr>
         <w:t>Listado de ejercicios de la rutina de hoy</w:t>
       </w:r>
     </w:p>
     <w:p>
       <w:pPr>
-        <w:ind w:left="-426" w:right="-143" w:firstLine="0"/>
-      </w:pPr>
-      <w:r>
+        <w:ind w:left="-426" w:right="-427" w:firstLine="0"/>
+        <w:rPr>
+          <w:sz w:val="20"/>
+          <w:szCs w:val="20"/>
+        </w:rPr>
+      </w:pPr>
+      <w:r>
+        <w:rPr>
+          <w:sz w:val="20"/>
+          <w:szCs w:val="20"/>
+        </w:rPr>
         <w:t>Botón de “Añadir entrenamiento rápido”</w:t>
       </w:r>
     </w:p>
     <w:p>
       <w:pPr>
-        <w:ind w:left="-426" w:right="-143" w:firstLine="0"/>
-      </w:pPr>
-    </w:p>
-    <w:p>
-      <w:pPr>
-        <w:ind w:left="-426" w:right="-143" w:firstLine="0"/>
+        <w:ind w:left="-426" w:right="-427" w:firstLine="0"/>
+      </w:pPr>
+    </w:p>
+    <w:p>
+      <w:pPr>
+        <w:ind w:left="-426" w:right="-427" w:firstLine="0"/>
         <w:rPr>
           <w:b/>
           <w:bCs/>
@@ -1564,102 +1674,420 @@
     </w:p>
     <w:p>
       <w:pPr>
-        <w:ind w:left="-426" w:right="-143" w:firstLine="0"/>
-      </w:pPr>
-      <w:r>
+        <w:ind w:left="-426" w:right="-427" w:firstLine="0"/>
+        <w:rPr>
+          <w:sz w:val="20"/>
+          <w:szCs w:val="20"/>
+        </w:rPr>
+      </w:pPr>
+      <w:r>
+        <w:rPr>
+          <w:sz w:val="20"/>
+          <w:szCs w:val="20"/>
+        </w:rPr>
         <w:t xml:space="preserve">Desde </w:t>
       </w:r>
       <w:proofErr w:type="spellStart"/>
       <w:r>
+        <w:rPr>
+          <w:sz w:val="20"/>
+          <w:szCs w:val="20"/>
+        </w:rPr>
         <w:t>Dashboard</w:t>
       </w:r>
       <w:proofErr w:type="spellEnd"/>
       <w:r>
+        <w:rPr>
+          <w:sz w:val="20"/>
+          <w:szCs w:val="20"/>
+        </w:rPr>
+        <w:t xml:space="preserve">      </w:t>
+      </w:r>
+      <w:r>
+        <w:rPr>
+          <w:rFonts w:ascii="Montserrat" w:hAnsi="Montserrat"/>
+          <w:b/>
+          <w:bCs/>
+          <w:color w:val="5BBCB6"/>
+          <w:sz w:val="20"/>
+          <w:szCs w:val="20"/>
+        </w:rPr>
+        <w:t>-</w:t>
+      </w:r>
+      <w:r>
+        <w:rPr>
+          <w:rFonts w:ascii="Montserrat" w:hAnsi="Montserrat"/>
+          <w:b/>
+          <w:bCs/>
+          <w:color w:val="5BBCB6"/>
+          <w:sz w:val="20"/>
+          <w:szCs w:val="20"/>
+        </w:rPr>
+        <w:t>&gt;</w:t>
+      </w:r>
+      <w:r>
+        <w:rPr>
+          <w:b/>
+          <w:bCs/>
+          <w:color w:val="5BBCB6"/>
+          <w:sz w:val="20"/>
+          <w:szCs w:val="20"/>
+        </w:rPr>
+        <w:t xml:space="preserve">      </w:t>
+      </w:r>
+      <w:r>
+        <w:rPr>
+          <w:sz w:val="20"/>
+          <w:szCs w:val="20"/>
+        </w:rPr>
+        <w:t>Buscador global de recetas</w:t>
+      </w:r>
+      <w:r>
+        <w:rPr>
+          <w:sz w:val="20"/>
+          <w:szCs w:val="20"/>
+        </w:rPr>
+        <w:t xml:space="preserve">      </w:t>
+      </w:r>
+      <w:r>
+        <w:rPr>
+          <w:rFonts w:ascii="Montserrat" w:hAnsi="Montserrat"/>
+          <w:b/>
+          <w:bCs/>
+          <w:color w:val="5BBCB6"/>
+          <w:sz w:val="20"/>
+          <w:szCs w:val="20"/>
+        </w:rPr>
+        <w:t>-&gt;</w:t>
+      </w:r>
+      <w:r>
+        <w:rPr>
+          <w:b/>
+          <w:bCs/>
+          <w:color w:val="5BBCB6"/>
+          <w:sz w:val="20"/>
+          <w:szCs w:val="20"/>
+        </w:rPr>
+        <w:t xml:space="preserve">      </w:t>
+      </w:r>
+      <w:r>
+        <w:rPr>
+          <w:sz w:val="20"/>
+          <w:szCs w:val="20"/>
+        </w:rPr>
+        <w:t xml:space="preserve">Formulario para añadir comida </w:t>
+      </w:r>
+      <w:proofErr w:type="spellStart"/>
+      <w:r>
+        <w:rPr>
+          <w:sz w:val="20"/>
+          <w:szCs w:val="20"/>
+        </w:rPr>
+        <w:t>personaliz</w:t>
+      </w:r>
+      <w:proofErr w:type="spellEnd"/>
+      <w:r>
+        <w:rPr>
+          <w:sz w:val="20"/>
+          <w:szCs w:val="20"/>
+        </w:rPr>
+        <w:t>.</w:t>
+      </w:r>
+    </w:p>
+    <w:p>
+      <w:pPr>
+        <w:ind w:left="708" w:right="-427" w:firstLine="708"/>
+        <w:rPr>
+          <w:sz w:val="20"/>
+          <w:szCs w:val="20"/>
+        </w:rPr>
+      </w:pPr>
+      <w:r>
+        <w:rPr>
+          <w:rFonts w:ascii="Montserrat" w:hAnsi="Montserrat"/>
+          <w:b/>
+          <w:bCs/>
+          <w:color w:val="5BBCB6"/>
+          <w:sz w:val="20"/>
+          <w:szCs w:val="20"/>
+        </w:rPr>
+        <w:t>-&gt;</w:t>
+      </w:r>
+      <w:r>
+        <w:rPr>
+          <w:b/>
+          <w:bCs/>
+          <w:color w:val="5BBCB6"/>
+          <w:sz w:val="20"/>
+          <w:szCs w:val="20"/>
+        </w:rPr>
+        <w:t xml:space="preserve">      </w:t>
+      </w:r>
+      <w:r>
+        <w:rPr>
+          <w:sz w:val="20"/>
+          <w:szCs w:val="20"/>
+        </w:rPr>
+        <w:t>Sección de logros y medallas</w:t>
+      </w:r>
+      <w:r>
+        <w:rPr>
+          <w:sz w:val="20"/>
+          <w:szCs w:val="20"/>
+        </w:rPr>
+        <w:t xml:space="preserve">     </w:t>
+      </w:r>
+      <w:r>
+        <w:rPr>
+          <w:rFonts w:ascii="Montserrat" w:hAnsi="Montserrat"/>
+          <w:sz w:val="20"/>
+          <w:szCs w:val="20"/>
+        </w:rPr>
+        <w:t xml:space="preserve"> </w:t>
+      </w:r>
+      <w:r>
+        <w:rPr>
+          <w:rFonts w:ascii="Montserrat" w:hAnsi="Montserrat"/>
+          <w:b/>
+          <w:bCs/>
+          <w:color w:val="5BBCB6"/>
+          <w:sz w:val="20"/>
+          <w:szCs w:val="20"/>
+        </w:rPr>
+        <w:t>-&gt;</w:t>
+      </w:r>
+      <w:r>
+        <w:rPr>
+          <w:b/>
+          <w:bCs/>
+          <w:color w:val="5BBCB6"/>
+          <w:sz w:val="20"/>
+          <w:szCs w:val="20"/>
+        </w:rPr>
+        <w:t xml:space="preserve">      </w:t>
+      </w:r>
+      <w:r>
+        <w:rPr>
+          <w:sz w:val="20"/>
+          <w:szCs w:val="20"/>
+        </w:rPr>
+        <w:t>Gráfica de evolución semanal</w:t>
+      </w:r>
+      <w:r>
+        <w:rPr>
+          <w:sz w:val="20"/>
+          <w:szCs w:val="20"/>
+        </w:rPr>
         <w:tab/>
-        <w:t xml:space="preserve">-&gt; Buscador global de recetas -&gt; Formulario para añadir comida </w:t>
+      </w:r>
+    </w:p>
+    <w:p>
+      <w:pPr>
+        <w:ind w:left="282" w:right="-427" w:firstLine="1134"/>
+        <w:rPr>
+          <w:sz w:val="20"/>
+          <w:szCs w:val="20"/>
+        </w:rPr>
+      </w:pPr>
+      <w:r>
+        <w:rPr>
+          <w:rFonts w:ascii="Montserrat" w:hAnsi="Montserrat"/>
+          <w:b/>
+          <w:bCs/>
+          <w:color w:val="5BBCB6"/>
+          <w:sz w:val="20"/>
+          <w:szCs w:val="20"/>
+        </w:rPr>
+        <w:lastRenderedPageBreak/>
+        <w:t>-&gt;</w:t>
+      </w:r>
+      <w:r>
+        <w:rPr>
+          <w:b/>
+          <w:bCs/>
+          <w:color w:val="5BBCB6"/>
+          <w:sz w:val="20"/>
+          <w:szCs w:val="20"/>
+        </w:rPr>
+        <w:t xml:space="preserve">      </w:t>
+      </w:r>
+      <w:r>
+        <w:rPr>
+          <w:sz w:val="20"/>
+          <w:szCs w:val="20"/>
+        </w:rPr>
+        <w:t xml:space="preserve">Ajustes de la </w:t>
+      </w:r>
+      <w:proofErr w:type="gramStart"/>
+      <w:r>
+        <w:rPr>
+          <w:sz w:val="20"/>
+          <w:szCs w:val="20"/>
+        </w:rPr>
+        <w:t>app</w:t>
+      </w:r>
+      <w:proofErr w:type="gramEnd"/>
+      <w:r>
+        <w:rPr>
+          <w:sz w:val="20"/>
+          <w:szCs w:val="20"/>
+        </w:rPr>
+        <w:t xml:space="preserve">     </w:t>
+      </w:r>
+      <w:r>
+        <w:rPr>
+          <w:rFonts w:ascii="Montserrat" w:hAnsi="Montserrat"/>
+          <w:sz w:val="20"/>
+          <w:szCs w:val="20"/>
+        </w:rPr>
+        <w:t xml:space="preserve"> </w:t>
+      </w:r>
+      <w:r>
+        <w:rPr>
+          <w:rFonts w:ascii="Montserrat" w:hAnsi="Montserrat"/>
+          <w:b/>
+          <w:bCs/>
+          <w:color w:val="5BBCB6"/>
+          <w:sz w:val="20"/>
+          <w:szCs w:val="20"/>
+        </w:rPr>
+        <w:t>-&gt;</w:t>
+      </w:r>
+      <w:r>
+        <w:rPr>
+          <w:b/>
+          <w:bCs/>
+          <w:color w:val="5BBCB6"/>
+          <w:sz w:val="20"/>
+          <w:szCs w:val="20"/>
+        </w:rPr>
+        <w:t xml:space="preserve">      </w:t>
+      </w:r>
+      <w:r>
+        <w:rPr>
+          <w:sz w:val="20"/>
+          <w:szCs w:val="20"/>
+        </w:rPr>
+        <w:t>Centro de ayuda (</w:t>
       </w:r>
       <w:proofErr w:type="spellStart"/>
       <w:r>
-        <w:t>personaliz</w:t>
+        <w:rPr>
+          <w:sz w:val="20"/>
+          <w:szCs w:val="20"/>
+        </w:rPr>
+        <w:t>FAQs</w:t>
       </w:r>
       <w:proofErr w:type="spellEnd"/>
       <w:r>
-        <w:t>.</w:t>
-      </w:r>
-    </w:p>
-    <w:p>
-      <w:pPr>
-        <w:ind w:left="-426" w:right="-143" w:firstLine="992"/>
-      </w:pPr>
-      <w:r>
-        <w:lastRenderedPageBreak/>
+        <w:rPr>
+          <w:sz w:val="20"/>
+          <w:szCs w:val="20"/>
+        </w:rPr>
+        <w:t>)</w:t>
+      </w:r>
+      <w:r>
+        <w:rPr>
+          <w:sz w:val="20"/>
+          <w:szCs w:val="20"/>
+        </w:rPr>
+        <w:t>,</w:t>
+      </w:r>
+      <w:r>
+        <w:rPr>
+          <w:sz w:val="20"/>
+          <w:szCs w:val="20"/>
+        </w:rPr>
+        <w:t xml:space="preserve"> Edición de datos personales</w:t>
+      </w:r>
+    </w:p>
+    <w:p>
+      <w:pPr>
+        <w:ind w:left="-426" w:right="-427" w:firstLine="0"/>
+        <w:rPr>
+          <w:sz w:val="20"/>
+          <w:szCs w:val="20"/>
+        </w:rPr>
+      </w:pPr>
+      <w:r>
+        <w:rPr>
+          <w:sz w:val="20"/>
+          <w:szCs w:val="20"/>
+        </w:rPr>
+        <w:t xml:space="preserve">Desde Botón de “Añadir entrenamiento </w:t>
+      </w:r>
+      <w:proofErr w:type="gramStart"/>
+      <w:r>
+        <w:rPr>
+          <w:sz w:val="20"/>
+          <w:szCs w:val="20"/>
+        </w:rPr>
+        <w:t>rápido”</w:t>
+      </w:r>
+      <w:r>
+        <w:rPr>
+          <w:sz w:val="20"/>
+          <w:szCs w:val="20"/>
+        </w:rPr>
+        <w:t xml:space="preserve">   </w:t>
+      </w:r>
+      <w:proofErr w:type="gramEnd"/>
+      <w:r>
+        <w:rPr>
+          <w:sz w:val="20"/>
+          <w:szCs w:val="20"/>
+        </w:rPr>
+        <w:t xml:space="preserve">   </w:t>
+      </w:r>
+      <w:r>
+        <w:rPr>
+          <w:rFonts w:ascii="Montserrat" w:hAnsi="Montserrat"/>
+          <w:b/>
+          <w:bCs/>
+          <w:color w:val="5BBCB6"/>
+          <w:sz w:val="20"/>
+          <w:szCs w:val="20"/>
+        </w:rPr>
+        <w:t>-&gt;</w:t>
+      </w:r>
+      <w:r>
+        <w:rPr>
+          <w:rFonts w:ascii="Montserrat" w:hAnsi="Montserrat"/>
+          <w:b/>
+          <w:bCs/>
+          <w:color w:val="5BBCB6"/>
+          <w:sz w:val="20"/>
+          <w:szCs w:val="20"/>
+        </w:rPr>
         <w:t xml:space="preserve"> </w:t>
       </w:r>
       <w:r>
-        <w:tab/>
-      </w:r>
-      <w:r>
-        <w:tab/>
-      </w:r>
-      <w:r>
-        <w:t>-&gt; Sección de logros y medallas -&gt; Gráfica de evolución semanal</w:t>
-      </w:r>
-      <w:r>
-        <w:tab/>
-      </w:r>
-    </w:p>
-    <w:p>
-      <w:pPr>
-        <w:ind w:left="282" w:right="-143" w:firstLine="1134"/>
-      </w:pPr>
-      <w:r>
-        <w:t xml:space="preserve">-&gt; Ajustes de la </w:t>
-      </w:r>
-      <w:proofErr w:type="gramStart"/>
-      <w:r>
-        <w:t>app</w:t>
-      </w:r>
-      <w:proofErr w:type="gramEnd"/>
-      <w:r>
-        <w:t xml:space="preserve"> -&gt; Centro de ayuda (</w:t>
-      </w:r>
-      <w:proofErr w:type="spellStart"/>
-      <w:r>
-        <w:t>FAQs</w:t>
-      </w:r>
-      <w:proofErr w:type="spellEnd"/>
-      <w:r>
-        <w:t>)</w:t>
-      </w:r>
-      <w:r>
-        <w:t>,</w:t>
-      </w:r>
-      <w:r>
-        <w:t xml:space="preserve"> Edición de datos personales</w:t>
-      </w:r>
-    </w:p>
-    <w:p>
-      <w:pPr>
-        <w:ind w:left="-426" w:right="-143" w:firstLine="0"/>
-      </w:pPr>
-      <w:r>
-        <w:t>Desde Botón de “Añadir entrenamiento rápido”</w:t>
-      </w:r>
-      <w:r>
-        <w:t xml:space="preserve"> </w:t>
-      </w:r>
-      <w:r>
-        <w:t>-&gt; Cronómetro para entrenar</w:t>
-      </w:r>
-    </w:p>
-    <w:p>
-      <w:pPr>
-        <w:ind w:left="-426" w:right="-143" w:firstLine="0"/>
+        <w:rPr>
+          <w:b/>
+          <w:bCs/>
+          <w:color w:val="5BBCB6"/>
+          <w:sz w:val="20"/>
+          <w:szCs w:val="20"/>
+        </w:rPr>
+        <w:t xml:space="preserve">     </w:t>
+      </w:r>
+      <w:r>
+        <w:rPr>
+          <w:sz w:val="20"/>
+          <w:szCs w:val="20"/>
+        </w:rPr>
+        <w:t>Cronómetro para entrenar</w:t>
+      </w:r>
+    </w:p>
+    <w:p>
+      <w:pPr>
+        <w:ind w:left="-426" w:right="-427" w:firstLine="0"/>
       </w:pPr>
     </w:p>
     <w:p>
       <w:pPr>
         <w:pStyle w:val="Ttulo2"/>
+        <w:ind w:left="-709" w:right="-427"/>
       </w:pPr>
       <w:bookmarkStart w:id="2" w:name="_Toc240331162"/>
       <w:r>
@@ -1681,15 +2109,25 @@
     </w:p>
     <w:p>
       <w:pPr>
-        <w:ind w:left="-426" w:right="-143" w:firstLine="0"/>
-      </w:pPr>
-      <w:r>
-        <w:t>Diagrama resultante de la agrupación y priorización:</w:t>
-      </w:r>
-    </w:p>
-    <w:p>
-      <w:pPr>
-        <w:ind w:left="-426" w:right="-143" w:firstLine="0"/>
+        <w:ind w:left="-426" w:right="-427" w:firstLine="426"/>
+      </w:pPr>
+      <w:r>
+        <w:rPr>
+          <w:b/>
+          <w:bCs/>
+        </w:rPr>
+        <w:t>Diagrama</w:t>
+      </w:r>
+      <w:r>
+        <w:t xml:space="preserve"> resultante de la agrupación y priorización</w:t>
+      </w:r>
+      <w:r>
+        <w:t>.</w:t>
+      </w:r>
+    </w:p>
+    <w:p>
+      <w:pPr>
+        <w:ind w:left="-426" w:right="-427" w:firstLine="0"/>
       </w:pPr>
       <w:r>
         <w:t>------------------------------------------------------------------------Diagrama</w:t>
@@ -1697,12 +2135,13 @@
     </w:p>
     <w:p>
       <w:pPr>
-        <w:ind w:left="-426" w:right="-143" w:firstLine="0"/>
+        <w:ind w:left="-426" w:right="-427" w:firstLine="0"/>
       </w:pPr>
     </w:p>
     <w:p>
       <w:pPr>
         <w:pStyle w:val="Ttulo2"/>
+        <w:ind w:left="-709" w:right="-427"/>
       </w:pPr>
       <w:bookmarkStart w:id="3" w:name="_Toc240331163"/>
       <w:r>
@@ -1716,12 +2155,20 @@
     </w:p>
     <w:p>
       <w:pPr>
-        <w:ind w:left="-426" w:right="-143" w:firstLine="0"/>
-      </w:pPr>
-    </w:p>
-    <w:p>
-      <w:pPr>
-        <w:ind w:left="-426" w:right="-143" w:firstLine="0"/>
+        <w:ind w:right="-427" w:firstLine="0"/>
+      </w:pPr>
+      <w:r>
+        <w:t>Elección del menú principal en base al dispositivo utilizado.</w:t>
+      </w:r>
+    </w:p>
+    <w:p>
+      <w:pPr>
+        <w:ind w:left="-426" w:right="-427" w:firstLine="0"/>
+      </w:pPr>
+    </w:p>
+    <w:p>
+      <w:pPr>
+        <w:ind w:left="-426" w:right="-427" w:firstLine="0"/>
       </w:pPr>
       <w:r>
         <w:t xml:space="preserve">Si se desarrolla como </w:t>
@@ -1739,9 +2186,13 @@
     </w:p>
     <w:p>
       <w:pPr>
-        <w:ind w:left="-426" w:right="-143" w:firstLine="0"/>
-      </w:pPr>
-      <w:r>
+        <w:ind w:left="-426" w:right="-427" w:firstLine="0"/>
+      </w:pPr>
+      <w:r>
+        <w:rPr>
+          <w:b/>
+          <w:bCs/>
+        </w:rPr>
         <w:t>Menú elegido:</w:t>
       </w:r>
       <w:r>
@@ -1751,159 +2202,308 @@
         <w:tab/>
       </w:r>
       <w:r>
+        <w:rPr>
+          <w:sz w:val="20"/>
+          <w:szCs w:val="20"/>
+        </w:rPr>
         <w:t xml:space="preserve">Barra de Navegación Inferior (Bottom </w:t>
       </w:r>
       <w:proofErr w:type="spellStart"/>
       <w:r>
+        <w:rPr>
+          <w:sz w:val="20"/>
+          <w:szCs w:val="20"/>
+        </w:rPr>
         <w:t>Navigation</w:t>
       </w:r>
       <w:proofErr w:type="spellEnd"/>
       <w:r>
+        <w:rPr>
+          <w:sz w:val="20"/>
+          <w:szCs w:val="20"/>
+        </w:rPr>
         <w:t>)</w:t>
       </w:r>
       <w:r>
+        <w:rPr>
+          <w:sz w:val="20"/>
+          <w:szCs w:val="20"/>
+        </w:rPr>
         <w:t>.</w:t>
       </w:r>
     </w:p>
     <w:p>
       <w:pPr>
-        <w:ind w:left="2124" w:right="-143" w:hanging="2550"/>
-      </w:pPr>
-      <w:r>
+        <w:ind w:left="2124" w:right="-427" w:hanging="2550"/>
+        <w:rPr>
+          <w:sz w:val="20"/>
+          <w:szCs w:val="20"/>
+        </w:rPr>
+      </w:pPr>
+      <w:r>
+        <w:rPr>
+          <w:b/>
+          <w:bCs/>
+        </w:rPr>
         <w:t>¿Por qué?:</w:t>
       </w:r>
       <w:r>
         <w:tab/>
+      </w:r>
+      <w:r>
+        <w:rPr>
+          <w:sz w:val="20"/>
+          <w:szCs w:val="20"/>
+        </w:rPr>
         <w:t xml:space="preserve">Los usuarios de una </w:t>
       </w:r>
       <w:proofErr w:type="gramStart"/>
       <w:r>
+        <w:rPr>
+          <w:sz w:val="20"/>
+          <w:szCs w:val="20"/>
+        </w:rPr>
         <w:t>app</w:t>
       </w:r>
       <w:proofErr w:type="gramEnd"/>
       <w:r>
+        <w:rPr>
+          <w:sz w:val="20"/>
+          <w:szCs w:val="20"/>
+        </w:rPr>
         <w:t xml:space="preserve"> </w:t>
       </w:r>
       <w:r>
+        <w:rPr>
+          <w:sz w:val="20"/>
+          <w:szCs w:val="20"/>
+        </w:rPr>
         <w:t>móvil de por sí</w:t>
       </w:r>
       <w:r>
+        <w:rPr>
+          <w:sz w:val="20"/>
+          <w:szCs w:val="20"/>
+        </w:rPr>
         <w:t xml:space="preserve"> necesitan acceso rápido a</w:t>
       </w:r>
       <w:r>
+        <w:rPr>
+          <w:sz w:val="20"/>
+          <w:szCs w:val="20"/>
+        </w:rPr>
         <w:t xml:space="preserve">l menú, y siendo la </w:t>
       </w:r>
       <w:proofErr w:type="gramStart"/>
       <w:r>
+        <w:rPr>
+          <w:sz w:val="20"/>
+          <w:szCs w:val="20"/>
+        </w:rPr>
         <w:t>app</w:t>
       </w:r>
       <w:proofErr w:type="gramEnd"/>
       <w:r>
+        <w:rPr>
+          <w:sz w:val="20"/>
+          <w:szCs w:val="20"/>
+        </w:rPr>
         <w:t xml:space="preserve"> de</w:t>
       </w:r>
       <w:r>
+        <w:rPr>
+          <w:sz w:val="20"/>
+          <w:szCs w:val="20"/>
+        </w:rPr>
         <w:t xml:space="preserve"> ejercicio</w:t>
       </w:r>
       <w:r>
-        <w:t xml:space="preserve">s, hay que tener en cuenta que puede que </w:t>
-      </w:r>
-      <w:proofErr w:type="spellStart"/>
-      <w:r>
-        <w:t>el</w:t>
-      </w:r>
-      <w:proofErr w:type="spellEnd"/>
-      <w:r>
-        <w:t xml:space="preserve"> usuario tenga una mancuerna en la otra mano, esté en medio de una receta o con la mochila y/o accesorios en la mano libre</w:t>
-      </w:r>
-      <w:r>
+        <w:rPr>
+          <w:sz w:val="20"/>
+          <w:szCs w:val="20"/>
+        </w:rPr>
+        <w:t>s, hay que tener en cuenta que puede que el usuario tenga una mancuerna en la otra mano, esté en medio de una receta o con la mochila y/o accesorios en la mano libre</w:t>
+      </w:r>
+      <w:r>
+        <w:rPr>
+          <w:sz w:val="20"/>
+          <w:szCs w:val="20"/>
+        </w:rPr>
         <w:t xml:space="preserve">. </w:t>
       </w:r>
       <w:r>
+        <w:rPr>
+          <w:sz w:val="20"/>
+          <w:szCs w:val="20"/>
+        </w:rPr>
         <w:t>Situando la</w:t>
       </w:r>
       <w:r>
+        <w:rPr>
+          <w:sz w:val="20"/>
+          <w:szCs w:val="20"/>
+        </w:rPr>
         <w:t xml:space="preserve"> barra</w:t>
       </w:r>
       <w:r>
+        <w:rPr>
+          <w:sz w:val="20"/>
+          <w:szCs w:val="20"/>
+        </w:rPr>
         <w:t xml:space="preserve"> de menú en la zona</w:t>
       </w:r>
       <w:r>
+        <w:rPr>
+          <w:sz w:val="20"/>
+          <w:szCs w:val="20"/>
+        </w:rPr>
         <w:t xml:space="preserve"> inferior</w:t>
       </w:r>
       <w:r>
+        <w:rPr>
+          <w:sz w:val="20"/>
+          <w:szCs w:val="20"/>
+        </w:rPr>
         <w:t>,</w:t>
       </w:r>
       <w:r>
+        <w:rPr>
+          <w:sz w:val="20"/>
+          <w:szCs w:val="20"/>
+        </w:rPr>
         <w:t xml:space="preserve"> </w:t>
       </w:r>
       <w:r>
+        <w:rPr>
+          <w:sz w:val="20"/>
+          <w:szCs w:val="20"/>
+        </w:rPr>
         <w:t>damos accesibilidad a</w:t>
       </w:r>
       <w:r>
+        <w:rPr>
+          <w:sz w:val="20"/>
+          <w:szCs w:val="20"/>
+        </w:rPr>
         <w:t xml:space="preserve"> las opciones clave del menú </w:t>
       </w:r>
       <w:r>
-        <w:t>en la zona de confort del pulgar</w:t>
-      </w:r>
-      <w:r>
-        <w:t xml:space="preserve">, </w:t>
-      </w:r>
-      <w:r>
+        <w:rPr>
+          <w:sz w:val="20"/>
+          <w:szCs w:val="20"/>
+        </w:rPr>
+        <w:t xml:space="preserve">en la zona de confort del pulgar, </w:t>
+      </w:r>
+      <w:r>
+        <w:rPr>
+          <w:sz w:val="20"/>
+          <w:szCs w:val="20"/>
+        </w:rPr>
         <w:t xml:space="preserve">para </w:t>
       </w:r>
       <w:r>
+        <w:rPr>
+          <w:sz w:val="20"/>
+          <w:szCs w:val="20"/>
+        </w:rPr>
         <w:t xml:space="preserve">así, </w:t>
       </w:r>
       <w:r>
+        <w:rPr>
+          <w:sz w:val="20"/>
+          <w:szCs w:val="20"/>
+        </w:rPr>
         <w:t xml:space="preserve">profundizar en la </w:t>
       </w:r>
       <w:proofErr w:type="gramStart"/>
       <w:r>
+        <w:rPr>
+          <w:sz w:val="20"/>
+          <w:szCs w:val="20"/>
+        </w:rPr>
         <w:t>app</w:t>
       </w:r>
       <w:proofErr w:type="gramEnd"/>
       <w:r>
+        <w:rPr>
+          <w:sz w:val="20"/>
+          <w:szCs w:val="20"/>
+        </w:rPr>
         <w:t xml:space="preserve"> con un solo dedo</w:t>
       </w:r>
       <w:r>
+        <w:rPr>
+          <w:sz w:val="20"/>
+          <w:szCs w:val="20"/>
+        </w:rPr>
         <w:t>.</w:t>
       </w:r>
     </w:p>
     <w:p>
       <w:pPr>
-        <w:ind w:left="2124" w:right="-143" w:hanging="2550"/>
-      </w:pPr>
-      <w:r>
+        <w:ind w:left="2124" w:right="-427" w:hanging="2550"/>
+      </w:pPr>
+      <w:r>
+        <w:rPr>
+          <w:b/>
+          <w:bCs/>
+        </w:rPr>
         <w:t>Secciones en el menú:</w:t>
       </w:r>
       <w:r>
         <w:tab/>
+      </w:r>
+      <w:r>
+        <w:rPr>
+          <w:sz w:val="20"/>
+          <w:szCs w:val="20"/>
+        </w:rPr>
         <w:t>Buscador de recetas, Sección de Logros y Ajustes de la App</w:t>
       </w:r>
       <w:r>
+        <w:rPr>
+          <w:sz w:val="20"/>
+          <w:szCs w:val="20"/>
+        </w:rPr>
         <w:t xml:space="preserve"> serán las opciones que engloben</w:t>
       </w:r>
       <w:r>
+        <w:rPr>
+          <w:sz w:val="20"/>
+          <w:szCs w:val="20"/>
+        </w:rPr>
         <w:t xml:space="preserve"> en la barra</w:t>
       </w:r>
       <w:r>
+        <w:rPr>
+          <w:sz w:val="20"/>
+          <w:szCs w:val="20"/>
+        </w:rPr>
         <w:t xml:space="preserve"> el resto de </w:t>
       </w:r>
       <w:r>
+        <w:rPr>
+          <w:sz w:val="20"/>
+          <w:szCs w:val="20"/>
+        </w:rPr>
         <w:t>las secciones</w:t>
       </w:r>
       <w:r>
+        <w:rPr>
+          <w:sz w:val="20"/>
+          <w:szCs w:val="20"/>
+        </w:rPr>
         <w:t xml:space="preserve"> o detalles.</w:t>
       </w:r>
     </w:p>
     <w:p>
       <w:pPr>
-        <w:ind w:left="-426" w:right="-143" w:firstLine="0"/>
-      </w:pPr>
-    </w:p>
-    <w:p>
-      <w:pPr>
-        <w:ind w:left="-426" w:right="-143" w:firstLine="0"/>
+        <w:ind w:left="-426" w:right="-427" w:firstLine="0"/>
+      </w:pPr>
+    </w:p>
+    <w:p>
+      <w:pPr>
+        <w:ind w:left="-426" w:right="-427" w:firstLine="0"/>
       </w:pPr>
       <w:r>
         <w:t xml:space="preserve">Si se desarrolla como </w:t>
@@ -1921,95 +2521,179 @@
     </w:p>
     <w:p>
       <w:pPr>
-        <w:ind w:left="2124" w:right="-143" w:hanging="2550"/>
-      </w:pPr>
-      <w:r>
+        <w:ind w:left="2124" w:right="-427" w:hanging="2550"/>
+      </w:pPr>
+      <w:r>
+        <w:rPr>
+          <w:b/>
+          <w:bCs/>
+        </w:rPr>
         <w:t>Menú elegido:</w:t>
       </w:r>
       <w:r>
         <w:tab/>
+      </w:r>
+      <w:r>
+        <w:rPr>
+          <w:sz w:val="20"/>
+          <w:szCs w:val="20"/>
+        </w:rPr>
         <w:t>Barra de Navegación Superior (Top Bar)</w:t>
       </w:r>
       <w:r>
+        <w:rPr>
+          <w:sz w:val="20"/>
+          <w:szCs w:val="20"/>
+        </w:rPr>
         <w:t>.</w:t>
       </w:r>
     </w:p>
     <w:p>
       <w:pPr>
-        <w:ind w:left="2124" w:right="-143" w:hanging="2550"/>
-      </w:pPr>
-      <w:r>
+        <w:ind w:left="2124" w:right="-427" w:hanging="2550"/>
+      </w:pPr>
+      <w:r>
+        <w:rPr>
+          <w:b/>
+          <w:bCs/>
+        </w:rPr>
         <w:t>¿Por qué?:</w:t>
       </w:r>
       <w:r>
         <w:tab/>
+      </w:r>
+      <w:r>
+        <w:rPr>
+          <w:sz w:val="20"/>
+          <w:szCs w:val="20"/>
+        </w:rPr>
         <w:t>En el entorno web de escritorio se dispone de más espacio en el nivel de navegación</w:t>
       </w:r>
       <w:r>
+        <w:rPr>
+          <w:sz w:val="20"/>
+          <w:szCs w:val="20"/>
+        </w:rPr>
         <w:t xml:space="preserve"> </w:t>
       </w:r>
       <w:r>
+        <w:rPr>
+          <w:sz w:val="20"/>
+          <w:szCs w:val="20"/>
+        </w:rPr>
         <w:t>principal</w:t>
       </w:r>
       <w:r>
-        <w:t xml:space="preserve">, por lo que podemos incluir desplegables, </w:t>
-      </w:r>
-      <w:r>
-        <w:t>en cada una de las secciones</w:t>
-      </w:r>
-      <w:r>
-        <w:t xml:space="preserve">, que nos darán una visión del resto de secciones sin abandonar el nivel 1. Incluso podríamos incluir una vista de fotografía de perfil que acceda a ese subnivel, aunque en la </w:t>
+        <w:rPr>
+          <w:sz w:val="20"/>
+          <w:szCs w:val="20"/>
+        </w:rPr>
+        <w:t xml:space="preserve">, por lo que podemos incluir desplegables, en cada una de las secciones, que nos darán una visión del resto de secciones sin abandonar el nivel 1. Incluso podríamos incluir una vista de fotografía de perfil que acceda a ese subnivel, aunque en la </w:t>
       </w:r>
       <w:proofErr w:type="gramStart"/>
       <w:r>
+        <w:rPr>
+          <w:sz w:val="20"/>
+          <w:szCs w:val="20"/>
+        </w:rPr>
         <w:t>app</w:t>
       </w:r>
       <w:proofErr w:type="gramEnd"/>
       <w:r>
+        <w:rPr>
+          <w:sz w:val="20"/>
+          <w:szCs w:val="20"/>
+        </w:rPr>
         <w:t xml:space="preserve"> móvil no aparezca.</w:t>
       </w:r>
     </w:p>
     <w:p>
       <w:pPr>
-        <w:ind w:left="2124" w:right="-143" w:hanging="2550"/>
-      </w:pPr>
-      <w:r>
+        <w:ind w:left="2124" w:right="-427" w:hanging="2550"/>
+        <w:rPr>
+          <w:sz w:val="20"/>
+          <w:szCs w:val="20"/>
+        </w:rPr>
+      </w:pPr>
+      <w:r>
+        <w:rPr>
+          <w:b/>
+          <w:bCs/>
+        </w:rPr>
         <w:t>Secciones en el menú:</w:t>
       </w:r>
       <w:r>
         <w:tab/>
+      </w:r>
+      <w:r>
+        <w:rPr>
+          <w:sz w:val="20"/>
+          <w:szCs w:val="20"/>
+        </w:rPr>
         <w:t xml:space="preserve">Buscador de recetas, Sección de logros y Ajustes de la </w:t>
       </w:r>
       <w:proofErr w:type="gramStart"/>
       <w:r>
+        <w:rPr>
+          <w:sz w:val="20"/>
+          <w:szCs w:val="20"/>
+        </w:rPr>
         <w:t>app</w:t>
       </w:r>
       <w:proofErr w:type="gramEnd"/>
       <w:r>
+        <w:rPr>
+          <w:sz w:val="20"/>
+          <w:szCs w:val="20"/>
+        </w:rPr>
         <w:t xml:space="preserve"> formarán la barra superior con desplegables a sus subniveles,</w:t>
       </w:r>
       <w:r>
+        <w:rPr>
+          <w:sz w:val="20"/>
+          <w:szCs w:val="20"/>
+        </w:rPr>
         <w:t xml:space="preserve"> y</w:t>
       </w:r>
       <w:r>
+        <w:rPr>
+          <w:sz w:val="20"/>
+          <w:szCs w:val="20"/>
+        </w:rPr>
         <w:t xml:space="preserve"> la fotografía de perfil completa</w:t>
       </w:r>
       <w:r>
+        <w:rPr>
+          <w:sz w:val="20"/>
+          <w:szCs w:val="20"/>
+        </w:rPr>
         <w:t>ra</w:t>
       </w:r>
       <w:r>
+        <w:rPr>
+          <w:sz w:val="20"/>
+          <w:szCs w:val="20"/>
+        </w:rPr>
         <w:t xml:space="preserve"> la barra</w:t>
       </w:r>
       <w:r>
+        <w:rPr>
+          <w:sz w:val="20"/>
+          <w:szCs w:val="20"/>
+        </w:rPr>
         <w:t xml:space="preserve"> para dar acceso directo al perfil</w:t>
       </w:r>
       <w:r>
+        <w:rPr>
+          <w:sz w:val="20"/>
+          <w:szCs w:val="20"/>
+        </w:rPr>
         <w:t>.</w:t>
       </w:r>
     </w:p>
     <w:p>
       <w:pPr>
-        <w:ind w:left="2124" w:right="-143" w:hanging="2550"/>
+        <w:ind w:left="2124" w:right="-427" w:hanging="2550"/>
       </w:pPr>
     </w:p>
     <w:p>
@@ -2019,86 +2703,163 @@
           <w:ilvl w:val="0"/>
           <w:numId w:val="2"/>
         </w:numPr>
-        <w:ind w:left="-284" w:right="-143"/>
+        <w:ind w:left="-284" w:right="-427"/>
       </w:pPr>
       <w:bookmarkStart w:id="4" w:name="_Toc240331164"/>
       <w:proofErr w:type="spellStart"/>
       <w:r>
+        <w:lastRenderedPageBreak/>
         <w:t>EduRoute</w:t>
       </w:r>
       <w:proofErr w:type="spellEnd"/>
       <w:r>
-        <w:t xml:space="preserve"> (</w:t>
-      </w:r>
-      <w:r>
-        <w:t>App de Gestión de Estudios en la FP</w:t>
-      </w:r>
-      <w:r>
-        <w:t>)</w:t>
+        <w:t xml:space="preserve"> (App de Gestión de Estudios en la FP)</w:t>
       </w:r>
       <w:bookmarkEnd w:id="4"/>
     </w:p>
     <w:p>
+      <w:pPr>
+        <w:pStyle w:val="Prrafodelista"/>
+        <w:numPr>
+          <w:ilvl w:val="0"/>
+          <w:numId w:val="7"/>
+        </w:numPr>
+        <w:ind w:right="-427"/>
+      </w:pPr>
       <w:r>
         <w:t>Pantalla de login/registro</w:t>
       </w:r>
     </w:p>
     <w:p>
+      <w:pPr>
+        <w:pStyle w:val="Prrafodelista"/>
+        <w:numPr>
+          <w:ilvl w:val="0"/>
+          <w:numId w:val="7"/>
+        </w:numPr>
+        <w:ind w:right="-427"/>
+      </w:pPr>
       <w:r>
         <w:t>Panel de control principal</w:t>
       </w:r>
     </w:p>
     <w:p>
+      <w:pPr>
+        <w:pStyle w:val="Prrafodelista"/>
+        <w:numPr>
+          <w:ilvl w:val="0"/>
+          <w:numId w:val="7"/>
+        </w:numPr>
+        <w:ind w:right="-427"/>
+      </w:pPr>
       <w:r>
         <w:t>Buscador general de apuntes</w:t>
       </w:r>
     </w:p>
     <w:p>
+      <w:pPr>
+        <w:pStyle w:val="Prrafodelista"/>
+        <w:numPr>
+          <w:ilvl w:val="0"/>
+          <w:numId w:val="7"/>
+        </w:numPr>
+        <w:ind w:right="-427"/>
+      </w:pPr>
       <w:r>
         <w:t>Detalle de un recurso con opción de descarga</w:t>
       </w:r>
     </w:p>
     <w:p>
+      <w:pPr>
+        <w:pStyle w:val="Prrafodelista"/>
+        <w:numPr>
+          <w:ilvl w:val="0"/>
+          <w:numId w:val="7"/>
+        </w:numPr>
+        <w:ind w:right="-427"/>
+      </w:pPr>
       <w:r>
         <w:t>Formulario para subir un nuevo apunte</w:t>
       </w:r>
     </w:p>
     <w:p>
+      <w:pPr>
+        <w:pStyle w:val="Prrafodelista"/>
+        <w:numPr>
+          <w:ilvl w:val="0"/>
+          <w:numId w:val="7"/>
+        </w:numPr>
+        <w:ind w:right="-427"/>
+      </w:pPr>
       <w:r>
         <w:t>Listado de asignaturas matriculadas</w:t>
       </w:r>
     </w:p>
     <w:p>
+      <w:pPr>
+        <w:pStyle w:val="Prrafodelista"/>
+        <w:numPr>
+          <w:ilvl w:val="0"/>
+          <w:numId w:val="7"/>
+        </w:numPr>
+        <w:ind w:right="-427"/>
+      </w:pPr>
       <w:r>
         <w:t>Detalle de una asignatura (temario y archivos)</w:t>
       </w:r>
     </w:p>
     <w:p>
+      <w:pPr>
+        <w:pStyle w:val="Prrafodelista"/>
+        <w:numPr>
+          <w:ilvl w:val="0"/>
+          <w:numId w:val="7"/>
+        </w:numPr>
+        <w:ind w:right="-427"/>
+      </w:pPr>
       <w:r>
         <w:t>Sección de proyectos en grupo (chat y tablón de tareas)</w:t>
       </w:r>
     </w:p>
     <w:p>
+      <w:pPr>
+        <w:pStyle w:val="Prrafodelista"/>
+        <w:numPr>
+          <w:ilvl w:val="0"/>
+          <w:numId w:val="7"/>
+        </w:numPr>
+        <w:ind w:right="-427"/>
+      </w:pPr>
       <w:r>
         <w:t>Perfil de usuario (estadísticas)</w:t>
       </w:r>
     </w:p>
     <w:p>
+      <w:pPr>
+        <w:pStyle w:val="Prrafodelista"/>
+        <w:numPr>
+          <w:ilvl w:val="0"/>
+          <w:numId w:val="7"/>
+        </w:numPr>
+        <w:ind w:right="-427"/>
+      </w:pPr>
       <w:r>
         <w:t>Ajustes de la aplicación (notificaciones, cierre de sesión)</w:t>
       </w:r>
     </w:p>
-    <w:p/>
+    <w:p>
+      <w:pPr>
+        <w:ind w:right="-427"/>
+      </w:pPr>
+    </w:p>
     <w:p>
       <w:pPr>
         <w:pStyle w:val="Ttulo2"/>
+        <w:ind w:left="-709" w:right="-427"/>
       </w:pPr>
       <w:bookmarkStart w:id="5" w:name="_Toc240331165"/>
       <w:r>
-        <w:t>2</w:t>
-      </w:r>
-      <w:r>
-        <w:t>.1</w:t>
+        <w:t>2.1</w:t>
       </w:r>
       <w:r>
         <w:tab/>
@@ -2116,29 +2877,26 @@
     </w:p>
     <w:p>
       <w:pPr>
-        <w:ind w:left="-426" w:right="-143" w:firstLine="0"/>
+        <w:ind w:right="-427" w:firstLine="0"/>
       </w:pPr>
       <w:r>
         <w:t>Los elementos se agrupan por afinidad lógica, separando lo que es de uso inmediato (Nivel 1) de los detalles (Nivel 2</w:t>
       </w:r>
       <w:r>
-        <w:t xml:space="preserve"> o +</w:t>
-      </w:r>
-      <w:r>
-        <w:t>)</w:t>
-      </w:r>
-      <w:r>
-        <w:t>.</w:t>
-      </w:r>
-    </w:p>
-    <w:p>
-      <w:pPr>
-        <w:ind w:left="-426" w:right="-143" w:firstLine="0"/>
-      </w:pPr>
-    </w:p>
-    <w:p>
-      <w:pPr>
-        <w:ind w:left="-426" w:right="-143" w:firstLine="0"/>
+        <w:t xml:space="preserve"> o secundarios</w:t>
+      </w:r>
+      <w:r>
+        <w:t>).</w:t>
+      </w:r>
+    </w:p>
+    <w:p>
+      <w:pPr>
+        <w:ind w:left="-426" w:right="-427" w:firstLine="0"/>
+      </w:pPr>
+    </w:p>
+    <w:p>
+      <w:pPr>
+        <w:ind w:left="-426" w:right="-427" w:firstLine="0"/>
         <w:rPr>
           <w:b/>
           <w:bCs/>
@@ -2154,20 +2912,28 @@
     </w:p>
     <w:p>
       <w:pPr>
-        <w:ind w:left="-426" w:right="-143" w:firstLine="0"/>
-      </w:pPr>
-      <w:r>
+        <w:ind w:left="-426" w:right="-427" w:firstLine="0"/>
+        <w:rPr>
+          <w:sz w:val="20"/>
+          <w:szCs w:val="20"/>
+        </w:rPr>
+      </w:pPr>
+      <w:r>
+        <w:rPr>
+          <w:sz w:val="20"/>
+          <w:szCs w:val="20"/>
+        </w:rPr>
         <w:t>Pantalla de login/registro</w:t>
       </w:r>
     </w:p>
     <w:p>
       <w:pPr>
-        <w:ind w:left="-426" w:right="-143" w:firstLine="0"/>
-      </w:pPr>
-    </w:p>
-    <w:p>
-      <w:pPr>
-        <w:ind w:left="-426" w:right="-143" w:firstLine="0"/>
+        <w:ind w:left="-426" w:right="-427" w:firstLine="0"/>
+      </w:pPr>
+    </w:p>
+    <w:p>
+      <w:pPr>
+        <w:ind w:left="-426" w:right="-427" w:firstLine="0"/>
         <w:rPr>
           <w:b/>
           <w:bCs/>
@@ -2190,39 +2956,67 @@
     </w:p>
     <w:p>
       <w:pPr>
-        <w:ind w:left="-426" w:right="-143" w:firstLine="0"/>
-      </w:pPr>
-      <w:r>
+        <w:ind w:left="-426" w:right="-427" w:firstLine="0"/>
+        <w:rPr>
+          <w:sz w:val="20"/>
+          <w:szCs w:val="20"/>
+        </w:rPr>
+      </w:pPr>
+      <w:r>
+        <w:rPr>
+          <w:sz w:val="20"/>
+          <w:szCs w:val="20"/>
+        </w:rPr>
         <w:t>Panel de control principal</w:t>
       </w:r>
     </w:p>
     <w:p>
       <w:pPr>
-        <w:ind w:left="-426" w:right="-143" w:firstLine="0"/>
-      </w:pPr>
-      <w:r>
+        <w:ind w:left="-426" w:right="-427" w:firstLine="0"/>
+        <w:rPr>
+          <w:sz w:val="20"/>
+          <w:szCs w:val="20"/>
+        </w:rPr>
+      </w:pPr>
+      <w:r>
+        <w:rPr>
+          <w:sz w:val="20"/>
+          <w:szCs w:val="20"/>
+        </w:rPr>
         <w:t xml:space="preserve">Listado de </w:t>
       </w:r>
       <w:r>
+        <w:rPr>
+          <w:sz w:val="20"/>
+          <w:szCs w:val="20"/>
+        </w:rPr>
         <w:t>asignaturas matriculadas</w:t>
       </w:r>
     </w:p>
     <w:p>
       <w:pPr>
-        <w:ind w:left="-426" w:right="-143" w:firstLine="0"/>
-      </w:pPr>
-      <w:r>
+        <w:ind w:left="-426" w:right="-427" w:firstLine="0"/>
+        <w:rPr>
+          <w:sz w:val="20"/>
+          <w:szCs w:val="20"/>
+        </w:rPr>
+      </w:pPr>
+      <w:r>
+        <w:rPr>
+          <w:sz w:val="20"/>
+          <w:szCs w:val="20"/>
+        </w:rPr>
         <w:t>Sección de proyectos en grupo (chat y tablón de tareas)</w:t>
       </w:r>
     </w:p>
     <w:p>
       <w:pPr>
-        <w:ind w:left="-426" w:right="-143" w:firstLine="0"/>
-      </w:pPr>
-    </w:p>
-    <w:p>
-      <w:pPr>
-        <w:ind w:left="-426" w:right="-143" w:firstLine="0"/>
+        <w:ind w:left="-426" w:right="-427" w:firstLine="0"/>
+      </w:pPr>
+    </w:p>
+    <w:p>
+      <w:pPr>
+        <w:ind w:left="-426" w:right="-427" w:firstLine="0"/>
         <w:rPr>
           <w:b/>
           <w:bCs/>
@@ -2245,92 +3039,384 @@
     </w:p>
     <w:p>
       <w:pPr>
-        <w:ind w:left="-426" w:right="-143" w:firstLine="0"/>
-      </w:pPr>
-      <w:r>
+        <w:ind w:left="-426" w:right="-427" w:firstLine="0"/>
+        <w:rPr>
+          <w:sz w:val="20"/>
+          <w:szCs w:val="20"/>
+        </w:rPr>
+      </w:pPr>
+      <w:r>
+        <w:rPr>
+          <w:sz w:val="20"/>
+          <w:szCs w:val="20"/>
+        </w:rPr>
         <w:t xml:space="preserve">Desde </w:t>
       </w:r>
       <w:proofErr w:type="spellStart"/>
       <w:r>
+        <w:rPr>
+          <w:sz w:val="20"/>
+          <w:szCs w:val="20"/>
+        </w:rPr>
         <w:t>Dashboard</w:t>
       </w:r>
       <w:proofErr w:type="spellEnd"/>
       <w:r>
+        <w:rPr>
+          <w:sz w:val="20"/>
+          <w:szCs w:val="20"/>
+        </w:rPr>
         <w:tab/>
-        <w:t xml:space="preserve">-&gt; Buscador </w:t>
-      </w:r>
-      <w:r>
+      </w:r>
+      <w:r>
+        <w:rPr>
+          <w:rFonts w:ascii="Montserrat" w:hAnsi="Montserrat"/>
+          <w:b/>
+          <w:bCs/>
+          <w:color w:val="5BBCB6"/>
+          <w:sz w:val="20"/>
+          <w:szCs w:val="20"/>
+        </w:rPr>
+        <w:t>-&gt;</w:t>
+      </w:r>
+      <w:r>
+        <w:rPr>
+          <w:sz w:val="20"/>
+          <w:szCs w:val="20"/>
+        </w:rPr>
+        <w:t xml:space="preserve">      </w:t>
+      </w:r>
+      <w:r>
+        <w:rPr>
+          <w:sz w:val="20"/>
+          <w:szCs w:val="20"/>
+        </w:rPr>
+        <w:t xml:space="preserve">Buscador </w:t>
+      </w:r>
+      <w:r>
+        <w:rPr>
+          <w:sz w:val="20"/>
+          <w:szCs w:val="20"/>
+        </w:rPr>
         <w:t>general de apuntes</w:t>
       </w:r>
       <w:r>
-        <w:t xml:space="preserve"> -&gt; Formulario pa</w:t>
-      </w:r>
-      <w:r>
+        <w:rPr>
+          <w:sz w:val="20"/>
+          <w:szCs w:val="20"/>
+        </w:rPr>
+        <w:t xml:space="preserve"> </w:t>
+      </w:r>
+      <w:r>
+        <w:rPr>
+          <w:sz w:val="20"/>
+          <w:szCs w:val="20"/>
+        </w:rPr>
+        <w:t xml:space="preserve">     </w:t>
+      </w:r>
+      <w:r>
+        <w:rPr>
+          <w:rFonts w:ascii="Montserrat" w:hAnsi="Montserrat"/>
+          <w:b/>
+          <w:bCs/>
+          <w:color w:val="5BBCB6"/>
+          <w:sz w:val="20"/>
+          <w:szCs w:val="20"/>
+        </w:rPr>
+        <w:t>-&gt;</w:t>
+      </w:r>
+      <w:r>
+        <w:rPr>
+          <w:b/>
+          <w:bCs/>
+          <w:color w:val="5BBCB6"/>
+          <w:sz w:val="20"/>
+          <w:szCs w:val="20"/>
+        </w:rPr>
+        <w:t xml:space="preserve">     </w:t>
+      </w:r>
+      <w:r>
+        <w:rPr>
+          <w:sz w:val="20"/>
+          <w:szCs w:val="20"/>
+        </w:rPr>
+        <w:t xml:space="preserve"> Formulario pa</w:t>
+      </w:r>
+      <w:r>
+        <w:rPr>
+          <w:sz w:val="20"/>
+          <w:szCs w:val="20"/>
+        </w:rPr>
         <w:t>ra subir un nuevo apunte</w:t>
       </w:r>
     </w:p>
     <w:p>
       <w:pPr>
-        <w:ind w:left="-426" w:right="-143" w:firstLine="992"/>
-      </w:pPr>
-      <w:r>
+        <w:ind w:left="-426" w:right="-427" w:firstLine="992"/>
+        <w:rPr>
+          <w:sz w:val="20"/>
+          <w:szCs w:val="20"/>
+        </w:rPr>
+      </w:pPr>
+      <w:r>
+        <w:rPr>
+          <w:sz w:val="20"/>
+          <w:szCs w:val="20"/>
+        </w:rPr>
         <w:t xml:space="preserve"> </w:t>
       </w:r>
       <w:r>
+        <w:rPr>
+          <w:sz w:val="20"/>
+          <w:szCs w:val="20"/>
+        </w:rPr>
         <w:tab/>
       </w:r>
       <w:r>
+        <w:rPr>
+          <w:sz w:val="20"/>
+          <w:szCs w:val="20"/>
+        </w:rPr>
         <w:tab/>
-        <w:t xml:space="preserve">-&gt; </w:t>
-      </w:r>
-      <w:r>
+      </w:r>
+      <w:r>
+        <w:rPr>
+          <w:rFonts w:ascii="Montserrat" w:hAnsi="Montserrat"/>
+          <w:b/>
+          <w:bCs/>
+          <w:color w:val="5BBCB6"/>
+          <w:sz w:val="20"/>
+          <w:szCs w:val="20"/>
+        </w:rPr>
+        <w:t>-&gt;</w:t>
+      </w:r>
+      <w:r>
+        <w:rPr>
+          <w:rFonts w:ascii="Montserrat" w:hAnsi="Montserrat"/>
+          <w:b/>
+          <w:bCs/>
+          <w:color w:val="5BBCB6"/>
+          <w:sz w:val="20"/>
+          <w:szCs w:val="20"/>
+        </w:rPr>
+        <w:t xml:space="preserve"> </w:t>
+      </w:r>
+      <w:r>
+        <w:rPr>
+          <w:b/>
+          <w:bCs/>
+          <w:color w:val="5BBCB6"/>
+          <w:sz w:val="20"/>
+          <w:szCs w:val="20"/>
+        </w:rPr>
+        <w:t xml:space="preserve">    </w:t>
+      </w:r>
+      <w:r>
+        <w:rPr>
+          <w:sz w:val="20"/>
+          <w:szCs w:val="20"/>
+        </w:rPr>
+        <w:t xml:space="preserve"> </w:t>
+      </w:r>
+      <w:r>
+        <w:rPr>
+          <w:sz w:val="20"/>
+          <w:szCs w:val="20"/>
+        </w:rPr>
         <w:t>Perfil de usuario (estadísticas)</w:t>
       </w:r>
     </w:p>
     <w:p>
       <w:pPr>
-        <w:ind w:left="282" w:right="-143" w:firstLine="1134"/>
-      </w:pPr>
-      <w:r>
-        <w:t>-&gt; Ajustes de la a</w:t>
-      </w:r>
-      <w:r>
+        <w:ind w:left="282" w:right="-427" w:firstLine="1134"/>
+        <w:rPr>
+          <w:sz w:val="20"/>
+          <w:szCs w:val="20"/>
+        </w:rPr>
+      </w:pPr>
+      <w:r>
+        <w:rPr>
+          <w:rFonts w:ascii="Montserrat" w:hAnsi="Montserrat"/>
+          <w:b/>
+          <w:bCs/>
+          <w:color w:val="5BBCB6"/>
+          <w:sz w:val="20"/>
+          <w:szCs w:val="20"/>
+        </w:rPr>
+        <w:t>-&gt;</w:t>
+      </w:r>
+      <w:r>
+        <w:rPr>
+          <w:rFonts w:ascii="Montserrat" w:hAnsi="Montserrat"/>
+          <w:sz w:val="20"/>
+          <w:szCs w:val="20"/>
+        </w:rPr>
+        <w:t xml:space="preserve"> </w:t>
+      </w:r>
+      <w:r>
+        <w:rPr>
+          <w:sz w:val="20"/>
+          <w:szCs w:val="20"/>
+        </w:rPr>
+        <w:t xml:space="preserve">     </w:t>
+      </w:r>
+      <w:r>
+        <w:rPr>
+          <w:sz w:val="20"/>
+          <w:szCs w:val="20"/>
+        </w:rPr>
+        <w:t>Ajustes de la a</w:t>
+      </w:r>
+      <w:r>
+        <w:rPr>
+          <w:sz w:val="20"/>
+          <w:szCs w:val="20"/>
+        </w:rPr>
         <w:t>plicación</w:t>
       </w:r>
     </w:p>
     <w:p>
       <w:pPr>
-        <w:ind w:left="-426" w:right="-143" w:firstLine="0"/>
-      </w:pPr>
-      <w:r>
-        <w:lastRenderedPageBreak/>
+        <w:ind w:left="-426" w:right="-427" w:firstLine="0"/>
+        <w:rPr>
+          <w:sz w:val="20"/>
+          <w:szCs w:val="20"/>
+        </w:rPr>
+      </w:pPr>
+      <w:r>
+        <w:rPr>
+          <w:sz w:val="20"/>
+          <w:szCs w:val="20"/>
+        </w:rPr>
         <w:t>Desde</w:t>
       </w:r>
       <w:r>
+        <w:rPr>
+          <w:sz w:val="20"/>
+          <w:szCs w:val="20"/>
+        </w:rPr>
         <w:t xml:space="preserve"> Listado de asignaturas</w:t>
       </w:r>
       <w:r>
-        <w:t xml:space="preserve"> -&gt; </w:t>
-      </w:r>
-      <w:r>
-        <w:t>Detalle de una asignatura -&gt; Detalle de un recurso</w:t>
-      </w:r>
-    </w:p>
-    <w:p>
-      <w:pPr>
-        <w:ind w:left="-426" w:right="-143" w:firstLine="0"/>
+        <w:rPr>
+          <w:sz w:val="20"/>
+          <w:szCs w:val="20"/>
+        </w:rPr>
+        <w:t xml:space="preserve"> </w:t>
+      </w:r>
+      <w:r>
+        <w:rPr>
+          <w:sz w:val="20"/>
+          <w:szCs w:val="20"/>
+        </w:rPr>
+        <w:t xml:space="preserve">     </w:t>
+      </w:r>
+      <w:r>
+        <w:rPr>
+          <w:rFonts w:ascii="Montserrat" w:hAnsi="Montserrat"/>
+          <w:b/>
+          <w:bCs/>
+          <w:color w:val="5BBCB6"/>
+          <w:sz w:val="20"/>
+          <w:szCs w:val="20"/>
+        </w:rPr>
+        <w:t>-&gt;</w:t>
+      </w:r>
+      <w:r>
+        <w:rPr>
+          <w:rFonts w:ascii="Montserrat" w:hAnsi="Montserrat"/>
+          <w:b/>
+          <w:bCs/>
+          <w:color w:val="5BBCB6"/>
+          <w:sz w:val="20"/>
+          <w:szCs w:val="20"/>
+        </w:rPr>
+        <w:t xml:space="preserve"> </w:t>
+      </w:r>
+      <w:r>
+        <w:rPr>
+          <w:b/>
+          <w:bCs/>
+          <w:color w:val="5BBCB6"/>
+          <w:sz w:val="20"/>
+          <w:szCs w:val="20"/>
+        </w:rPr>
+        <w:t xml:space="preserve">    </w:t>
+      </w:r>
+      <w:r>
+        <w:rPr>
+          <w:sz w:val="20"/>
+          <w:szCs w:val="20"/>
+        </w:rPr>
+        <w:t xml:space="preserve"> </w:t>
+      </w:r>
+      <w:r>
+        <w:rPr>
+          <w:sz w:val="20"/>
+          <w:szCs w:val="20"/>
+        </w:rPr>
+        <w:t>Detalle de una asignatura</w:t>
+      </w:r>
+      <w:r>
+        <w:rPr>
+          <w:sz w:val="20"/>
+          <w:szCs w:val="20"/>
+        </w:rPr>
+        <w:t xml:space="preserve">     </w:t>
+      </w:r>
+      <w:r>
+        <w:rPr>
+          <w:sz w:val="20"/>
+          <w:szCs w:val="20"/>
+        </w:rPr>
+        <w:t xml:space="preserve"> </w:t>
+      </w:r>
+      <w:r>
+        <w:rPr>
+          <w:rFonts w:ascii="Montserrat" w:hAnsi="Montserrat"/>
+          <w:b/>
+          <w:bCs/>
+          <w:color w:val="5BBCB6"/>
+          <w:sz w:val="20"/>
+          <w:szCs w:val="20"/>
+        </w:rPr>
+        <w:t>-&gt;</w:t>
+      </w:r>
+      <w:r>
+        <w:rPr>
+          <w:sz w:val="20"/>
+          <w:szCs w:val="20"/>
+        </w:rPr>
+        <w:t xml:space="preserve"> </w:t>
+      </w:r>
+      <w:r>
+        <w:rPr>
+          <w:sz w:val="20"/>
+          <w:szCs w:val="20"/>
+        </w:rPr>
+        <w:t xml:space="preserve">     </w:t>
+      </w:r>
+      <w:r>
+        <w:rPr>
+          <w:sz w:val="20"/>
+          <w:szCs w:val="20"/>
+        </w:rPr>
+        <w:t>Detalle de un recurso</w:t>
+      </w:r>
+    </w:p>
+    <w:p>
+      <w:pPr>
+        <w:ind w:left="-426" w:right="-427" w:firstLine="0"/>
       </w:pPr>
     </w:p>
     <w:p>
       <w:pPr>
         <w:pStyle w:val="Ttulo2"/>
+        <w:ind w:left="-709" w:right="-427"/>
       </w:pPr>
       <w:bookmarkStart w:id="6" w:name="_Toc240331166"/>
       <w:r>
-        <w:t>2</w:t>
-      </w:r>
-      <w:r>
-        <w:t>.2</w:t>
+        <w:t>2.2</w:t>
       </w:r>
       <w:r>
         <w:tab/>
@@ -2348,35 +3434,44 @@
     </w:p>
     <w:p>
       <w:pPr>
-        <w:ind w:left="-426" w:right="-143" w:firstLine="0"/>
-      </w:pPr>
-      <w:r>
-        <w:t>Diagrama resultante de la agrupación y priorización:</w:t>
-      </w:r>
-    </w:p>
-    <w:p>
-      <w:pPr>
-        <w:ind w:left="-426" w:right="-143" w:firstLine="0"/>
-      </w:pPr>
-      <w:r>
+        <w:ind w:left="-426" w:right="-427" w:firstLine="426"/>
+      </w:pPr>
+      <w:r>
+        <w:rPr>
+          <w:b/>
+          <w:bCs/>
+        </w:rPr>
+        <w:t>Diagrama</w:t>
+      </w:r>
+      <w:r>
+        <w:t xml:space="preserve"> resultante de la agrupación y priorización</w:t>
+      </w:r>
+      <w:r>
+        <w:t>.</w:t>
+      </w:r>
+    </w:p>
+    <w:p>
+      <w:pPr>
+        <w:ind w:left="-426" w:right="-427" w:firstLine="0"/>
+      </w:pPr>
+      <w:r>
+        <w:lastRenderedPageBreak/>
         <w:t>------------------------------------------------------------------------Diagrama</w:t>
       </w:r>
     </w:p>
     <w:p>
       <w:pPr>
-        <w:ind w:left="-426" w:right="-143" w:firstLine="0"/>
+        <w:ind w:left="-426" w:right="-427" w:firstLine="0"/>
       </w:pPr>
     </w:p>
     <w:p>
       <w:pPr>
         <w:pStyle w:val="Ttulo2"/>
+        <w:ind w:left="-709" w:right="-427"/>
       </w:pPr>
       <w:bookmarkStart w:id="7" w:name="_Toc240331167"/>
       <w:r>
-        <w:t>2</w:t>
-      </w:r>
-      <w:r>
-        <w:t>.3</w:t>
+        <w:t>2.3</w:t>
       </w:r>
       <w:r>
         <w:tab/>
@@ -2386,12 +3481,20 @@
     </w:p>
     <w:p>
       <w:pPr>
-        <w:ind w:left="-426" w:right="-143" w:firstLine="0"/>
-      </w:pPr>
-    </w:p>
-    <w:p>
-      <w:pPr>
-        <w:ind w:left="-426" w:right="-143" w:firstLine="0"/>
+        <w:ind w:right="-427" w:firstLine="0"/>
+      </w:pPr>
+      <w:r>
+        <w:t>Elección del menú principal en base al dispositivo utilizado.</w:t>
+      </w:r>
+    </w:p>
+    <w:p>
+      <w:pPr>
+        <w:ind w:left="-426" w:right="-427" w:firstLine="0"/>
+      </w:pPr>
+    </w:p>
+    <w:p>
+      <w:pPr>
+        <w:ind w:left="-426" w:right="-427" w:firstLine="0"/>
       </w:pPr>
       <w:r>
         <w:t xml:space="preserve">Si se desarrolla como </w:t>
@@ -2409,9 +3512,13 @@
     </w:p>
     <w:p>
       <w:pPr>
-        <w:ind w:left="-426" w:right="-143" w:firstLine="0"/>
-      </w:pPr>
-      <w:r>
+        <w:ind w:left="-426" w:right="-427" w:firstLine="0"/>
+      </w:pPr>
+      <w:r>
+        <w:rPr>
+          <w:b/>
+          <w:bCs/>
+        </w:rPr>
         <w:t>Menú elegido:</w:t>
       </w:r>
       <w:r>
@@ -2419,124 +3526,280 @@
       </w:r>
       <w:r>
         <w:tab/>
+      </w:r>
+      <w:r>
+        <w:rPr>
+          <w:sz w:val="20"/>
+          <w:szCs w:val="20"/>
+        </w:rPr>
         <w:t xml:space="preserve">Barra de Navegación Inferior (Bottom </w:t>
       </w:r>
       <w:proofErr w:type="spellStart"/>
       <w:r>
+        <w:rPr>
+          <w:sz w:val="20"/>
+          <w:szCs w:val="20"/>
+        </w:rPr>
         <w:t>Navigation</w:t>
       </w:r>
       <w:proofErr w:type="spellEnd"/>
       <w:r>
+        <w:rPr>
+          <w:sz w:val="20"/>
+          <w:szCs w:val="20"/>
+        </w:rPr>
         <w:t>).</w:t>
       </w:r>
     </w:p>
     <w:p>
       <w:pPr>
-        <w:ind w:left="2124" w:right="-143" w:hanging="2550"/>
-      </w:pPr>
-      <w:r>
+        <w:ind w:left="2124" w:right="-427" w:hanging="2550"/>
+      </w:pPr>
+      <w:r>
+        <w:rPr>
+          <w:b/>
+          <w:bCs/>
+        </w:rPr>
         <w:t>¿Por qué?:</w:t>
       </w:r>
       <w:r>
         <w:tab/>
       </w:r>
       <w:r>
+        <w:rPr>
+          <w:sz w:val="20"/>
+          <w:szCs w:val="20"/>
+        </w:rPr>
         <w:t>U</w:t>
       </w:r>
       <w:r>
+        <w:rPr>
+          <w:sz w:val="20"/>
+          <w:szCs w:val="20"/>
+        </w:rPr>
         <w:t xml:space="preserve">na </w:t>
       </w:r>
       <w:proofErr w:type="gramStart"/>
       <w:r>
+        <w:rPr>
+          <w:sz w:val="20"/>
+          <w:szCs w:val="20"/>
+        </w:rPr>
         <w:t>app</w:t>
       </w:r>
       <w:proofErr w:type="gramEnd"/>
       <w:r>
+        <w:rPr>
+          <w:sz w:val="20"/>
+          <w:szCs w:val="20"/>
+        </w:rPr>
         <w:t xml:space="preserve"> móvil de por sí </w:t>
       </w:r>
       <w:r>
+        <w:rPr>
+          <w:sz w:val="20"/>
+          <w:szCs w:val="20"/>
+        </w:rPr>
         <w:t>ya implica un</w:t>
       </w:r>
       <w:r>
+        <w:rPr>
+          <w:sz w:val="20"/>
+          <w:szCs w:val="20"/>
+        </w:rPr>
         <w:t xml:space="preserve"> acceso rápido al menú, y siendo la </w:t>
       </w:r>
       <w:proofErr w:type="gramStart"/>
       <w:r>
+        <w:rPr>
+          <w:sz w:val="20"/>
+          <w:szCs w:val="20"/>
+        </w:rPr>
         <w:t>app</w:t>
       </w:r>
       <w:proofErr w:type="gramEnd"/>
       <w:r>
+        <w:rPr>
+          <w:sz w:val="20"/>
+          <w:szCs w:val="20"/>
+        </w:rPr>
         <w:t xml:space="preserve"> de </w:t>
       </w:r>
       <w:r>
+        <w:rPr>
+          <w:sz w:val="20"/>
+          <w:szCs w:val="20"/>
+        </w:rPr>
         <w:t>estudios</w:t>
       </w:r>
       <w:r>
+        <w:rPr>
+          <w:sz w:val="20"/>
+          <w:szCs w:val="20"/>
+        </w:rPr>
         <w:t xml:space="preserve">, </w:t>
       </w:r>
       <w:r>
+        <w:rPr>
+          <w:sz w:val="20"/>
+          <w:szCs w:val="20"/>
+        </w:rPr>
         <w:t>la organización y el rápido acceso deben estar garantizados</w:t>
       </w:r>
       <w:r>
+        <w:rPr>
+          <w:sz w:val="20"/>
+          <w:szCs w:val="20"/>
+        </w:rPr>
         <w:t xml:space="preserve">, </w:t>
       </w:r>
       <w:r>
+        <w:rPr>
+          <w:sz w:val="20"/>
+          <w:szCs w:val="20"/>
+        </w:rPr>
         <w:t>por lo que</w:t>
       </w:r>
       <w:r>
+        <w:rPr>
+          <w:sz w:val="20"/>
+          <w:szCs w:val="20"/>
+        </w:rPr>
         <w:t xml:space="preserve"> las opciones clave del menú </w:t>
       </w:r>
       <w:r>
+        <w:rPr>
+          <w:sz w:val="20"/>
+          <w:szCs w:val="20"/>
+        </w:rPr>
         <w:t xml:space="preserve">ganan accesibilidad </w:t>
       </w:r>
       <w:r>
-        <w:t>en la zona de confort del pulgar.</w:t>
-      </w:r>
-    </w:p>
-    <w:p>
-      <w:pPr>
-        <w:ind w:left="2124" w:right="-143" w:hanging="2550"/>
-      </w:pPr>
-      <w:r>
+        <w:rPr>
+          <w:sz w:val="20"/>
+          <w:szCs w:val="20"/>
+        </w:rPr>
+        <w:t xml:space="preserve">en la zona de </w:t>
+      </w:r>
+      <w:r>
+        <w:rPr>
+          <w:sz w:val="20"/>
+          <w:szCs w:val="20"/>
+        </w:rPr>
+        <w:t>alcance</w:t>
+      </w:r>
+      <w:r>
+        <w:rPr>
+          <w:sz w:val="20"/>
+          <w:szCs w:val="20"/>
+        </w:rPr>
+        <w:t xml:space="preserve"> </w:t>
+      </w:r>
+      <w:r>
+        <w:rPr>
+          <w:sz w:val="20"/>
+          <w:szCs w:val="20"/>
+        </w:rPr>
+        <w:t xml:space="preserve">para </w:t>
+      </w:r>
+      <w:r>
+        <w:rPr>
+          <w:sz w:val="20"/>
+          <w:szCs w:val="20"/>
+        </w:rPr>
+        <w:t>el pulgar.</w:t>
+      </w:r>
+    </w:p>
+    <w:p>
+      <w:pPr>
+        <w:ind w:left="2124" w:right="-427" w:hanging="2550"/>
+        <w:rPr>
+          <w:sz w:val="20"/>
+          <w:szCs w:val="20"/>
+        </w:rPr>
+      </w:pPr>
+      <w:r>
+        <w:rPr>
+          <w:b/>
+          <w:bCs/>
+        </w:rPr>
         <w:t>Secciones en el menú:</w:t>
       </w:r>
       <w:r>
         <w:tab/>
+      </w:r>
+      <w:r>
+        <w:rPr>
+          <w:sz w:val="20"/>
+          <w:szCs w:val="20"/>
+        </w:rPr>
         <w:t xml:space="preserve">Buscador </w:t>
       </w:r>
       <w:r>
+        <w:rPr>
+          <w:sz w:val="20"/>
+          <w:szCs w:val="20"/>
+        </w:rPr>
         <w:t>general de apuntes</w:t>
       </w:r>
       <w:r>
+        <w:rPr>
+          <w:sz w:val="20"/>
+          <w:szCs w:val="20"/>
+        </w:rPr>
         <w:t xml:space="preserve">, </w:t>
       </w:r>
       <w:r>
+        <w:rPr>
+          <w:sz w:val="20"/>
+          <w:szCs w:val="20"/>
+        </w:rPr>
         <w:t>Perfil de usuario</w:t>
       </w:r>
       <w:r>
+        <w:rPr>
+          <w:sz w:val="20"/>
+          <w:szCs w:val="20"/>
+        </w:rPr>
         <w:t xml:space="preserve"> y Ajustes de la Ap</w:t>
       </w:r>
       <w:r>
+        <w:rPr>
+          <w:sz w:val="20"/>
+          <w:szCs w:val="20"/>
+        </w:rPr>
         <w:t>licación</w:t>
       </w:r>
       <w:r>
+        <w:rPr>
+          <w:sz w:val="20"/>
+          <w:szCs w:val="20"/>
+        </w:rPr>
         <w:t xml:space="preserve"> </w:t>
       </w:r>
       <w:r>
+        <w:rPr>
+          <w:sz w:val="20"/>
+          <w:szCs w:val="20"/>
+        </w:rPr>
         <w:t>conforman la barra de navegación</w:t>
       </w:r>
       <w:r>
+        <w:rPr>
+          <w:sz w:val="20"/>
+          <w:szCs w:val="20"/>
+        </w:rPr>
         <w:t>.</w:t>
       </w:r>
     </w:p>
     <w:p>
       <w:pPr>
-        <w:ind w:left="-426" w:right="-143" w:firstLine="0"/>
-      </w:pPr>
-    </w:p>
-    <w:p>
-      <w:pPr>
-        <w:ind w:left="-426" w:right="-143" w:firstLine="0"/>
+        <w:ind w:left="-426" w:right="-427" w:firstLine="0"/>
+      </w:pPr>
+    </w:p>
+    <w:p>
+      <w:pPr>
+        <w:ind w:left="-426" w:right="-427" w:firstLine="0"/>
       </w:pPr>
       <w:r>
         <w:t xml:space="preserve">Si se desarrolla como </w:t>
@@ -2554,86 +3817,170 @@
     </w:p>
     <w:p>
       <w:pPr>
-        <w:ind w:left="2124" w:right="-143" w:hanging="2550"/>
-      </w:pPr>
-      <w:r>
+        <w:ind w:left="2124" w:right="-427" w:hanging="2550"/>
+      </w:pPr>
+      <w:r>
+        <w:rPr>
+          <w:b/>
+          <w:bCs/>
+        </w:rPr>
         <w:t>Menú elegido:</w:t>
       </w:r>
       <w:r>
         <w:tab/>
+      </w:r>
+      <w:r>
+        <w:rPr>
+          <w:sz w:val="20"/>
+          <w:szCs w:val="20"/>
+        </w:rPr>
         <w:t>Barra de Navegación Superior (Top Bar).</w:t>
       </w:r>
     </w:p>
     <w:p>
       <w:pPr>
-        <w:ind w:left="2124" w:right="-143" w:hanging="2550"/>
-      </w:pPr>
-      <w:r>
+        <w:ind w:left="2124" w:right="-427" w:hanging="2550"/>
+        <w:rPr>
+          <w:sz w:val="20"/>
+          <w:szCs w:val="20"/>
+        </w:rPr>
+      </w:pPr>
+      <w:r>
+        <w:rPr>
+          <w:b/>
+          <w:bCs/>
+        </w:rPr>
         <w:t>¿Por qué?:</w:t>
       </w:r>
       <w:r>
+        <w:rPr>
+          <w:b/>
+          <w:bCs/>
+        </w:rPr>
         <w:tab/>
       </w:r>
       <w:r>
+        <w:rPr>
+          <w:sz w:val="20"/>
+          <w:szCs w:val="20"/>
+        </w:rPr>
         <w:t xml:space="preserve">Gracias al mayor espacio que ofrece </w:t>
       </w:r>
       <w:r>
+        <w:rPr>
+          <w:sz w:val="20"/>
+          <w:szCs w:val="20"/>
+        </w:rPr>
         <w:t>el entorno web</w:t>
       </w:r>
       <w:r>
+        <w:rPr>
+          <w:sz w:val="20"/>
+          <w:szCs w:val="20"/>
+        </w:rPr>
         <w:t xml:space="preserve">, </w:t>
       </w:r>
       <w:r>
+        <w:rPr>
+          <w:sz w:val="20"/>
+          <w:szCs w:val="20"/>
+        </w:rPr>
         <w:t>la barra de navegación puede situarse en la parte superior, agrandando las opciones o transformando el acceso a los subniveles mediante desplegables</w:t>
       </w:r>
       <w:r>
+        <w:rPr>
+          <w:sz w:val="20"/>
+          <w:szCs w:val="20"/>
+        </w:rPr>
         <w:t>.</w:t>
       </w:r>
     </w:p>
     <w:p>
       <w:pPr>
-        <w:ind w:left="2124" w:right="-143" w:hanging="2550"/>
-      </w:pPr>
-      <w:r>
+        <w:ind w:left="2124" w:right="-427" w:hanging="2550"/>
+      </w:pPr>
+      <w:r>
+        <w:rPr>
+          <w:b/>
+          <w:bCs/>
+        </w:rPr>
         <w:t>Secciones en el menú:</w:t>
       </w:r>
       <w:r>
         <w:tab/>
+      </w:r>
+      <w:r>
+        <w:rPr>
+          <w:sz w:val="20"/>
+          <w:szCs w:val="20"/>
+        </w:rPr>
         <w:t xml:space="preserve">Buscador </w:t>
       </w:r>
       <w:r>
+        <w:rPr>
+          <w:sz w:val="20"/>
+          <w:szCs w:val="20"/>
+        </w:rPr>
         <w:t>general de apuntes (con espacio para mostrar quizás los últimos apuntes buscados)</w:t>
       </w:r>
       <w:r>
+        <w:rPr>
+          <w:sz w:val="20"/>
+          <w:szCs w:val="20"/>
+        </w:rPr>
         <w:t xml:space="preserve">, </w:t>
       </w:r>
       <w:r>
+        <w:rPr>
+          <w:sz w:val="20"/>
+          <w:szCs w:val="20"/>
+        </w:rPr>
         <w:t>Perfil de usuario con desplegable</w:t>
       </w:r>
       <w:r>
+        <w:rPr>
+          <w:sz w:val="20"/>
+          <w:szCs w:val="20"/>
+        </w:rPr>
         <w:t xml:space="preserve"> y Ajustes de la a</w:t>
       </w:r>
       <w:r>
+        <w:rPr>
+          <w:sz w:val="20"/>
+          <w:szCs w:val="20"/>
+        </w:rPr>
         <w:t>plicación</w:t>
       </w:r>
       <w:r>
+        <w:rPr>
+          <w:sz w:val="20"/>
+          <w:szCs w:val="20"/>
+        </w:rPr>
         <w:t xml:space="preserve"> forma</w:t>
       </w:r>
       <w:r>
+        <w:rPr>
+          <w:sz w:val="20"/>
+          <w:szCs w:val="20"/>
+        </w:rPr>
         <w:t>n la barra superior de navegación</w:t>
       </w:r>
       <w:r>
+        <w:rPr>
+          <w:sz w:val="20"/>
+          <w:szCs w:val="20"/>
+        </w:rPr>
         <w:t>.</w:t>
       </w:r>
     </w:p>
     <w:p>
       <w:pPr>
-        <w:ind w:left="2124" w:right="-143" w:hanging="2550"/>
-      </w:pPr>
-    </w:p>
-    <w:p>
-      <w:pPr>
-        <w:ind w:left="2124" w:right="-143" w:hanging="2550"/>
+        <w:ind w:left="2124" w:right="-427" w:hanging="2550"/>
+      </w:pPr>
+    </w:p>
+    <w:p>
+      <w:pPr>
+        <w:ind w:left="2124" w:right="-427" w:hanging="2550"/>
       </w:pPr>
     </w:p>
     <w:p>
@@ -2643,7 +3990,7 @@
           <w:ilvl w:val="0"/>
           <w:numId w:val="2"/>
         </w:numPr>
-        <w:ind w:left="-284" w:right="-143"/>
+        <w:ind w:left="-284" w:right="-427"/>
       </w:pPr>
       <w:bookmarkStart w:id="8" w:name="_Toc240331168"/>
       <w:proofErr w:type="spellStart"/>
@@ -2663,70 +4010,152 @@
       <w:bookmarkEnd w:id="8"/>
     </w:p>
     <w:p>
+      <w:pPr>
+        <w:pStyle w:val="Prrafodelista"/>
+        <w:numPr>
+          <w:ilvl w:val="0"/>
+          <w:numId w:val="7"/>
+        </w:numPr>
+        <w:ind w:right="-427"/>
+      </w:pPr>
       <w:r>
         <w:t>Pantalla de acceso y registro</w:t>
       </w:r>
     </w:p>
     <w:p>
+      <w:pPr>
+        <w:pStyle w:val="Prrafodelista"/>
+        <w:numPr>
+          <w:ilvl w:val="0"/>
+          <w:numId w:val="7"/>
+        </w:numPr>
+        <w:ind w:right="-427"/>
+      </w:pPr>
       <w:r>
         <w:t>Pantalla principal con restaurantes destacados</w:t>
       </w:r>
     </w:p>
     <w:p>
+      <w:pPr>
+        <w:pStyle w:val="Prrafodelista"/>
+        <w:numPr>
+          <w:ilvl w:val="0"/>
+          <w:numId w:val="7"/>
+        </w:numPr>
+        <w:ind w:right="-427"/>
+      </w:pPr>
+      <w:r>
+        <w:t>Buscador de platos por tipo de cocina</w:t>
+      </w:r>
+    </w:p>
+    <w:p>
+      <w:pPr>
+        <w:pStyle w:val="Prrafodelista"/>
+        <w:numPr>
+          <w:ilvl w:val="0"/>
+          <w:numId w:val="7"/>
+        </w:numPr>
+        <w:ind w:right="-427"/>
+      </w:pPr>
+      <w:r>
+        <w:t>Ficha de detalle del restaurante (menú y valoraciones)</w:t>
+      </w:r>
+    </w:p>
+    <w:p>
+      <w:pPr>
+        <w:pStyle w:val="Prrafodelista"/>
+        <w:numPr>
+          <w:ilvl w:val="0"/>
+          <w:numId w:val="7"/>
+        </w:numPr>
+        <w:ind w:right="-427"/>
+      </w:pPr>
+      <w:r>
+        <w:t>Carrito de la compra actual</w:t>
+      </w:r>
+    </w:p>
+    <w:p>
+      <w:pPr>
+        <w:pStyle w:val="Prrafodelista"/>
+        <w:numPr>
+          <w:ilvl w:val="0"/>
+          <w:numId w:val="7"/>
+        </w:numPr>
+        <w:ind w:right="-427"/>
+      </w:pPr>
+      <w:r>
+        <w:t>Pasarela de pago (dirección y tarjeta)</w:t>
+      </w:r>
+    </w:p>
+    <w:p>
+      <w:pPr>
+        <w:pStyle w:val="Prrafodelista"/>
+        <w:numPr>
+          <w:ilvl w:val="0"/>
+          <w:numId w:val="7"/>
+        </w:numPr>
+        <w:ind w:right="-427"/>
+      </w:pPr>
+      <w:r>
+        <w:t>Historial de pedidos anteriores</w:t>
+      </w:r>
+    </w:p>
+    <w:p>
+      <w:pPr>
+        <w:pStyle w:val="Prrafodelista"/>
+        <w:numPr>
+          <w:ilvl w:val="0"/>
+          <w:numId w:val="7"/>
+        </w:numPr>
+        <w:ind w:right="-427"/>
+      </w:pPr>
+      <w:r>
+        <w:t>Seguimiento del pedido en tiempo real</w:t>
+      </w:r>
+    </w:p>
+    <w:p>
+      <w:pPr>
+        <w:pStyle w:val="Prrafodelista"/>
+        <w:numPr>
+          <w:ilvl w:val="0"/>
+          <w:numId w:val="7"/>
+        </w:numPr>
+        <w:ind w:right="-427"/>
+      </w:pPr>
+      <w:r>
+        <w:t>Perfil de usuario y direcciones guardadas</w:t>
+      </w:r>
+    </w:p>
+    <w:p>
+      <w:pPr>
+        <w:pStyle w:val="Prrafodelista"/>
+        <w:numPr>
+          <w:ilvl w:val="0"/>
+          <w:numId w:val="7"/>
+        </w:numPr>
+        <w:ind w:right="-427"/>
+      </w:pPr>
       <w:r>
         <w:lastRenderedPageBreak/>
-        <w:t>Buscador de platos por tipo de cocina</w:t>
-      </w:r>
-    </w:p>
-    <w:p>
-      <w:r>
-        <w:t>Ficha de detalle del restaurante (menú y valoraciones)</w:t>
-      </w:r>
-    </w:p>
-    <w:p>
-      <w:r>
-        <w:t>Carrito de la compra actual</w:t>
-      </w:r>
-    </w:p>
-    <w:p>
-      <w:r>
-        <w:t>Pasarela de pago (dirección y tarjeta)</w:t>
-      </w:r>
-    </w:p>
-    <w:p>
-      <w:r>
-        <w:t>Historial de pedidos anteriores</w:t>
-      </w:r>
-    </w:p>
-    <w:p>
-      <w:r>
-        <w:t>Seguimiento del pedido en tiempo real</w:t>
-      </w:r>
-    </w:p>
-    <w:p>
-      <w:r>
-        <w:t>Perfil de usuario y direcciones guardadas</w:t>
-      </w:r>
-    </w:p>
-    <w:p>
-      <w:r>
         <w:t>Centro de</w:t>
       </w:r>
       <w:r>
         <w:t xml:space="preserve"> soporte y chat con atención al cliente</w:t>
       </w:r>
     </w:p>
-    <w:p/>
+    <w:p>
+      <w:pPr>
+        <w:ind w:right="-427"/>
+      </w:pPr>
+    </w:p>
     <w:p>
       <w:pPr>
         <w:pStyle w:val="Ttulo2"/>
+        <w:ind w:left="-709" w:right="-427"/>
       </w:pPr>
       <w:bookmarkStart w:id="9" w:name="_Toc240331169"/>
       <w:r>
-        <w:t>3</w:t>
-      </w:r>
-      <w:r>
-        <w:t>.1</w:t>
+        <w:t>3.1</w:t>
       </w:r>
       <w:r>
         <w:tab/>
@@ -2744,20 +4173,29 @@
     </w:p>
     <w:p>
       <w:pPr>
-        <w:ind w:left="-426" w:right="-143" w:firstLine="0"/>
-      </w:pPr>
-      <w:r>
-        <w:t>Los elementos se agrupan por afinidad lógica, separando lo que es de uso inmediato (Nivel 1) de los detalles (Nivel 2 o +)</w:t>
-      </w:r>
-    </w:p>
-    <w:p>
-      <w:pPr>
-        <w:ind w:left="-426" w:right="-143" w:firstLine="0"/>
-      </w:pPr>
-    </w:p>
-    <w:p>
-      <w:pPr>
-        <w:ind w:left="-426" w:right="-143" w:firstLine="0"/>
+        <w:ind w:right="-427" w:firstLine="0"/>
+      </w:pPr>
+      <w:r>
+        <w:t>Los elementos se agrupan por afinidad lógica, separando lo que es de uso inmediato (Nivel 1) de los detalles (Nivel 2</w:t>
+      </w:r>
+      <w:r>
+        <w:t xml:space="preserve"> o secundarios</w:t>
+      </w:r>
+      <w:r>
+        <w:t>)</w:t>
+      </w:r>
+      <w:r>
+        <w:t>.</w:t>
+      </w:r>
+    </w:p>
+    <w:p>
+      <w:pPr>
+        <w:ind w:left="-426" w:right="-427" w:firstLine="0"/>
+      </w:pPr>
+    </w:p>
+    <w:p>
+      <w:pPr>
+        <w:ind w:left="-426" w:right="-427" w:firstLine="0"/>
         <w:rPr>
           <w:b/>
           <w:bCs/>
@@ -2773,20 +4211,28 @@
     </w:p>
     <w:p>
       <w:pPr>
-        <w:ind w:left="-426" w:right="-143" w:firstLine="0"/>
-      </w:pPr>
-      <w:r>
+        <w:ind w:left="-426" w:right="-427" w:firstLine="0"/>
+        <w:rPr>
+          <w:sz w:val="20"/>
+          <w:szCs w:val="20"/>
+        </w:rPr>
+      </w:pPr>
+      <w:r>
+        <w:rPr>
+          <w:sz w:val="20"/>
+          <w:szCs w:val="20"/>
+        </w:rPr>
         <w:t>Pantalla de acceso y registro</w:t>
       </w:r>
     </w:p>
     <w:p>
       <w:pPr>
-        <w:ind w:left="-426" w:right="-143" w:firstLine="0"/>
-      </w:pPr>
-    </w:p>
-    <w:p>
-      <w:pPr>
-        <w:ind w:left="-426" w:right="-143" w:firstLine="0"/>
+        <w:ind w:left="-426" w:right="-427" w:firstLine="0"/>
+      </w:pPr>
+    </w:p>
+    <w:p>
+      <w:pPr>
+        <w:ind w:left="-426" w:right="-427" w:firstLine="0"/>
         <w:rPr>
           <w:b/>
           <w:bCs/>
@@ -2809,28 +4255,44 @@
     </w:p>
     <w:p>
       <w:pPr>
-        <w:ind w:left="-426" w:right="-143" w:firstLine="0"/>
-      </w:pPr>
-      <w:r>
+        <w:ind w:left="-426" w:right="-427" w:firstLine="0"/>
+        <w:rPr>
+          <w:sz w:val="20"/>
+          <w:szCs w:val="20"/>
+        </w:rPr>
+      </w:pPr>
+      <w:r>
+        <w:rPr>
+          <w:sz w:val="20"/>
+          <w:szCs w:val="20"/>
+        </w:rPr>
         <w:t>Pantalla principal con restaurantes destacados</w:t>
       </w:r>
     </w:p>
     <w:p>
       <w:pPr>
-        <w:ind w:left="-426" w:right="-143" w:firstLine="0"/>
-      </w:pPr>
-      <w:r>
+        <w:ind w:left="-426" w:right="-427" w:firstLine="0"/>
+        <w:rPr>
+          <w:sz w:val="20"/>
+          <w:szCs w:val="20"/>
+        </w:rPr>
+      </w:pPr>
+      <w:r>
+        <w:rPr>
+          <w:sz w:val="20"/>
+          <w:szCs w:val="20"/>
+        </w:rPr>
         <w:t>Seguimiento del pedido en tiempo real</w:t>
       </w:r>
     </w:p>
     <w:p>
       <w:pPr>
-        <w:ind w:left="-426" w:right="-143" w:firstLine="0"/>
-      </w:pPr>
-    </w:p>
-    <w:p>
-      <w:pPr>
-        <w:ind w:left="-426" w:right="-143" w:firstLine="0"/>
+        <w:ind w:left="-426" w:right="-427" w:firstLine="0"/>
+      </w:pPr>
+    </w:p>
+    <w:p>
+      <w:pPr>
+        <w:ind w:left="-426" w:right="-427" w:firstLine="0"/>
         <w:rPr>
           <w:b/>
           <w:bCs/>
@@ -2853,108 +4315,431 @@
     </w:p>
     <w:p>
       <w:pPr>
-        <w:ind w:left="-426" w:right="-143" w:firstLine="0"/>
-      </w:pPr>
-      <w:r>
+        <w:ind w:left="-426" w:right="-427" w:firstLine="0"/>
+        <w:rPr>
+          <w:sz w:val="20"/>
+          <w:szCs w:val="20"/>
+        </w:rPr>
+      </w:pPr>
+      <w:r>
+        <w:rPr>
+          <w:sz w:val="20"/>
+          <w:szCs w:val="20"/>
+        </w:rPr>
         <w:t xml:space="preserve">Desde </w:t>
       </w:r>
       <w:proofErr w:type="spellStart"/>
       <w:r>
+        <w:rPr>
+          <w:sz w:val="20"/>
+          <w:szCs w:val="20"/>
+        </w:rPr>
         <w:t>Dashboard</w:t>
       </w:r>
       <w:proofErr w:type="spellEnd"/>
       <w:r>
+        <w:rPr>
+          <w:sz w:val="20"/>
+          <w:szCs w:val="20"/>
+        </w:rPr>
         <w:tab/>
-        <w:t xml:space="preserve">-&gt; Buscador </w:t>
-      </w:r>
-      <w:r>
+      </w:r>
+      <w:r>
+        <w:rPr>
+          <w:rFonts w:ascii="Montserrat" w:hAnsi="Montserrat"/>
+          <w:b/>
+          <w:bCs/>
+          <w:color w:val="5BBCB6"/>
+          <w:sz w:val="20"/>
+          <w:szCs w:val="20"/>
+        </w:rPr>
+        <w:t>-&gt;</w:t>
+      </w:r>
+      <w:r>
+        <w:rPr>
+          <w:b/>
+          <w:bCs/>
+          <w:color w:val="5BBCB6"/>
+          <w:sz w:val="20"/>
+          <w:szCs w:val="20"/>
+        </w:rPr>
+        <w:t xml:space="preserve"> </w:t>
+      </w:r>
+      <w:r>
+        <w:rPr>
+          <w:b/>
+          <w:bCs/>
+          <w:color w:val="5BBCB6"/>
+          <w:sz w:val="20"/>
+          <w:szCs w:val="20"/>
+        </w:rPr>
+        <w:t xml:space="preserve">  </w:t>
+      </w:r>
+      <w:r>
+        <w:rPr>
+          <w:sz w:val="20"/>
+          <w:szCs w:val="20"/>
+        </w:rPr>
+        <w:t xml:space="preserve">   </w:t>
+      </w:r>
+      <w:r>
+        <w:rPr>
+          <w:sz w:val="20"/>
+          <w:szCs w:val="20"/>
+        </w:rPr>
+        <w:t xml:space="preserve">Buscador </w:t>
+      </w:r>
+      <w:r>
+        <w:rPr>
+          <w:sz w:val="20"/>
+          <w:szCs w:val="20"/>
+        </w:rPr>
         <w:t>de platos por tipo de cocina</w:t>
       </w:r>
     </w:p>
     <w:p>
       <w:pPr>
-        <w:ind w:left="-426" w:right="-143" w:firstLine="992"/>
-      </w:pPr>
-      <w:r>
+        <w:ind w:left="-426" w:right="-427" w:firstLine="992"/>
+        <w:rPr>
+          <w:sz w:val="20"/>
+          <w:szCs w:val="20"/>
+        </w:rPr>
+      </w:pPr>
+      <w:r>
+        <w:rPr>
+          <w:sz w:val="20"/>
+          <w:szCs w:val="20"/>
+        </w:rPr>
         <w:t xml:space="preserve"> </w:t>
       </w:r>
       <w:r>
+        <w:rPr>
+          <w:sz w:val="20"/>
+          <w:szCs w:val="20"/>
+        </w:rPr>
         <w:tab/>
       </w:r>
       <w:r>
+        <w:rPr>
+          <w:sz w:val="20"/>
+          <w:szCs w:val="20"/>
+        </w:rPr>
         <w:tab/>
-        <w:t xml:space="preserve">-&gt; </w:t>
-      </w:r>
-      <w:r>
+      </w:r>
+      <w:r>
+        <w:rPr>
+          <w:rFonts w:ascii="Montserrat" w:hAnsi="Montserrat"/>
+          <w:b/>
+          <w:bCs/>
+          <w:color w:val="5BBCB6"/>
+          <w:sz w:val="20"/>
+          <w:szCs w:val="20"/>
+        </w:rPr>
+        <w:t>-&gt;</w:t>
+      </w:r>
+      <w:r>
+        <w:rPr>
+          <w:sz w:val="20"/>
+          <w:szCs w:val="20"/>
+        </w:rPr>
+        <w:t xml:space="preserve"> </w:t>
+      </w:r>
+      <w:r>
+        <w:rPr>
+          <w:sz w:val="20"/>
+          <w:szCs w:val="20"/>
+        </w:rPr>
+        <w:t xml:space="preserve">     </w:t>
+      </w:r>
+      <w:r>
+        <w:rPr>
+          <w:sz w:val="20"/>
+          <w:szCs w:val="20"/>
+        </w:rPr>
         <w:t>Historial de pedidos anteriores</w:t>
       </w:r>
     </w:p>
     <w:p>
       <w:pPr>
-        <w:ind w:left="282" w:right="-143" w:firstLine="1134"/>
-      </w:pPr>
-      <w:r>
-        <w:t xml:space="preserve">-&gt; </w:t>
-      </w:r>
-      <w:r>
-        <w:t>Carrito de la compra actual</w:t>
-      </w:r>
-      <w:r>
-        <w:t xml:space="preserve"> -&gt; </w:t>
-      </w:r>
-      <w:r>
+        <w:ind w:left="282" w:right="-427" w:firstLine="1134"/>
+        <w:rPr>
+          <w:sz w:val="20"/>
+          <w:szCs w:val="20"/>
+        </w:rPr>
+      </w:pPr>
+      <w:r>
+        <w:rPr>
+          <w:rFonts w:ascii="Montserrat" w:hAnsi="Montserrat"/>
+          <w:b/>
+          <w:bCs/>
+          <w:color w:val="5BBCB6"/>
+          <w:sz w:val="20"/>
+          <w:szCs w:val="20"/>
+        </w:rPr>
+        <w:t>-&gt;</w:t>
+      </w:r>
+      <w:r>
+        <w:rPr>
+          <w:b/>
+          <w:bCs/>
+          <w:color w:val="5BBCB6"/>
+          <w:sz w:val="20"/>
+          <w:szCs w:val="20"/>
+        </w:rPr>
+        <w:t xml:space="preserve"> </w:t>
+      </w:r>
+      <w:r>
+        <w:rPr>
+          <w:sz w:val="20"/>
+          <w:szCs w:val="20"/>
+        </w:rPr>
+        <w:t xml:space="preserve">     </w:t>
+      </w:r>
+      <w:r>
+        <w:rPr>
+          <w:sz w:val="20"/>
+          <w:szCs w:val="20"/>
+        </w:rPr>
+        <w:t xml:space="preserve">Carrito de la compra actual </w:t>
+      </w:r>
+      <w:r>
+        <w:rPr>
+          <w:sz w:val="20"/>
+          <w:szCs w:val="20"/>
+        </w:rPr>
+        <w:t xml:space="preserve">   </w:t>
+      </w:r>
+      <w:r>
+        <w:rPr>
+          <w:b/>
+          <w:bCs/>
+          <w:color w:val="5BBCB6"/>
+          <w:sz w:val="20"/>
+          <w:szCs w:val="20"/>
+        </w:rPr>
+        <w:t xml:space="preserve">  </w:t>
+      </w:r>
+      <w:r>
+        <w:rPr>
+          <w:rFonts w:ascii="Montserrat" w:hAnsi="Montserrat"/>
+          <w:b/>
+          <w:bCs/>
+          <w:color w:val="5BBCB6"/>
+          <w:sz w:val="20"/>
+          <w:szCs w:val="20"/>
+        </w:rPr>
+        <w:t>-&gt;</w:t>
+      </w:r>
+      <w:r>
+        <w:rPr>
+          <w:color w:val="5BBCB6"/>
+          <w:sz w:val="20"/>
+          <w:szCs w:val="20"/>
+        </w:rPr>
+        <w:t xml:space="preserve">     </w:t>
+      </w:r>
+      <w:r>
+        <w:rPr>
+          <w:color w:val="5BBCB6"/>
+          <w:sz w:val="20"/>
+          <w:szCs w:val="20"/>
+        </w:rPr>
+        <w:t xml:space="preserve"> </w:t>
+      </w:r>
+      <w:r>
+        <w:rPr>
+          <w:sz w:val="20"/>
+          <w:szCs w:val="20"/>
+        </w:rPr>
         <w:t>Pasarela de pago (dirección y tarjeta)</w:t>
       </w:r>
     </w:p>
     <w:p>
       <w:pPr>
-        <w:ind w:left="282" w:right="-143" w:firstLine="1134"/>
-      </w:pPr>
-      <w:r>
-        <w:t xml:space="preserve">-&gt; </w:t>
-      </w:r>
-      <w:r>
+        <w:ind w:left="282" w:right="-427" w:firstLine="1134"/>
+        <w:rPr>
+          <w:sz w:val="20"/>
+          <w:szCs w:val="20"/>
+        </w:rPr>
+      </w:pPr>
+      <w:r>
+        <w:rPr>
+          <w:rFonts w:ascii="Montserrat" w:hAnsi="Montserrat"/>
+          <w:b/>
+          <w:bCs/>
+          <w:color w:val="5BBCB6"/>
+          <w:sz w:val="20"/>
+          <w:szCs w:val="20"/>
+        </w:rPr>
+        <w:t>-&gt;</w:t>
+      </w:r>
+      <w:r>
+        <w:rPr>
+          <w:rFonts w:ascii="Montserrat" w:hAnsi="Montserrat"/>
+          <w:sz w:val="20"/>
+          <w:szCs w:val="20"/>
+        </w:rPr>
+        <w:t xml:space="preserve"> </w:t>
+      </w:r>
+      <w:r>
+        <w:rPr>
+          <w:sz w:val="20"/>
+          <w:szCs w:val="20"/>
+        </w:rPr>
+        <w:t xml:space="preserve">     </w:t>
+      </w:r>
+      <w:r>
+        <w:rPr>
+          <w:sz w:val="20"/>
+          <w:szCs w:val="20"/>
+        </w:rPr>
         <w:t>Perfil de usuario</w:t>
       </w:r>
       <w:r>
-        <w:t xml:space="preserve"> -&gt; </w:t>
-      </w:r>
-      <w:r>
+        <w:rPr>
+          <w:sz w:val="20"/>
+          <w:szCs w:val="20"/>
+        </w:rPr>
+        <w:t xml:space="preserve"> </w:t>
+      </w:r>
+      <w:r>
+        <w:rPr>
+          <w:sz w:val="20"/>
+          <w:szCs w:val="20"/>
+        </w:rPr>
+        <w:t xml:space="preserve">    </w:t>
+      </w:r>
+      <w:r>
+        <w:rPr>
+          <w:rFonts w:ascii="Montserrat" w:hAnsi="Montserrat"/>
+          <w:sz w:val="20"/>
+          <w:szCs w:val="20"/>
+        </w:rPr>
+        <w:t xml:space="preserve"> </w:t>
+      </w:r>
+      <w:r>
+        <w:rPr>
+          <w:rFonts w:ascii="Montserrat" w:hAnsi="Montserrat"/>
+          <w:b/>
+          <w:bCs/>
+          <w:color w:val="5BBCB6"/>
+          <w:sz w:val="20"/>
+          <w:szCs w:val="20"/>
+        </w:rPr>
+        <w:t>-&gt;</w:t>
+      </w:r>
+      <w:r>
+        <w:rPr>
+          <w:sz w:val="20"/>
+          <w:szCs w:val="20"/>
+        </w:rPr>
+        <w:t xml:space="preserve"> </w:t>
+      </w:r>
+      <w:r>
+        <w:rPr>
+          <w:sz w:val="20"/>
+          <w:szCs w:val="20"/>
+        </w:rPr>
+        <w:t xml:space="preserve">     </w:t>
+      </w:r>
+      <w:r>
+        <w:rPr>
+          <w:sz w:val="20"/>
+          <w:szCs w:val="20"/>
+        </w:rPr>
         <w:t>Centro de soporte y chat con atención al cliente</w:t>
       </w:r>
     </w:p>
     <w:p>
       <w:pPr>
-        <w:ind w:left="-426" w:right="-143" w:firstLine="0"/>
-      </w:pPr>
-      <w:r>
+        <w:ind w:left="-426" w:right="-427" w:firstLine="0"/>
+        <w:rPr>
+          <w:sz w:val="20"/>
+          <w:szCs w:val="20"/>
+        </w:rPr>
+      </w:pPr>
+      <w:r>
+        <w:rPr>
+          <w:sz w:val="20"/>
+          <w:szCs w:val="20"/>
+        </w:rPr>
         <w:t>Desde</w:t>
       </w:r>
       <w:r>
+        <w:rPr>
+          <w:sz w:val="20"/>
+          <w:szCs w:val="20"/>
+        </w:rPr>
         <w:t xml:space="preserve"> Pantalla principal con restaurantes</w:t>
       </w:r>
       <w:r>
-        <w:t xml:space="preserve"> -&gt; </w:t>
-      </w:r>
-      <w:r>
+        <w:rPr>
+          <w:sz w:val="20"/>
+          <w:szCs w:val="20"/>
+        </w:rPr>
+        <w:t xml:space="preserve"> </w:t>
+      </w:r>
+      <w:r>
+        <w:rPr>
+          <w:sz w:val="20"/>
+          <w:szCs w:val="20"/>
+        </w:rPr>
+        <w:t xml:space="preserve">    </w:t>
+      </w:r>
+      <w:r>
+        <w:rPr>
+          <w:rFonts w:ascii="Montserrat" w:hAnsi="Montserrat"/>
+          <w:sz w:val="20"/>
+          <w:szCs w:val="20"/>
+        </w:rPr>
+        <w:t xml:space="preserve"> </w:t>
+      </w:r>
+      <w:r>
+        <w:rPr>
+          <w:rFonts w:ascii="Montserrat" w:hAnsi="Montserrat"/>
+          <w:b/>
+          <w:bCs/>
+          <w:color w:val="5BBCB6"/>
+          <w:sz w:val="20"/>
+          <w:szCs w:val="20"/>
+        </w:rPr>
+        <w:t>-&gt;</w:t>
+      </w:r>
+      <w:r>
+        <w:rPr>
+          <w:sz w:val="20"/>
+          <w:szCs w:val="20"/>
+        </w:rPr>
+        <w:t xml:space="preserve">     </w:t>
+      </w:r>
+      <w:r>
+        <w:rPr>
+          <w:sz w:val="20"/>
+          <w:szCs w:val="20"/>
+        </w:rPr>
+        <w:t xml:space="preserve"> </w:t>
+      </w:r>
+      <w:r>
+        <w:rPr>
+          <w:sz w:val="20"/>
+          <w:szCs w:val="20"/>
+        </w:rPr>
         <w:t>Ficha de detalle del restaurante (menú y valoraciones)</w:t>
       </w:r>
     </w:p>
     <w:p>
       <w:pPr>
-        <w:ind w:left="-426" w:right="-143" w:firstLine="0"/>
+        <w:ind w:left="-426" w:right="-427" w:firstLine="0"/>
       </w:pPr>
     </w:p>
     <w:p>
       <w:pPr>
         <w:pStyle w:val="Ttulo2"/>
+        <w:ind w:left="-709" w:right="-427"/>
       </w:pPr>
       <w:bookmarkStart w:id="10" w:name="_Toc240331170"/>
       <w:r>
-        <w:t>3</w:t>
-      </w:r>
-      <w:r>
-        <w:t>.2</w:t>
+        <w:t>3.2</w:t>
       </w:r>
       <w:r>
         <w:tab/>
@@ -2972,51 +4757,307 @@
     </w:p>
     <w:p>
       <w:pPr>
-        <w:ind w:left="-426" w:right="-143" w:firstLine="0"/>
-      </w:pPr>
-      <w:r>
-        <w:t>Diagrama resultante de la agrupación y priorización:</w:t>
-      </w:r>
-    </w:p>
-    <w:p>
-      <w:pPr>
-        <w:ind w:left="-426" w:right="-143" w:firstLine="0"/>
-      </w:pPr>
-      <w:r>
+        <w:ind w:left="-426" w:right="-427" w:firstLine="426"/>
+      </w:pPr>
+      <w:r>
+        <w:rPr>
+          <w:b/>
+          <w:bCs/>
+        </w:rPr>
+        <w:t>Diagrama</w:t>
+      </w:r>
+      <w:r>
+        <w:t xml:space="preserve"> resultante de la agrupación y priorización</w:t>
+      </w:r>
+      <w:r>
+        <w:t>.</w:t>
+      </w:r>
+    </w:p>
+    <w:p>
+      <w:pPr>
+        <w:ind w:left="-426" w:right="-427" w:firstLine="0"/>
+      </w:pPr>
+      <w:r>
+        <w:t>------------------------------------------------------------------------Diagrama</w:t>
+      </w:r>
+    </w:p>
+    <w:p>
+      <w:pPr>
+        <w:ind w:left="-426" w:right="-427" w:firstLine="0"/>
+      </w:pPr>
+    </w:p>
+    <w:p>
+      <w:pPr>
+        <w:pStyle w:val="Ttulo2"/>
+        <w:numPr>
+          <w:ilvl w:val="1"/>
+          <w:numId w:val="8"/>
+        </w:numPr>
+        <w:ind w:right="-427"/>
+      </w:pPr>
+      <w:bookmarkStart w:id="11" w:name="_Toc240331171"/>
+      <w:r>
+        <w:t xml:space="preserve">      </w:t>
+      </w:r>
+      <w:r>
+        <w:t>Adaptación tecnológica y Justificación del Menú</w:t>
+      </w:r>
+      <w:bookmarkEnd w:id="11"/>
+    </w:p>
+    <w:p>
+      <w:pPr>
+        <w:ind w:right="-427" w:firstLine="0"/>
+      </w:pPr>
+      <w:r>
+        <w:t>Elección del menú principal en base al dispositivo utilizado.</w:t>
+      </w:r>
+    </w:p>
+    <w:p>
+      <w:pPr>
+        <w:ind w:right="-427" w:firstLine="0"/>
+      </w:pPr>
+    </w:p>
+    <w:p>
+      <w:pPr>
+        <w:ind w:left="-426" w:right="-427" w:firstLine="0"/>
+      </w:pPr>
+      <w:r>
+        <w:t xml:space="preserve">Si se desarrolla como </w:t>
+      </w:r>
+      <w:r>
+        <w:rPr>
+          <w:b/>
+          <w:bCs/>
+        </w:rPr>
+        <w:t>App Móvil Nativa</w:t>
+      </w:r>
+      <w:r>
+        <w:t>:</w:t>
+      </w:r>
+    </w:p>
+    <w:p>
+      <w:pPr>
+        <w:ind w:left="-426" w:right="-427" w:firstLine="0"/>
+        <w:rPr>
+          <w:sz w:val="20"/>
+          <w:szCs w:val="20"/>
+        </w:rPr>
+      </w:pPr>
+      <w:r>
+        <w:rPr>
+          <w:b/>
+          <w:bCs/>
+        </w:rPr>
+        <w:t>Menú elegido:</w:t>
+      </w:r>
+      <w:r>
+        <w:tab/>
+      </w:r>
+      <w:r>
+        <w:tab/>
+      </w:r>
+      <w:r>
+        <w:rPr>
+          <w:sz w:val="20"/>
+          <w:szCs w:val="20"/>
+        </w:rPr>
+        <w:t xml:space="preserve">Barra de Navegación Inferior (Bottom </w:t>
+      </w:r>
+      <w:proofErr w:type="spellStart"/>
+      <w:r>
+        <w:rPr>
+          <w:sz w:val="20"/>
+          <w:szCs w:val="20"/>
+        </w:rPr>
+        <w:t>Navigation</w:t>
+      </w:r>
+      <w:proofErr w:type="spellEnd"/>
+      <w:r>
+        <w:rPr>
+          <w:sz w:val="20"/>
+          <w:szCs w:val="20"/>
+        </w:rPr>
+        <w:t>).</w:t>
+      </w:r>
+    </w:p>
+    <w:p>
+      <w:pPr>
+        <w:ind w:left="2124" w:right="-427" w:hanging="2550"/>
+        <w:rPr>
+          <w:sz w:val="20"/>
+          <w:szCs w:val="20"/>
+        </w:rPr>
+      </w:pPr>
+      <w:r>
+        <w:rPr>
+          <w:b/>
+          <w:bCs/>
+        </w:rPr>
         <w:lastRenderedPageBreak/>
-        <w:t>------------------------------------------------------------------------Diagrama</w:t>
-      </w:r>
-    </w:p>
-    <w:p>
-      <w:pPr>
-        <w:ind w:left="-426" w:right="-143" w:firstLine="0"/>
-      </w:pPr>
-    </w:p>
-    <w:p>
-      <w:pPr>
-        <w:pStyle w:val="Ttulo2"/>
-      </w:pPr>
-      <w:bookmarkStart w:id="11" w:name="_Toc240331171"/>
-      <w:r>
-        <w:t>3</w:t>
-      </w:r>
-      <w:r>
-        <w:t>.3</w:t>
+        <w:t>¿Por qué?:</w:t>
       </w:r>
       <w:r>
         <w:tab/>
-        <w:t>Adaptación tecnológica y Justificación del Menú</w:t>
-      </w:r>
-      <w:bookmarkEnd w:id="11"/>
-    </w:p>
-    <w:p>
-      <w:pPr>
-        <w:ind w:left="-426" w:right="-143" w:firstLine="0"/>
-      </w:pPr>
-    </w:p>
-    <w:p>
-      <w:pPr>
-        <w:ind w:left="-426" w:right="-143" w:firstLine="0"/>
+      </w:r>
+      <w:r>
+        <w:rPr>
+          <w:sz w:val="20"/>
+          <w:szCs w:val="20"/>
+        </w:rPr>
+        <w:t>Siendo</w:t>
+      </w:r>
+      <w:r>
+        <w:rPr>
+          <w:sz w:val="20"/>
+          <w:szCs w:val="20"/>
+        </w:rPr>
+        <w:t xml:space="preserve"> una </w:t>
+      </w:r>
+      <w:proofErr w:type="gramStart"/>
+      <w:r>
+        <w:rPr>
+          <w:sz w:val="20"/>
+          <w:szCs w:val="20"/>
+        </w:rPr>
+        <w:t>app</w:t>
+      </w:r>
+      <w:proofErr w:type="gramEnd"/>
+      <w:r>
+        <w:rPr>
+          <w:sz w:val="20"/>
+          <w:szCs w:val="20"/>
+        </w:rPr>
+        <w:t xml:space="preserve"> móvil de </w:t>
+      </w:r>
+      <w:r>
+        <w:rPr>
+          <w:sz w:val="20"/>
+          <w:szCs w:val="20"/>
+        </w:rPr>
+        <w:t>comida a domicilio</w:t>
+      </w:r>
+      <w:r>
+        <w:rPr>
+          <w:sz w:val="20"/>
+          <w:szCs w:val="20"/>
+        </w:rPr>
+        <w:t xml:space="preserve">, </w:t>
+      </w:r>
+      <w:r>
+        <w:rPr>
+          <w:sz w:val="20"/>
+          <w:szCs w:val="20"/>
+        </w:rPr>
+        <w:t>podemos deducir que se usa frecuentemente con un tiempo estimado bastante corto, ya que se quiere pedir comida y cuanto más se tarde en realizar el pedido más se demora la entrega</w:t>
+      </w:r>
+      <w:r>
+        <w:rPr>
+          <w:sz w:val="20"/>
+          <w:szCs w:val="20"/>
+        </w:rPr>
+        <w:t xml:space="preserve">. Situando la barra de menú en la zona inferior, damos accesibilidad a las opciones clave del menú en la zona de confort del pulgar, para así, </w:t>
+      </w:r>
+      <w:r>
+        <w:rPr>
+          <w:sz w:val="20"/>
+          <w:szCs w:val="20"/>
+        </w:rPr>
+        <w:t>agilizar el tiempo de usabilidad</w:t>
+      </w:r>
+      <w:r>
+        <w:rPr>
+          <w:sz w:val="20"/>
+          <w:szCs w:val="20"/>
+        </w:rPr>
+        <w:t>.</w:t>
+      </w:r>
+    </w:p>
+    <w:p>
+      <w:pPr>
+        <w:ind w:left="2124" w:right="-427" w:hanging="2550"/>
+      </w:pPr>
+      <w:r>
+        <w:rPr>
+          <w:b/>
+          <w:bCs/>
+        </w:rPr>
+        <w:t>Secciones en el menú:</w:t>
+      </w:r>
+      <w:r>
+        <w:tab/>
+      </w:r>
+      <w:r>
+        <w:rPr>
+          <w:sz w:val="20"/>
+          <w:szCs w:val="20"/>
+        </w:rPr>
+        <w:t xml:space="preserve">Buscador de </w:t>
+      </w:r>
+      <w:r>
+        <w:rPr>
+          <w:sz w:val="20"/>
+          <w:szCs w:val="20"/>
+        </w:rPr>
+        <w:t>platos por tipo de cocina</w:t>
+      </w:r>
+      <w:r>
+        <w:rPr>
+          <w:sz w:val="20"/>
+          <w:szCs w:val="20"/>
+        </w:rPr>
+        <w:t xml:space="preserve">, </w:t>
+      </w:r>
+      <w:r>
+        <w:rPr>
+          <w:sz w:val="20"/>
+          <w:szCs w:val="20"/>
+        </w:rPr>
+        <w:t>Historial de pedidos anteriores, Carrito de la compra actual</w:t>
+      </w:r>
+      <w:r>
+        <w:rPr>
+          <w:sz w:val="20"/>
+          <w:szCs w:val="20"/>
+        </w:rPr>
+        <w:t xml:space="preserve"> y </w:t>
+      </w:r>
+      <w:r>
+        <w:rPr>
+          <w:sz w:val="20"/>
+          <w:szCs w:val="20"/>
+        </w:rPr>
+        <w:t>Perfil de usuario</w:t>
+      </w:r>
+      <w:r>
+        <w:rPr>
+          <w:sz w:val="20"/>
+          <w:szCs w:val="20"/>
+        </w:rPr>
+        <w:t xml:space="preserve"> </w:t>
+      </w:r>
+      <w:r>
+        <w:rPr>
+          <w:sz w:val="20"/>
+          <w:szCs w:val="20"/>
+        </w:rPr>
+        <w:t>son las opciones incluidas en la barra inferior de navegación</w:t>
+      </w:r>
+      <w:r>
+        <w:rPr>
+          <w:sz w:val="20"/>
+          <w:szCs w:val="20"/>
+        </w:rPr>
+        <w:t>.</w:t>
+      </w:r>
+    </w:p>
+    <w:p>
+      <w:pPr>
+        <w:ind w:left="-426" w:right="-427" w:firstLine="0"/>
+      </w:pPr>
+    </w:p>
+    <w:p>
+      <w:pPr>
+        <w:ind w:left="-426" w:right="-427" w:firstLine="0"/>
       </w:pPr>
       <w:r>
         <w:t xml:space="preserve">Si se desarrolla como </w:t>
@@ -3026,7 +5067,7 @@
           <w:b/>
           <w:bCs/>
         </w:rPr>
-        <w:t>App Móvil Nativa</w:t>
+        <w:t>Aplicación Web</w:t>
       </w:r>
       <w:r>
         <w:t>:</w:t>
@@ -3034,233 +5075,219 @@
     </w:p>
     <w:p>
       <w:pPr>
-        <w:ind w:left="-426" w:right="-143" w:firstLine="0"/>
-      </w:pPr>
-      <w:r>
+        <w:ind w:left="2124" w:right="-427" w:hanging="2550"/>
+        <w:rPr>
+          <w:sz w:val="20"/>
+          <w:szCs w:val="20"/>
+        </w:rPr>
+      </w:pPr>
+      <w:r>
+        <w:rPr>
+          <w:b/>
+          <w:bCs/>
+        </w:rPr>
         <w:t>Menú elegido:</w:t>
       </w:r>
       <w:r>
         <w:tab/>
       </w:r>
       <w:r>
+        <w:rPr>
+          <w:sz w:val="20"/>
+          <w:szCs w:val="20"/>
+        </w:rPr>
+        <w:t>Barra de Navegación Superior (Top Bar).</w:t>
+      </w:r>
+    </w:p>
+    <w:p>
+      <w:pPr>
+        <w:ind w:left="2124" w:right="-427" w:hanging="2550"/>
+      </w:pPr>
+      <w:r>
+        <w:rPr>
+          <w:b/>
+          <w:bCs/>
+        </w:rPr>
+        <w:t>¿Por qué?:</w:t>
+      </w:r>
+      <w:r>
         <w:tab/>
-        <w:t xml:space="preserve">Barra de Navegación Inferior (Bottom </w:t>
-      </w:r>
-      <w:proofErr w:type="spellStart"/>
-      <w:r>
-        <w:t>Navigation</w:t>
-      </w:r>
-      <w:proofErr w:type="spellEnd"/>
-      <w:r>
-        <w:t>).</w:t>
-      </w:r>
-    </w:p>
-    <w:p>
-      <w:pPr>
-        <w:ind w:left="2124" w:right="-143" w:hanging="2550"/>
-      </w:pPr>
-      <w:r>
-        <w:t>¿Por qué?:</w:t>
+      </w:r>
+      <w:r>
+        <w:rPr>
+          <w:sz w:val="20"/>
+          <w:szCs w:val="20"/>
+        </w:rPr>
+        <w:t>En el entorno web de escritorio</w:t>
+      </w:r>
+      <w:r>
+        <w:rPr>
+          <w:sz w:val="20"/>
+          <w:szCs w:val="20"/>
+        </w:rPr>
+        <w:t xml:space="preserve">, por su mayor </w:t>
+      </w:r>
+      <w:r>
+        <w:rPr>
+          <w:sz w:val="20"/>
+          <w:szCs w:val="20"/>
+        </w:rPr>
+        <w:t xml:space="preserve">espacio en el nivel </w:t>
+      </w:r>
+      <w:r>
+        <w:rPr>
+          <w:sz w:val="20"/>
+          <w:szCs w:val="20"/>
+        </w:rPr>
+        <w:t>de navegación principal, incluiremos</w:t>
+      </w:r>
+      <w:r>
+        <w:rPr>
+          <w:sz w:val="20"/>
+          <w:szCs w:val="20"/>
+        </w:rPr>
+        <w:t xml:space="preserve"> desplegables, </w:t>
+      </w:r>
+      <w:r>
+        <w:rPr>
+          <w:sz w:val="20"/>
+          <w:szCs w:val="20"/>
+        </w:rPr>
+        <w:t>que nos dan vistazos a los subniveles</w:t>
+      </w:r>
+      <w:r>
+        <w:rPr>
+          <w:sz w:val="20"/>
+          <w:szCs w:val="20"/>
+        </w:rPr>
+        <w:t>. Incluso</w:t>
+      </w:r>
+      <w:r>
+        <w:rPr>
+          <w:sz w:val="20"/>
+          <w:szCs w:val="20"/>
+        </w:rPr>
+        <w:t xml:space="preserve"> podemos agrandar las opciones o mostrar recomendado</w:t>
+      </w:r>
+      <w:r>
+        <w:rPr>
+          <w:sz w:val="20"/>
+          <w:szCs w:val="20"/>
+        </w:rPr>
+        <w:t>s</w:t>
+      </w:r>
+      <w:r>
+        <w:rPr>
+          <w:sz w:val="20"/>
+          <w:szCs w:val="20"/>
+        </w:rPr>
+        <w:t>.</w:t>
+      </w:r>
+    </w:p>
+    <w:p>
+      <w:pPr>
+        <w:ind w:left="2124" w:right="-427" w:hanging="2550"/>
+        <w:rPr>
+          <w:sz w:val="20"/>
+          <w:szCs w:val="20"/>
+        </w:rPr>
+      </w:pPr>
+      <w:r>
+        <w:rPr>
+          <w:b/>
+          <w:bCs/>
+        </w:rPr>
+        <w:t>Secciones en el menú:</w:t>
       </w:r>
       <w:r>
         <w:tab/>
       </w:r>
       <w:r>
-        <w:t>Siendo</w:t>
-      </w:r>
-      <w:r>
-        <w:t xml:space="preserve"> una </w:t>
-      </w:r>
-      <w:proofErr w:type="gramStart"/>
-      <w:r>
-        <w:t>app</w:t>
-      </w:r>
-      <w:proofErr w:type="gramEnd"/>
-      <w:r>
-        <w:t xml:space="preserve"> móvil de </w:t>
-      </w:r>
-      <w:r>
-        <w:t>comida a domicilio</w:t>
-      </w:r>
-      <w:r>
+        <w:rPr>
+          <w:sz w:val="20"/>
+          <w:szCs w:val="20"/>
+        </w:rPr>
+        <w:t xml:space="preserve">Buscador de </w:t>
+      </w:r>
+      <w:r>
+        <w:rPr>
+          <w:sz w:val="20"/>
+          <w:szCs w:val="20"/>
+        </w:rPr>
+        <w:t>platos por tipo de cocina (con un recomendado del día)</w:t>
+      </w:r>
+      <w:r>
+        <w:rPr>
+          <w:sz w:val="20"/>
+          <w:szCs w:val="20"/>
+        </w:rPr>
         <w:t xml:space="preserve">, </w:t>
       </w:r>
       <w:r>
-        <w:t>podemos deducir que se usa frecuentemente con un tiempo estimado bastante corto, ya que se quiere pedir comida y cuanto más se tarde en realizar el pedido más se demora la entrega</w:t>
-      </w:r>
-      <w:r>
-        <w:t xml:space="preserve">. Situando la barra de menú en la zona inferior, damos accesibilidad a las opciones clave del menú en la zona de confort del pulgar, para así, </w:t>
-      </w:r>
-      <w:r>
-        <w:t>agilizar el tiempo de usabilidad</w:t>
-      </w:r>
-      <w:r>
+        <w:rPr>
+          <w:sz w:val="20"/>
+          <w:szCs w:val="20"/>
+        </w:rPr>
+        <w:t xml:space="preserve">Historial de pedidos anteriores (con la </w:t>
+      </w:r>
+      <w:r>
+        <w:rPr>
+          <w:sz w:val="20"/>
+          <w:szCs w:val="20"/>
+        </w:rPr>
+        <w:t>opción de último pedido</w:t>
+      </w:r>
+      <w:r>
+        <w:rPr>
+          <w:sz w:val="20"/>
+          <w:szCs w:val="20"/>
+        </w:rPr>
+        <w:t xml:space="preserve"> resaltada), Carrito de la compra actual</w:t>
+      </w:r>
+      <w:r>
+        <w:rPr>
+          <w:sz w:val="20"/>
+          <w:szCs w:val="20"/>
+        </w:rPr>
+        <w:t xml:space="preserve"> y </w:t>
+      </w:r>
+      <w:r>
+        <w:rPr>
+          <w:sz w:val="20"/>
+          <w:szCs w:val="20"/>
+        </w:rPr>
+        <w:t>Perfil de usuario</w:t>
+      </w:r>
+      <w:r>
+        <w:rPr>
+          <w:sz w:val="20"/>
+          <w:szCs w:val="20"/>
+        </w:rPr>
+        <w:t xml:space="preserve"> </w:t>
+      </w:r>
+      <w:r>
+        <w:rPr>
+          <w:sz w:val="20"/>
+          <w:szCs w:val="20"/>
+        </w:rPr>
+        <w:t>seguirán incluyendo la barra superior de navegación con sus desplegables como opción web</w:t>
+      </w:r>
+      <w:r>
+        <w:rPr>
+          <w:sz w:val="20"/>
+          <w:szCs w:val="20"/>
+        </w:rPr>
         <w:t>.</w:t>
       </w:r>
     </w:p>
     <w:p>
       <w:pPr>
-        <w:ind w:left="2124" w:right="-143" w:hanging="2550"/>
-      </w:pPr>
-      <w:r>
-        <w:t>Secciones en el menú:</w:t>
-      </w:r>
-      <w:r>
-        <w:tab/>
-        <w:t xml:space="preserve">Buscador de </w:t>
-      </w:r>
-      <w:r>
-        <w:t>platos por tipo de cocina</w:t>
-      </w:r>
-      <w:r>
-        <w:t xml:space="preserve">, </w:t>
-      </w:r>
-      <w:r>
-        <w:t xml:space="preserve">Historial de pedidos anteriores, </w:t>
-      </w:r>
-      <w:r>
-        <w:t>Carrito de la compra actual</w:t>
-      </w:r>
-      <w:r>
-        <w:t xml:space="preserve"> y </w:t>
-      </w:r>
-      <w:r>
-        <w:t>Perfil de usuario</w:t>
-      </w:r>
-      <w:r>
-        <w:t xml:space="preserve"> </w:t>
-      </w:r>
-      <w:r>
-        <w:t>son las opciones incluidas en la barra inferior de navegación</w:t>
-      </w:r>
-      <w:r>
-        <w:t>.</w:t>
-      </w:r>
-    </w:p>
-    <w:p>
-      <w:pPr>
-        <w:ind w:left="-426" w:right="-143" w:firstLine="0"/>
-      </w:pPr>
-    </w:p>
-    <w:p>
-      <w:pPr>
-        <w:ind w:left="-426" w:right="-143" w:firstLine="0"/>
-      </w:pPr>
-      <w:r>
-        <w:t xml:space="preserve">Si se desarrolla como </w:t>
-      </w:r>
-      <w:r>
-        <w:rPr>
-          <w:b/>
-          <w:bCs/>
-        </w:rPr>
-        <w:t>Aplicación Web</w:t>
-      </w:r>
-      <w:r>
-        <w:t>:</w:t>
-      </w:r>
-    </w:p>
-    <w:p>
-      <w:pPr>
-        <w:ind w:left="2124" w:right="-143" w:hanging="2550"/>
-      </w:pPr>
-      <w:r>
-        <w:t>Menú elegido:</w:t>
-      </w:r>
-      <w:r>
-        <w:tab/>
-        <w:t>Barra de Navegación Superior (Top Bar).</w:t>
-      </w:r>
-    </w:p>
-    <w:p>
-      <w:pPr>
-        <w:ind w:left="2124" w:right="-143" w:hanging="2550"/>
-      </w:pPr>
-      <w:r>
-        <w:t>¿Por qué?:</w:t>
-      </w:r>
-      <w:r>
-        <w:tab/>
-        <w:t>En el entorno web de escritorio</w:t>
-      </w:r>
-      <w:r>
-        <w:t xml:space="preserve">, por su mayor </w:t>
-      </w:r>
-      <w:r>
-        <w:t xml:space="preserve">espacio en el nivel </w:t>
-      </w:r>
-      <w:r>
-        <w:t>de navegación principal, incluiremos</w:t>
-      </w:r>
-      <w:r>
-        <w:t xml:space="preserve"> desplegables, </w:t>
-      </w:r>
-      <w:r>
-        <w:t>que nos dan vistazos a los subniveles</w:t>
-      </w:r>
-      <w:r>
-        <w:t>. Incluso</w:t>
-      </w:r>
-      <w:r>
-        <w:t xml:space="preserve"> podemos agrandar las opciones o mostrar recomendado</w:t>
-      </w:r>
-      <w:r>
-        <w:t>s</w:t>
-      </w:r>
-      <w:r>
-        <w:t>.</w:t>
-      </w:r>
-    </w:p>
-    <w:p>
-      <w:pPr>
-        <w:ind w:left="2124" w:right="-143" w:hanging="2550"/>
-      </w:pPr>
-      <w:r>
-        <w:t>Secciones en el menú:</w:t>
-      </w:r>
-      <w:r>
-        <w:tab/>
-        <w:t xml:space="preserve">Buscador de </w:t>
-      </w:r>
-      <w:r>
-        <w:t>platos por tipo de cocina (con un recomendado del día)</w:t>
-      </w:r>
-      <w:r>
-        <w:t xml:space="preserve">, </w:t>
-      </w:r>
-      <w:r>
-        <w:t xml:space="preserve">Historial de pedidos anteriores (con la </w:t>
-      </w:r>
-      <w:r>
-        <w:t>opción de último pedido</w:t>
-      </w:r>
-      <w:r>
-        <w:t xml:space="preserve"> resaltada), Carrito de la compra actual</w:t>
-      </w:r>
-      <w:r>
-        <w:t xml:space="preserve"> y </w:t>
-      </w:r>
-      <w:r>
-        <w:t>Perfil de usuario</w:t>
-      </w:r>
-      <w:r>
-        <w:t xml:space="preserve"> </w:t>
-      </w:r>
-      <w:r>
-        <w:t>seguirán incluyendo la barra superior de navegación con sus desplegables como opción web</w:t>
-      </w:r>
-      <w:r>
-        <w:t>.</w:t>
-      </w:r>
-    </w:p>
-    <w:p>
-      <w:pPr>
-        <w:ind w:left="2124" w:right="-143" w:hanging="2550"/>
-      </w:pPr>
-    </w:p>
-    <w:p>
-      <w:pPr>
-        <w:ind w:firstLine="0"/>
+        <w:ind w:left="2124" w:right="-427" w:hanging="2550"/>
+      </w:pPr>
+    </w:p>
+    <w:p>
+      <w:pPr>
+        <w:ind w:right="-427" w:firstLine="0"/>
         <w:rPr>
           <w:i/>
         </w:rPr>
@@ -3270,15 +5297,19 @@
     <w:p>
       <w:pPr>
         <w:pStyle w:val="Ttulo3"/>
-        <w:ind w:left="-284" w:right="-143"/>
+        <w:ind w:left="-284" w:right="-427"/>
         <w:rPr>
           <w:rStyle w:val="nfasisintenso"/>
+          <w:sz w:val="20"/>
+          <w:szCs w:val="20"/>
         </w:rPr>
       </w:pPr>
       <w:bookmarkStart w:id="13" w:name="_Toc240331172"/>
       <w:r>
         <w:rPr>
           <w:rStyle w:val="nfasisintenso"/>
+          <w:sz w:val="20"/>
+          <w:szCs w:val="20"/>
         </w:rPr>
         <w:t>Fuentes y referencias</w:t>
       </w:r>
@@ -3290,44 +5321,58 @@
         <w:pStyle w:val="Cita"/>
         <w:spacing w:before="0" w:line="240" w:lineRule="auto"/>
         <w:ind w:left="-426" w:right="-427" w:firstLine="0"/>
+        <w:rPr>
+          <w:lang w:val="en-GB"/>
+        </w:rPr>
       </w:pPr>
       <w:proofErr w:type="spellStart"/>
       <w:r>
+        <w:rPr>
+          <w:lang w:val="en-GB"/>
+        </w:rPr>
         <w:t>A</w:t>
       </w:r>
       <w:r>
+        <w:rPr>
+          <w:lang w:val="en-GB"/>
+        </w:rPr>
         <w:t>ule</w:t>
       </w:r>
       <w:r>
+        <w:rPr>
+          <w:lang w:val="en-GB"/>
+        </w:rPr>
         <w:t>s</w:t>
       </w:r>
       <w:proofErr w:type="spellEnd"/>
       <w:r>
+        <w:rPr>
+          <w:lang w:val="en-GB"/>
+        </w:rPr>
         <w:t xml:space="preserve"> </w:t>
       </w:r>
       <w:r>
+        <w:rPr>
+          <w:lang w:val="en-GB"/>
+        </w:rPr>
         <w:t xml:space="preserve">- </w:t>
       </w:r>
       <w:hyperlink r:id="rId11" w:history="1">
         <w:r>
           <w:rPr>
             <w:rStyle w:val="Hipervnculo"/>
+            <w:lang w:val="en-GB"/>
           </w:rPr>
-          <w:t>https://aules.edu.gva.es/semipresencial/pluginfile.php/4311811/mod_assign/introattachment/0/DIN_UD1_Act1_Ejemplo.pdf?forcedownload=</w:t>
-        </w:r>
-        <w:r>
-          <w:rPr>
-            <w:rStyle w:val="Hipervnculo"/>
-          </w:rPr>
-          <w:t>1</w:t>
+          <w:t>https://aules.edu.gva.es/semipresencial/pluginfile.php/4311811/mod_assign/introattachment/0/DIN_UD1_Act1_Ejemplo.pdf?forcedownload=1</w:t>
         </w:r>
       </w:hyperlink>
-      <w:r>
-        <w:t xml:space="preserve"> </w:t>
-      </w:r>
-      <w:r>
-        <w:t xml:space="preserve">· </w:t>
-      </w:r>
+    </w:p>
+    <w:p>
+      <w:pPr>
+        <w:pStyle w:val="Cita"/>
+        <w:spacing w:before="0" w:line="240" w:lineRule="auto"/>
+        <w:ind w:left="-426" w:right="-427" w:firstLine="0"/>
+      </w:pPr>
       <w:r>
         <w:t>Es</w:t>
       </w:r>
@@ -3337,7 +5382,7 @@
       <w:r>
         <w:t xml:space="preserve"> - </w:t>
       </w:r>
-      <w:hyperlink r:id="rId12" w:history="1">
+      <w:hyperlink r:id="rId12" w:anchor="anchor-1" w:history="1">
         <w:r>
           <w:rPr>
             <w:rStyle w:val="Hipervnculo"/>
@@ -3353,10 +5398,7 @@
       <w:pPr>
         <w:pStyle w:val="Cita"/>
         <w:spacing w:before="0" w:line="240" w:lineRule="auto"/>
-        <w:ind w:right="-710" w:firstLine="0"/>
-        <w:rPr>
-          <w:lang w:val="en-GB"/>
-        </w:rPr>
+        <w:ind w:right="-427" w:firstLine="0"/>
       </w:pPr>
     </w:p>
     <w:sectPr>
@@ -3986,6 +6028,119 @@
     </w:lvl>
   </w:abstractNum>
   <w:abstractNum w:abstractNumId="4" w15:restartNumberingAfterBreak="0">
+    <w:nsid w:val="378E0285"/>
+    <w:multiLevelType w:val="multilevel"/>
+    <w:tmpl w:val="89A6376C"/>
+    <w:lvl w:ilvl="0">
+      <w:start w:val="3"/>
+      <w:numFmt w:val="decimal"/>
+      <w:lvlText w:val="%1"/>
+      <w:lvlJc w:val="left"/>
+      <w:pPr>
+        <w:ind w:left="360" w:hanging="360"/>
+      </w:pPr>
+      <w:rPr>
+        <w:rFonts w:hint="default"/>
+      </w:rPr>
+    </w:lvl>
+    <w:lvl w:ilvl="1">
+      <w:start w:val="3"/>
+      <w:numFmt w:val="decimal"/>
+      <w:lvlText w:val="%1.%2"/>
+      <w:lvlJc w:val="left"/>
+      <w:pPr>
+        <w:ind w:left="-349" w:hanging="360"/>
+      </w:pPr>
+      <w:rPr>
+        <w:rFonts w:hint="default"/>
+      </w:rPr>
+    </w:lvl>
+    <w:lvl w:ilvl="2">
+      <w:start w:val="1"/>
+      <w:numFmt w:val="decimal"/>
+      <w:lvlText w:val="%1.%2.%3"/>
+      <w:lvlJc w:val="left"/>
+      <w:pPr>
+        <w:ind w:left="-698" w:hanging="720"/>
+      </w:pPr>
+      <w:rPr>
+        <w:rFonts w:hint="default"/>
+      </w:rPr>
+    </w:lvl>
+    <w:lvl w:ilvl="3">
+      <w:start w:val="1"/>
+      <w:numFmt w:val="decimal"/>
+      <w:lvlText w:val="%1.%2.%3.%4"/>
+      <w:lvlJc w:val="left"/>
+      <w:pPr>
+        <w:ind w:left="-1407" w:hanging="720"/>
+      </w:pPr>
+      <w:rPr>
+        <w:rFonts w:hint="default"/>
+      </w:rPr>
+    </w:lvl>
+    <w:lvl w:ilvl="4">
+      <w:start w:val="1"/>
+      <w:numFmt w:val="decimal"/>
+      <w:lvlText w:val="%1.%2.%3.%4.%5"/>
+      <w:lvlJc w:val="left"/>
+      <w:pPr>
+        <w:ind w:left="-1756" w:hanging="1080"/>
+      </w:pPr>
+      <w:rPr>
+        <w:rFonts w:hint="default"/>
+      </w:rPr>
+    </w:lvl>
+    <w:lvl w:ilvl="5">
+      <w:start w:val="1"/>
+      <w:numFmt w:val="decimal"/>
+      <w:lvlText w:val="%1.%2.%3.%4.%5.%6"/>
+      <w:lvlJc w:val="left"/>
+      <w:pPr>
+        <w:ind w:left="-2465" w:hanging="1080"/>
+      </w:pPr>
+      <w:rPr>
+        <w:rFonts w:hint="default"/>
+      </w:rPr>
+    </w:lvl>
+    <w:lvl w:ilvl="6">
+      <w:start w:val="1"/>
+      <w:numFmt w:val="decimal"/>
+      <w:lvlText w:val="%1.%2.%3.%4.%5.%6.%7"/>
+      <w:lvlJc w:val="left"/>
+      <w:pPr>
+        <w:ind w:left="-2814" w:hanging="1440"/>
+      </w:pPr>
+      <w:rPr>
+        <w:rFonts w:hint="default"/>
+      </w:rPr>
+    </w:lvl>
+    <w:lvl w:ilvl="7">
+      <w:start w:val="1"/>
+      <w:numFmt w:val="decimal"/>
+      <w:lvlText w:val="%1.%2.%3.%4.%5.%6.%7.%8"/>
+      <w:lvlJc w:val="left"/>
+      <w:pPr>
+        <w:ind w:left="-3523" w:hanging="1440"/>
+      </w:pPr>
+      <w:rPr>
+        <w:rFonts w:hint="default"/>
+      </w:rPr>
+    </w:lvl>
+    <w:lvl w:ilvl="8">
+      <w:start w:val="1"/>
+      <w:numFmt w:val="decimal"/>
+      <w:lvlText w:val="%1.%2.%3.%4.%5.%6.%7.%8.%9"/>
+      <w:lvlJc w:val="left"/>
+      <w:pPr>
+        <w:ind w:left="-3872" w:hanging="1800"/>
+      </w:pPr>
+      <w:rPr>
+        <w:rFonts w:hint="default"/>
+      </w:rPr>
+    </w:lvl>
+  </w:abstractNum>
+  <w:abstractNum w:abstractNumId="5" w15:restartNumberingAfterBreak="0">
     <w:nsid w:val="49532E66"/>
     <w:multiLevelType w:val="hybridMultilevel"/>
     <w:tmpl w:val="45564362"/>
@@ -4097,7 +6252,7 @@
       </w:rPr>
     </w:lvl>
   </w:abstractNum>
-  <w:abstractNum w:abstractNumId="5" w15:restartNumberingAfterBreak="0">
+  <w:abstractNum w:abstractNumId="6" w15:restartNumberingAfterBreak="0">
     <w:nsid w:val="49686EE3"/>
     <w:multiLevelType w:val="hybridMultilevel"/>
     <w:tmpl w:val="C98C9DE0"/>
@@ -4210,7 +6365,7 @@
       </w:rPr>
     </w:lvl>
   </w:abstractNum>
-  <w:abstractNum w:abstractNumId="6" w15:restartNumberingAfterBreak="0">
+  <w:abstractNum w:abstractNumId="7" w15:restartNumberingAfterBreak="0">
     <w:nsid w:val="6FF67B70"/>
     <w:multiLevelType w:val="hybridMultilevel"/>
     <w:tmpl w:val="BC3CB8C8"/>
@@ -4333,16 +6488,19 @@
     <w:abstractNumId w:val="3"/>
   </w:num>
   <w:num w:numId="4" w16cid:durableId="512502564">
-    <w:abstractNumId w:val="4"/>
+    <w:abstractNumId w:val="5"/>
   </w:num>
   <w:num w:numId="5" w16cid:durableId="1291285537">
     <w:abstractNumId w:val="1"/>
   </w:num>
   <w:num w:numId="6" w16cid:durableId="1094672336">
+    <w:abstractNumId w:val="7"/>
+  </w:num>
+  <w:num w:numId="7" w16cid:durableId="675763933">
     <w:abstractNumId w:val="6"/>
   </w:num>
-  <w:num w:numId="7" w16cid:durableId="675763933">
-    <w:abstractNumId w:val="5"/>
+  <w:num w:numId="8" w16cid:durableId="1369060841">
+    <w:abstractNumId w:val="4"/>
   </w:num>
 </w:numbering>
 </file>
@@ -5813,6 +7971,21 @@
 </file>
 
 <file path=customXml/item2.xml><?xml version="1.0" encoding="utf-8"?>
+<?mso-contentType ?>
+<FormTemplates xmlns="http://schemas.microsoft.com/sharepoint/v3/contenttype/forms">
+  <Display>DocumentLibraryForm</Display>
+  <Edit>DocumentLibraryForm</Edit>
+  <New>DocumentLibraryForm</New>
+</FormTemplates>
+</file>
+
+<file path=customXml/item3.xml><?xml version="1.0" encoding="utf-8"?>
+<p:properties xmlns:p="http://schemas.microsoft.com/office/2006/metadata/properties" xmlns:xsi="http://www.w3.org/2001/XMLSchema-instance" xmlns:pc="http://schemas.microsoft.com/office/infopath/2007/PartnerControls">
+  <documentManagement/>
+</p:properties>
+</file>
+
+<file path=customXml/item4.xml><?xml version="1.0" encoding="utf-8"?>
 <ct:contentTypeSchema xmlns:ct="http://schemas.microsoft.com/office/2006/metadata/contentType" xmlns:ma="http://schemas.microsoft.com/office/2006/metadata/properties/metaAttributes" ct:_="" ma:_="" ma:contentTypeName="Documento" ma:contentTypeID="0x010100E847573596BCB242B231189B5AEC6B57" ma:contentTypeVersion="5" ma:contentTypeDescription="Crear nuevo documento." ma:contentTypeScope="" ma:versionID="5e1dd3f328a4c753ac7136579e5e4ed6">
   <xsd:schema xmlns:xsd="http://www.w3.org/2001/XMLSchema" xmlns:xs="http://www.w3.org/2001/XMLSchema" xmlns:p="http://schemas.microsoft.com/office/2006/metadata/properties" xmlns:ns3="2f97d7bb-1d95-4f44-94c4-63279acfa932" targetNamespace="http://schemas.microsoft.com/office/2006/metadata/properties" ma:root="true" ma:fieldsID="e2a6eca137e46c22dcdb3ca86b420a18" ns3:_="">
     <xsd:import namespace="2f97d7bb-1d95-4f44-94c4-63279acfa932"/>
@@ -5962,21 +8135,6 @@
 </ct:contentTypeSchema>
 </file>
 
-<file path=customXml/item3.xml><?xml version="1.0" encoding="utf-8"?>
-<p:properties xmlns:p="http://schemas.microsoft.com/office/2006/metadata/properties" xmlns:xsi="http://www.w3.org/2001/XMLSchema-instance" xmlns:pc="http://schemas.microsoft.com/office/infopath/2007/PartnerControls">
-  <documentManagement/>
-</p:properties>
-</file>
-
-<file path=customXml/item4.xml><?xml version="1.0" encoding="utf-8"?>
-<?mso-contentType ?>
-<FormTemplates xmlns="http://schemas.microsoft.com/sharepoint/v3/contenttype/forms">
-  <Display>DocumentLibraryForm</Display>
-  <Edit>DocumentLibraryForm</Edit>
-  <New>DocumentLibraryForm</New>
-</FormTemplates>
-</file>
-
 <file path=customXml/itemProps1.xml><?xml version="1.0" encoding="utf-8"?>
 <ds:datastoreItem xmlns:ds="http://schemas.openxmlformats.org/officeDocument/2006/customXml" ds:itemID="{55AF091B-3C7A-41E3-B477-F2FDAA23CFDA}">
   <ds:schemaRefs>
@@ -5986,6 +8144,23 @@
 </file>
 
 <file path=customXml/itemProps2.xml><?xml version="1.0" encoding="utf-8"?>
+<ds:datastoreItem xmlns:ds="http://schemas.openxmlformats.org/officeDocument/2006/customXml" ds:itemID="{ED5AE9E1-EFDC-4B8D-B6B1-0A6F0BD0C7CC}">
+  <ds:schemaRefs>
+    <ds:schemaRef ds:uri="http://schemas.microsoft.com/sharepoint/v3/contenttype/forms"/>
+  </ds:schemaRefs>
+</ds:datastoreItem>
+</file>
+
+<file path=customXml/itemProps3.xml><?xml version="1.0" encoding="utf-8"?>
+<ds:datastoreItem xmlns:ds="http://schemas.openxmlformats.org/officeDocument/2006/customXml" ds:itemID="{EDFFCF16-D741-4CED-AF53-5B904CDC7B44}">
+  <ds:schemaRefs>
+    <ds:schemaRef ds:uri="http://schemas.microsoft.com/office/2006/metadata/properties"/>
+    <ds:schemaRef ds:uri="http://schemas.microsoft.com/office/infopath/2007/PartnerControls"/>
+  </ds:schemaRefs>
+</ds:datastoreItem>
+</file>
+
+<file path=customXml/itemProps4.xml><?xml version="1.0" encoding="utf-8"?>
 <ds:datastoreItem xmlns:ds="http://schemas.openxmlformats.org/officeDocument/2006/customXml" ds:itemID="{C9AB1843-5927-4416-B398-4826755EDCD1}">
   <ds:schemaRefs>
     <ds:schemaRef ds:uri="http://schemas.microsoft.com/office/2006/metadata/contentType"/>
@@ -6001,21 +8176,4 @@
     <ds:schemaRef ds:uri="http://schemas.microsoft.com/internal/obd"/>
   </ds:schemaRefs>
 </ds:datastoreItem>
-</file>
-
-<file path=customXml/itemProps3.xml><?xml version="1.0" encoding="utf-8"?>
-<ds:datastoreItem xmlns:ds="http://schemas.openxmlformats.org/officeDocument/2006/customXml" ds:itemID="{EDFFCF16-D741-4CED-AF53-5B904CDC7B44}">
-  <ds:schemaRefs>
-    <ds:schemaRef ds:uri="http://schemas.microsoft.com/office/2006/metadata/properties"/>
-    <ds:schemaRef ds:uri="http://schemas.microsoft.com/office/infopath/2007/PartnerControls"/>
-  </ds:schemaRefs>
-</ds:datastoreItem>
-</file>
-
-<file path=customXml/itemProps4.xml><?xml version="1.0" encoding="utf-8"?>
-<ds:datastoreItem xmlns:ds="http://schemas.openxmlformats.org/officeDocument/2006/customXml" ds:itemID="{ED5AE9E1-EFDC-4B8D-B6B1-0A6F0BD0C7CC}">
-  <ds:schemaRefs>
-    <ds:schemaRef ds:uri="http://schemas.microsoft.com/sharepoint/v3/contenttype/forms"/>
-  </ds:schemaRefs>
-</ds:datastoreItem>
 </file>
</xml_diff>

<commit_message>
Avance analisis apps DI 2
</commit_message>
<xml_diff>
--- a/Desarrollo_de_Interfaces/UD1_Fundamentos_y_Disenyo_de_Interfaces_de_Usuario/Análisis_3_apps.docx
+++ b/Desarrollo_de_Interfaces/UD1_Fundamentos_y_Disenyo_de_Interfaces_de_Usuario/Análisis_3_apps.docx
@@ -1069,7 +1069,7 @@
                 <w:noProof/>
                 <w:webHidden/>
               </w:rPr>
-              <w:t>7</w:t>
+              <w:t>8</w:t>
             </w:r>
             <w:r>
               <w:rPr>
@@ -1468,6 +1468,10 @@
     <w:p>
       <w:pPr>
         <w:ind w:right="-427"/>
+        <w:rPr>
+          <w:sz w:val="16"/>
+          <w:szCs w:val="16"/>
+        </w:rPr>
       </w:pPr>
     </w:p>
     <w:p>
@@ -1518,6 +1522,10 @@
     <w:p>
       <w:pPr>
         <w:ind w:left="-426" w:right="-427" w:firstLine="0"/>
+        <w:rPr>
+          <w:sz w:val="16"/>
+          <w:szCs w:val="16"/>
+        </w:rPr>
       </w:pPr>
     </w:p>
     <w:p>
@@ -1555,7 +1563,92 @@
     <w:p>
       <w:pPr>
         <w:ind w:left="-426" w:right="-427" w:firstLine="0"/>
-      </w:pPr>
+        <w:rPr>
+          <w:b/>
+          <w:bCs/>
+        </w:rPr>
+      </w:pPr>
+      <w:r>
+        <w:rPr>
+          <w:b/>
+          <w:bCs/>
+        </w:rPr>
+        <w:t>Nivel 1 (Navegación principal)</w:t>
+      </w:r>
+      <w:r>
+        <w:rPr>
+          <w:b/>
+          <w:bCs/>
+        </w:rPr>
+        <w:t>:</w:t>
+      </w:r>
+    </w:p>
+    <w:p>
+      <w:pPr>
+        <w:spacing w:after="120"/>
+        <w:ind w:left="-425" w:right="-425" w:firstLine="0"/>
+        <w:rPr>
+          <w:sz w:val="20"/>
+          <w:szCs w:val="20"/>
+        </w:rPr>
+      </w:pPr>
+      <w:r>
+        <w:rPr>
+          <w:sz w:val="20"/>
+          <w:szCs w:val="20"/>
+        </w:rPr>
+        <w:t>Panel de control principal (</w:t>
+      </w:r>
+      <w:proofErr w:type="spellStart"/>
+      <w:r>
+        <w:rPr>
+          <w:sz w:val="20"/>
+          <w:szCs w:val="20"/>
+        </w:rPr>
+        <w:t>Dashboard</w:t>
+      </w:r>
+      <w:proofErr w:type="spellEnd"/>
+      <w:r>
+        <w:rPr>
+          <w:sz w:val="20"/>
+          <w:szCs w:val="20"/>
+        </w:rPr>
+        <w:t>)</w:t>
+      </w:r>
+    </w:p>
+    <w:p>
+      <w:pPr>
+        <w:spacing w:after="120"/>
+        <w:ind w:left="-425" w:right="-425" w:firstLine="0"/>
+        <w:rPr>
+          <w:sz w:val="20"/>
+          <w:szCs w:val="20"/>
+        </w:rPr>
+      </w:pPr>
+      <w:r>
+        <w:rPr>
+          <w:sz w:val="20"/>
+          <w:szCs w:val="20"/>
+        </w:rPr>
+        <w:t>Listado de ejercicios de la rutina de hoy</w:t>
+      </w:r>
+    </w:p>
+    <w:p>
+      <w:pPr>
+        <w:spacing w:after="120"/>
+        <w:ind w:left="-425" w:right="-425" w:firstLine="0"/>
+        <w:rPr>
+          <w:sz w:val="20"/>
+          <w:szCs w:val="20"/>
+        </w:rPr>
+      </w:pPr>
+      <w:r>
+        <w:rPr>
+          <w:sz w:val="20"/>
+          <w:szCs w:val="20"/>
+        </w:rPr>
+        <w:t>Botón de “Añadir entrenamiento rápido”</w:t>
+      </w:r>
     </w:p>
     <w:p>
       <w:pPr>
@@ -1570,7 +1663,7 @@
           <w:b/>
           <w:bCs/>
         </w:rPr>
-        <w:t>Nivel 1 (Navegación principal)</w:t>
+        <w:t>Nivel 2 (Niveles Secundarios)</w:t>
       </w:r>
       <w:r>
         <w:rPr>
@@ -1582,18 +1675,19 @@
     </w:p>
     <w:p>
       <w:pPr>
-        <w:ind w:left="-426" w:right="-427" w:firstLine="0"/>
-        <w:rPr>
-          <w:sz w:val="20"/>
-          <w:szCs w:val="20"/>
-        </w:rPr>
-      </w:pPr>
-      <w:r>
-        <w:rPr>
-          <w:sz w:val="20"/>
-          <w:szCs w:val="20"/>
-        </w:rPr>
-        <w:t>Panel de control principal (</w:t>
+        <w:spacing w:after="120"/>
+        <w:ind w:left="-426" w:right="-425" w:firstLine="0"/>
+        <w:rPr>
+          <w:sz w:val="20"/>
+          <w:szCs w:val="20"/>
+        </w:rPr>
+      </w:pPr>
+      <w:r>
+        <w:rPr>
+          <w:sz w:val="20"/>
+          <w:szCs w:val="20"/>
+        </w:rPr>
+        <w:t xml:space="preserve">Desde </w:t>
       </w:r>
       <w:proofErr w:type="spellStart"/>
       <w:r>
@@ -1609,99 +1703,345 @@
           <w:sz w:val="20"/>
           <w:szCs w:val="20"/>
         </w:rPr>
+        <w:t xml:space="preserve">      </w:t>
+      </w:r>
+      <w:r>
+        <w:rPr>
+          <w:rFonts w:ascii="Montserrat" w:hAnsi="Montserrat"/>
+          <w:b/>
+          <w:bCs/>
+          <w:color w:val="5BBCB6"/>
+          <w:sz w:val="20"/>
+          <w:szCs w:val="20"/>
+        </w:rPr>
+        <w:t>-</w:t>
+      </w:r>
+      <w:r>
+        <w:rPr>
+          <w:rFonts w:ascii="Montserrat" w:hAnsi="Montserrat"/>
+          <w:b/>
+          <w:bCs/>
+          <w:color w:val="5BBCB6"/>
+          <w:sz w:val="20"/>
+          <w:szCs w:val="20"/>
+        </w:rPr>
+        <w:t>&gt;</w:t>
+      </w:r>
+      <w:r>
+        <w:rPr>
+          <w:b/>
+          <w:bCs/>
+          <w:color w:val="5BBCB6"/>
+          <w:sz w:val="20"/>
+          <w:szCs w:val="20"/>
+        </w:rPr>
+        <w:t xml:space="preserve">      </w:t>
+      </w:r>
+      <w:r>
+        <w:rPr>
+          <w:sz w:val="20"/>
+          <w:szCs w:val="20"/>
+        </w:rPr>
+        <w:t>Buscador global de recetas</w:t>
+      </w:r>
+      <w:r>
+        <w:rPr>
+          <w:sz w:val="20"/>
+          <w:szCs w:val="20"/>
+        </w:rPr>
+        <w:t xml:space="preserve">      </w:t>
+      </w:r>
+      <w:r>
+        <w:rPr>
+          <w:rFonts w:ascii="Montserrat" w:hAnsi="Montserrat"/>
+          <w:b/>
+          <w:bCs/>
+          <w:color w:val="5BBCB6"/>
+          <w:sz w:val="20"/>
+          <w:szCs w:val="20"/>
+        </w:rPr>
+        <w:t>-&gt;</w:t>
+      </w:r>
+      <w:r>
+        <w:rPr>
+          <w:b/>
+          <w:bCs/>
+          <w:color w:val="5BBCB6"/>
+          <w:sz w:val="20"/>
+          <w:szCs w:val="20"/>
+        </w:rPr>
+        <w:t xml:space="preserve">      </w:t>
+      </w:r>
+      <w:r>
+        <w:rPr>
+          <w:sz w:val="20"/>
+          <w:szCs w:val="20"/>
+        </w:rPr>
+        <w:t xml:space="preserve">Formulario para añadir comida </w:t>
+      </w:r>
+      <w:proofErr w:type="spellStart"/>
+      <w:r>
+        <w:rPr>
+          <w:sz w:val="20"/>
+          <w:szCs w:val="20"/>
+        </w:rPr>
+        <w:t>personaliz</w:t>
+      </w:r>
+      <w:proofErr w:type="spellEnd"/>
+      <w:r>
+        <w:rPr>
+          <w:sz w:val="20"/>
+          <w:szCs w:val="20"/>
+        </w:rPr>
+        <w:t>.</w:t>
+      </w:r>
+    </w:p>
+    <w:p>
+      <w:pPr>
+        <w:spacing w:after="120"/>
+        <w:ind w:left="708" w:right="-425" w:firstLine="708"/>
+        <w:rPr>
+          <w:sz w:val="20"/>
+          <w:szCs w:val="20"/>
+        </w:rPr>
+      </w:pPr>
+      <w:r>
+        <w:rPr>
+          <w:rFonts w:ascii="Montserrat" w:hAnsi="Montserrat"/>
+          <w:b/>
+          <w:bCs/>
+          <w:color w:val="5BBCB6"/>
+          <w:sz w:val="20"/>
+          <w:szCs w:val="20"/>
+        </w:rPr>
+        <w:t>-&gt;</w:t>
+      </w:r>
+      <w:r>
+        <w:rPr>
+          <w:b/>
+          <w:bCs/>
+          <w:color w:val="5BBCB6"/>
+          <w:sz w:val="20"/>
+          <w:szCs w:val="20"/>
+        </w:rPr>
+        <w:t xml:space="preserve">      </w:t>
+      </w:r>
+      <w:r>
+        <w:rPr>
+          <w:sz w:val="20"/>
+          <w:szCs w:val="20"/>
+        </w:rPr>
+        <w:t>Sección de logros y medallas</w:t>
+      </w:r>
+      <w:r>
+        <w:rPr>
+          <w:sz w:val="20"/>
+          <w:szCs w:val="20"/>
+        </w:rPr>
+        <w:t xml:space="preserve">     </w:t>
+      </w:r>
+      <w:r>
+        <w:rPr>
+          <w:rFonts w:ascii="Montserrat" w:hAnsi="Montserrat"/>
+          <w:sz w:val="20"/>
+          <w:szCs w:val="20"/>
+        </w:rPr>
+        <w:t xml:space="preserve"> </w:t>
+      </w:r>
+      <w:r>
+        <w:rPr>
+          <w:rFonts w:ascii="Montserrat" w:hAnsi="Montserrat"/>
+          <w:b/>
+          <w:bCs/>
+          <w:color w:val="5BBCB6"/>
+          <w:sz w:val="20"/>
+          <w:szCs w:val="20"/>
+        </w:rPr>
+        <w:t>-&gt;</w:t>
+      </w:r>
+      <w:r>
+        <w:rPr>
+          <w:b/>
+          <w:bCs/>
+          <w:color w:val="5BBCB6"/>
+          <w:sz w:val="20"/>
+          <w:szCs w:val="20"/>
+        </w:rPr>
+        <w:t xml:space="preserve">      </w:t>
+      </w:r>
+      <w:r>
+        <w:rPr>
+          <w:sz w:val="20"/>
+          <w:szCs w:val="20"/>
+        </w:rPr>
+        <w:t>Gráfica de evolución semanal</w:t>
+      </w:r>
+      <w:r>
+        <w:rPr>
+          <w:sz w:val="20"/>
+          <w:szCs w:val="20"/>
+        </w:rPr>
+        <w:tab/>
+      </w:r>
+    </w:p>
+    <w:p>
+      <w:pPr>
+        <w:spacing w:after="120"/>
+        <w:ind w:left="282" w:right="-425" w:firstLine="1134"/>
+        <w:rPr>
+          <w:sz w:val="20"/>
+          <w:szCs w:val="20"/>
+        </w:rPr>
+      </w:pPr>
+      <w:r>
+        <w:rPr>
+          <w:rFonts w:ascii="Montserrat" w:hAnsi="Montserrat"/>
+          <w:b/>
+          <w:bCs/>
+          <w:color w:val="5BBCB6"/>
+          <w:sz w:val="20"/>
+          <w:szCs w:val="20"/>
+        </w:rPr>
+        <w:t>-&gt;</w:t>
+      </w:r>
+      <w:r>
+        <w:rPr>
+          <w:b/>
+          <w:bCs/>
+          <w:color w:val="5BBCB6"/>
+          <w:sz w:val="20"/>
+          <w:szCs w:val="20"/>
+        </w:rPr>
+        <w:t xml:space="preserve">      </w:t>
+      </w:r>
+      <w:r>
+        <w:rPr>
+          <w:sz w:val="20"/>
+          <w:szCs w:val="20"/>
+        </w:rPr>
+        <w:t xml:space="preserve">Ajustes de la </w:t>
+      </w:r>
+      <w:proofErr w:type="gramStart"/>
+      <w:r>
+        <w:rPr>
+          <w:sz w:val="20"/>
+          <w:szCs w:val="20"/>
+        </w:rPr>
+        <w:t>app</w:t>
+      </w:r>
+      <w:proofErr w:type="gramEnd"/>
+      <w:r>
+        <w:rPr>
+          <w:sz w:val="20"/>
+          <w:szCs w:val="20"/>
+        </w:rPr>
+        <w:t xml:space="preserve">     </w:t>
+      </w:r>
+      <w:r>
+        <w:rPr>
+          <w:rFonts w:ascii="Montserrat" w:hAnsi="Montserrat"/>
+          <w:sz w:val="20"/>
+          <w:szCs w:val="20"/>
+        </w:rPr>
+        <w:t xml:space="preserve"> </w:t>
+      </w:r>
+      <w:r>
+        <w:rPr>
+          <w:rFonts w:ascii="Montserrat" w:hAnsi="Montserrat"/>
+          <w:b/>
+          <w:bCs/>
+          <w:color w:val="5BBCB6"/>
+          <w:sz w:val="20"/>
+          <w:szCs w:val="20"/>
+        </w:rPr>
+        <w:t>-&gt;</w:t>
+      </w:r>
+      <w:r>
+        <w:rPr>
+          <w:b/>
+          <w:bCs/>
+          <w:color w:val="5BBCB6"/>
+          <w:sz w:val="20"/>
+          <w:szCs w:val="20"/>
+        </w:rPr>
+        <w:t xml:space="preserve">      </w:t>
+      </w:r>
+      <w:r>
+        <w:rPr>
+          <w:sz w:val="20"/>
+          <w:szCs w:val="20"/>
+        </w:rPr>
+        <w:t>Centro de ayuda (</w:t>
+      </w:r>
+      <w:proofErr w:type="spellStart"/>
+      <w:r>
+        <w:rPr>
+          <w:sz w:val="20"/>
+          <w:szCs w:val="20"/>
+        </w:rPr>
+        <w:t>FAQs</w:t>
+      </w:r>
+      <w:proofErr w:type="spellEnd"/>
+      <w:r>
+        <w:rPr>
+          <w:sz w:val="20"/>
+          <w:szCs w:val="20"/>
+        </w:rPr>
         <w:t>)</w:t>
       </w:r>
-    </w:p>
-    <w:p>
-      <w:pPr>
-        <w:ind w:left="-426" w:right="-427" w:firstLine="0"/>
-        <w:rPr>
-          <w:sz w:val="20"/>
-          <w:szCs w:val="20"/>
-        </w:rPr>
-      </w:pPr>
-      <w:r>
-        <w:rPr>
-          <w:sz w:val="20"/>
-          <w:szCs w:val="20"/>
-        </w:rPr>
-        <w:t>Listado de ejercicios de la rutina de hoy</w:t>
-      </w:r>
-    </w:p>
-    <w:p>
-      <w:pPr>
-        <w:ind w:left="-426" w:right="-427" w:firstLine="0"/>
-        <w:rPr>
-          <w:sz w:val="20"/>
-          <w:szCs w:val="20"/>
-        </w:rPr>
-      </w:pPr>
-      <w:r>
-        <w:rPr>
-          <w:sz w:val="20"/>
-          <w:szCs w:val="20"/>
-        </w:rPr>
-        <w:t>Botón de “Añadir entrenamiento rápido”</w:t>
-      </w:r>
-    </w:p>
-    <w:p>
-      <w:pPr>
-        <w:ind w:left="-426" w:right="-427" w:firstLine="0"/>
-      </w:pPr>
-    </w:p>
-    <w:p>
-      <w:pPr>
-        <w:ind w:left="-426" w:right="-427" w:firstLine="0"/>
-        <w:rPr>
-          <w:b/>
-          <w:bCs/>
-        </w:rPr>
-      </w:pPr>
-      <w:r>
-        <w:rPr>
-          <w:b/>
-          <w:bCs/>
-        </w:rPr>
-        <w:t>Nivel 2 (Niveles Secundarios)</w:t>
-      </w:r>
-      <w:r>
-        <w:rPr>
-          <w:b/>
-          <w:bCs/>
-        </w:rPr>
-        <w:t>:</w:t>
-      </w:r>
-    </w:p>
-    <w:p>
-      <w:pPr>
-        <w:ind w:left="-426" w:right="-427" w:firstLine="0"/>
-        <w:rPr>
-          <w:sz w:val="20"/>
-          <w:szCs w:val="20"/>
-        </w:rPr>
-      </w:pPr>
-      <w:r>
-        <w:rPr>
-          <w:sz w:val="20"/>
-          <w:szCs w:val="20"/>
-        </w:rPr>
-        <w:t xml:space="preserve">Desde </w:t>
-      </w:r>
-      <w:proofErr w:type="spellStart"/>
-      <w:r>
-        <w:rPr>
-          <w:sz w:val="20"/>
-          <w:szCs w:val="20"/>
-        </w:rPr>
-        <w:t>Dashboard</w:t>
-      </w:r>
-      <w:proofErr w:type="spellEnd"/>
-      <w:r>
-        <w:rPr>
-          <w:sz w:val="20"/>
-          <w:szCs w:val="20"/>
-        </w:rPr>
-        <w:t xml:space="preserve">      </w:t>
+      <w:r>
+        <w:rPr>
+          <w:sz w:val="20"/>
+          <w:szCs w:val="20"/>
+        </w:rPr>
+        <w:t>,</w:t>
+      </w:r>
+      <w:r>
+        <w:rPr>
+          <w:sz w:val="20"/>
+          <w:szCs w:val="20"/>
+        </w:rPr>
+        <w:t xml:space="preserve"> Edición de datos personales</w:t>
+      </w:r>
+    </w:p>
+    <w:p>
+      <w:pPr>
+        <w:spacing w:after="120"/>
+        <w:ind w:left="-426" w:right="-425" w:firstLine="0"/>
+        <w:rPr>
+          <w:sz w:val="20"/>
+          <w:szCs w:val="20"/>
+        </w:rPr>
+      </w:pPr>
+      <w:r>
+        <w:rPr>
+          <w:sz w:val="20"/>
+          <w:szCs w:val="20"/>
+        </w:rPr>
+        <w:t xml:space="preserve">Desde Botón de “Añadir entrenamiento </w:t>
+      </w:r>
+      <w:proofErr w:type="gramStart"/>
+      <w:r>
+        <w:rPr>
+          <w:sz w:val="20"/>
+          <w:szCs w:val="20"/>
+        </w:rPr>
+        <w:t>rápido”</w:t>
+      </w:r>
+      <w:r>
+        <w:rPr>
+          <w:sz w:val="20"/>
+          <w:szCs w:val="20"/>
+        </w:rPr>
+        <w:t xml:space="preserve">   </w:t>
+      </w:r>
+      <w:proofErr w:type="gramEnd"/>
+      <w:r>
+        <w:rPr>
+          <w:sz w:val="20"/>
+          <w:szCs w:val="20"/>
+        </w:rPr>
+        <w:t xml:space="preserve">   </w:t>
       </w:r>
       <w:r>
         <w:rPr>
@@ -1712,7 +2052,7 @@
           <w:sz w:val="20"/>
           <w:szCs w:val="20"/>
         </w:rPr>
-        <w:t>-</w:t>
+        <w:t>-&gt;</w:t>
       </w:r>
       <w:r>
         <w:rPr>
@@ -1723,7 +2063,7 @@
           <w:sz w:val="20"/>
           <w:szCs w:val="20"/>
         </w:rPr>
-        <w:t>&gt;</w:t>
+        <w:t xml:space="preserve"> </w:t>
       </w:r>
       <w:r>
         <w:rPr>
@@ -1733,356 +2073,15 @@
           <w:sz w:val="20"/>
           <w:szCs w:val="20"/>
         </w:rPr>
-        <w:t xml:space="preserve">      </w:t>
-      </w:r>
-      <w:r>
-        <w:rPr>
-          <w:sz w:val="20"/>
-          <w:szCs w:val="20"/>
-        </w:rPr>
-        <w:t>Buscador global de recetas</w:t>
-      </w:r>
-      <w:r>
-        <w:rPr>
-          <w:sz w:val="20"/>
-          <w:szCs w:val="20"/>
-        </w:rPr>
-        <w:t xml:space="preserve">      </w:t>
-      </w:r>
-      <w:r>
-        <w:rPr>
-          <w:rFonts w:ascii="Montserrat" w:hAnsi="Montserrat"/>
-          <w:b/>
-          <w:bCs/>
-          <w:color w:val="5BBCB6"/>
-          <w:sz w:val="20"/>
-          <w:szCs w:val="20"/>
-        </w:rPr>
-        <w:t>-&gt;</w:t>
-      </w:r>
-      <w:r>
-        <w:rPr>
-          <w:b/>
-          <w:bCs/>
-          <w:color w:val="5BBCB6"/>
-          <w:sz w:val="20"/>
-          <w:szCs w:val="20"/>
-        </w:rPr>
-        <w:t xml:space="preserve">      </w:t>
-      </w:r>
-      <w:r>
-        <w:rPr>
-          <w:sz w:val="20"/>
-          <w:szCs w:val="20"/>
-        </w:rPr>
-        <w:t xml:space="preserve">Formulario para añadir comida </w:t>
-      </w:r>
-      <w:proofErr w:type="spellStart"/>
-      <w:r>
-        <w:rPr>
-          <w:sz w:val="20"/>
-          <w:szCs w:val="20"/>
-        </w:rPr>
-        <w:t>personaliz</w:t>
-      </w:r>
-      <w:proofErr w:type="spellEnd"/>
-      <w:r>
-        <w:rPr>
-          <w:sz w:val="20"/>
-          <w:szCs w:val="20"/>
-        </w:rPr>
-        <w:t>.</w:t>
-      </w:r>
-    </w:p>
-    <w:p>
-      <w:pPr>
-        <w:ind w:left="708" w:right="-427" w:firstLine="708"/>
-        <w:rPr>
-          <w:sz w:val="20"/>
-          <w:szCs w:val="20"/>
-        </w:rPr>
-      </w:pPr>
-      <w:r>
-        <w:rPr>
-          <w:rFonts w:ascii="Montserrat" w:hAnsi="Montserrat"/>
-          <w:b/>
-          <w:bCs/>
-          <w:color w:val="5BBCB6"/>
-          <w:sz w:val="20"/>
-          <w:szCs w:val="20"/>
-        </w:rPr>
-        <w:t>-&gt;</w:t>
-      </w:r>
-      <w:r>
-        <w:rPr>
-          <w:b/>
-          <w:bCs/>
-          <w:color w:val="5BBCB6"/>
-          <w:sz w:val="20"/>
-          <w:szCs w:val="20"/>
-        </w:rPr>
-        <w:t xml:space="preserve">      </w:t>
-      </w:r>
-      <w:r>
-        <w:rPr>
-          <w:sz w:val="20"/>
-          <w:szCs w:val="20"/>
-        </w:rPr>
-        <w:t>Sección de logros y medallas</w:t>
-      </w:r>
-      <w:r>
-        <w:rPr>
-          <w:sz w:val="20"/>
-          <w:szCs w:val="20"/>
-        </w:rPr>
         <w:t xml:space="preserve">     </w:t>
       </w:r>
       <w:r>
         <w:rPr>
-          <w:rFonts w:ascii="Montserrat" w:hAnsi="Montserrat"/>
-          <w:sz w:val="20"/>
-          <w:szCs w:val="20"/>
-        </w:rPr>
-        <w:t xml:space="preserve"> </w:t>
-      </w:r>
-      <w:r>
-        <w:rPr>
-          <w:rFonts w:ascii="Montserrat" w:hAnsi="Montserrat"/>
-          <w:b/>
-          <w:bCs/>
-          <w:color w:val="5BBCB6"/>
-          <w:sz w:val="20"/>
-          <w:szCs w:val="20"/>
-        </w:rPr>
-        <w:t>-&gt;</w:t>
-      </w:r>
-      <w:r>
-        <w:rPr>
-          <w:b/>
-          <w:bCs/>
-          <w:color w:val="5BBCB6"/>
-          <w:sz w:val="20"/>
-          <w:szCs w:val="20"/>
-        </w:rPr>
-        <w:t xml:space="preserve">      </w:t>
-      </w:r>
-      <w:r>
-        <w:rPr>
-          <w:sz w:val="20"/>
-          <w:szCs w:val="20"/>
-        </w:rPr>
-        <w:t>Gráfica de evolución semanal</w:t>
-      </w:r>
-      <w:r>
-        <w:rPr>
-          <w:sz w:val="20"/>
-          <w:szCs w:val="20"/>
-        </w:rPr>
-        <w:tab/>
-      </w:r>
-    </w:p>
-    <w:p>
-      <w:pPr>
-        <w:ind w:left="282" w:right="-427" w:firstLine="1134"/>
-        <w:rPr>
-          <w:sz w:val="20"/>
-          <w:szCs w:val="20"/>
-        </w:rPr>
-      </w:pPr>
-      <w:r>
-        <w:rPr>
-          <w:rFonts w:ascii="Montserrat" w:hAnsi="Montserrat"/>
-          <w:b/>
-          <w:bCs/>
-          <w:color w:val="5BBCB6"/>
-          <w:sz w:val="20"/>
-          <w:szCs w:val="20"/>
-        </w:rPr>
-        <w:lastRenderedPageBreak/>
-        <w:t>-&gt;</w:t>
-      </w:r>
-      <w:r>
-        <w:rPr>
-          <w:b/>
-          <w:bCs/>
-          <w:color w:val="5BBCB6"/>
-          <w:sz w:val="20"/>
-          <w:szCs w:val="20"/>
-        </w:rPr>
-        <w:t xml:space="preserve">      </w:t>
-      </w:r>
-      <w:r>
-        <w:rPr>
-          <w:sz w:val="20"/>
-          <w:szCs w:val="20"/>
-        </w:rPr>
-        <w:t xml:space="preserve">Ajustes de la </w:t>
-      </w:r>
-      <w:proofErr w:type="gramStart"/>
-      <w:r>
-        <w:rPr>
-          <w:sz w:val="20"/>
-          <w:szCs w:val="20"/>
-        </w:rPr>
-        <w:t>app</w:t>
-      </w:r>
-      <w:proofErr w:type="gramEnd"/>
-      <w:r>
-        <w:rPr>
-          <w:sz w:val="20"/>
-          <w:szCs w:val="20"/>
-        </w:rPr>
-        <w:t xml:space="preserve">     </w:t>
-      </w:r>
-      <w:r>
-        <w:rPr>
-          <w:rFonts w:ascii="Montserrat" w:hAnsi="Montserrat"/>
-          <w:sz w:val="20"/>
-          <w:szCs w:val="20"/>
-        </w:rPr>
-        <w:t xml:space="preserve"> </w:t>
-      </w:r>
-      <w:r>
-        <w:rPr>
-          <w:rFonts w:ascii="Montserrat" w:hAnsi="Montserrat"/>
-          <w:b/>
-          <w:bCs/>
-          <w:color w:val="5BBCB6"/>
-          <w:sz w:val="20"/>
-          <w:szCs w:val="20"/>
-        </w:rPr>
-        <w:t>-&gt;</w:t>
-      </w:r>
-      <w:r>
-        <w:rPr>
-          <w:b/>
-          <w:bCs/>
-          <w:color w:val="5BBCB6"/>
-          <w:sz w:val="20"/>
-          <w:szCs w:val="20"/>
-        </w:rPr>
-        <w:t xml:space="preserve">      </w:t>
-      </w:r>
-      <w:r>
-        <w:rPr>
-          <w:sz w:val="20"/>
-          <w:szCs w:val="20"/>
-        </w:rPr>
-        <w:t>Centro de ayuda (</w:t>
-      </w:r>
-      <w:proofErr w:type="spellStart"/>
-      <w:r>
-        <w:rPr>
-          <w:sz w:val="20"/>
-          <w:szCs w:val="20"/>
-        </w:rPr>
-        <w:t>FAQs</w:t>
-      </w:r>
-      <w:proofErr w:type="spellEnd"/>
-      <w:r>
-        <w:rPr>
-          <w:sz w:val="20"/>
-          <w:szCs w:val="20"/>
-        </w:rPr>
-        <w:t>)</w:t>
-      </w:r>
-      <w:r>
-        <w:rPr>
-          <w:sz w:val="20"/>
-          <w:szCs w:val="20"/>
-        </w:rPr>
-        <w:t>,</w:t>
-      </w:r>
-      <w:r>
-        <w:rPr>
-          <w:sz w:val="20"/>
-          <w:szCs w:val="20"/>
-        </w:rPr>
-        <w:t xml:space="preserve"> Edición de datos personales</w:t>
-      </w:r>
-    </w:p>
-    <w:p>
-      <w:pPr>
-        <w:ind w:left="-426" w:right="-427" w:firstLine="0"/>
-        <w:rPr>
-          <w:sz w:val="20"/>
-          <w:szCs w:val="20"/>
-        </w:rPr>
-      </w:pPr>
-      <w:r>
-        <w:rPr>
-          <w:sz w:val="20"/>
-          <w:szCs w:val="20"/>
-        </w:rPr>
-        <w:t xml:space="preserve">Desde Botón de “Añadir entrenamiento </w:t>
-      </w:r>
-      <w:proofErr w:type="gramStart"/>
-      <w:r>
-        <w:rPr>
-          <w:sz w:val="20"/>
-          <w:szCs w:val="20"/>
-        </w:rPr>
-        <w:t>rápido”</w:t>
-      </w:r>
-      <w:r>
-        <w:rPr>
-          <w:sz w:val="20"/>
-          <w:szCs w:val="20"/>
-        </w:rPr>
-        <w:t xml:space="preserve">   </w:t>
-      </w:r>
-      <w:proofErr w:type="gramEnd"/>
-      <w:r>
-        <w:rPr>
-          <w:sz w:val="20"/>
-          <w:szCs w:val="20"/>
-        </w:rPr>
-        <w:t xml:space="preserve">   </w:t>
-      </w:r>
-      <w:r>
-        <w:rPr>
-          <w:rFonts w:ascii="Montserrat" w:hAnsi="Montserrat"/>
-          <w:b/>
-          <w:bCs/>
-          <w:color w:val="5BBCB6"/>
-          <w:sz w:val="20"/>
-          <w:szCs w:val="20"/>
-        </w:rPr>
-        <w:t>-&gt;</w:t>
-      </w:r>
-      <w:r>
-        <w:rPr>
-          <w:rFonts w:ascii="Montserrat" w:hAnsi="Montserrat"/>
-          <w:b/>
-          <w:bCs/>
-          <w:color w:val="5BBCB6"/>
-          <w:sz w:val="20"/>
-          <w:szCs w:val="20"/>
-        </w:rPr>
-        <w:t xml:space="preserve"> </w:t>
-      </w:r>
-      <w:r>
-        <w:rPr>
-          <w:b/>
-          <w:bCs/>
-          <w:color w:val="5BBCB6"/>
-          <w:sz w:val="20"/>
-          <w:szCs w:val="20"/>
-        </w:rPr>
-        <w:t xml:space="preserve">     </w:t>
-      </w:r>
-      <w:r>
-        <w:rPr>
           <w:sz w:val="20"/>
           <w:szCs w:val="20"/>
         </w:rPr>
         <w:t>Cronómetro para entrenar</w:t>
       </w:r>
-    </w:p>
-    <w:p>
-      <w:pPr>
-        <w:ind w:left="-426" w:right="-427" w:firstLine="0"/>
-      </w:pPr>
     </w:p>
     <w:p>
       <w:pPr>
@@ -2091,6 +2090,7 @@
       </w:pPr>
       <w:bookmarkStart w:id="2" w:name="_Toc240331162"/>
       <w:r>
+        <w:lastRenderedPageBreak/>
         <w:t>1.2</w:t>
       </w:r>
       <w:r>
@@ -2122,20 +2122,76 @@
         <w:t xml:space="preserve"> resultante de la agrupación y priorización</w:t>
       </w:r>
       <w:r>
-        <w:t>.</w:t>
-      </w:r>
+        <w:t>:</w:t>
+      </w:r>
+    </w:p>
+    <w:p>
+      <w:pPr>
+        <w:ind w:left="-426" w:right="-427" w:firstLine="426"/>
+        <w:rPr>
+          <w:sz w:val="16"/>
+          <w:szCs w:val="16"/>
+        </w:rPr>
+      </w:pPr>
     </w:p>
     <w:p>
       <w:pPr>
         <w:ind w:left="-426" w:right="-427" w:firstLine="0"/>
       </w:pPr>
       <w:r>
-        <w:t>------------------------------------------------------------------------Diagrama</w:t>
+        <w:rPr>
+          <w:noProof/>
+        </w:rPr>
+        <w:drawing>
+          <wp:inline distT="0" distB="0" distL="0" distR="0" wp14:anchorId="1B6C7351" wp14:editId="269505E5">
+            <wp:extent cx="5914611" cy="5022273"/>
+            <wp:effectExtent l="0" t="0" r="0" b="6985"/>
+            <wp:docPr id="1671216037" name="Imagen 5"/>
+            <wp:cNvGraphicFramePr>
+              <a:graphicFrameLocks xmlns:a="http://schemas.openxmlformats.org/drawingml/2006/main" noChangeAspect="1"/>
+            </wp:cNvGraphicFramePr>
+            <a:graphic xmlns:a="http://schemas.openxmlformats.org/drawingml/2006/main">
+              <a:graphicData uri="http://schemas.openxmlformats.org/drawingml/2006/picture">
+                <pic:pic xmlns:pic="http://schemas.openxmlformats.org/drawingml/2006/picture">
+                  <pic:nvPicPr>
+                    <pic:cNvPr id="1671216037" name="Imagen 1671216037"/>
+                    <pic:cNvPicPr/>
+                  </pic:nvPicPr>
+                  <pic:blipFill>
+                    <a:blip r:embed="rId11">
+                      <a:extLst>
+                        <a:ext uri="{28A0092B-C50C-407E-A947-70E740481C1C}">
+                          <a14:useLocalDpi xmlns:a14="http://schemas.microsoft.com/office/drawing/2010/main" val="0"/>
+                        </a:ext>
+                      </a:extLst>
+                    </a:blip>
+                    <a:stretch>
+                      <a:fillRect/>
+                    </a:stretch>
+                  </pic:blipFill>
+                  <pic:spPr>
+                    <a:xfrm>
+                      <a:off x="0" y="0"/>
+                      <a:ext cx="5924955" cy="5031057"/>
+                    </a:xfrm>
+                    <a:prstGeom prst="rect">
+                      <a:avLst/>
+                    </a:prstGeom>
+                  </pic:spPr>
+                </pic:pic>
+              </a:graphicData>
+            </a:graphic>
+          </wp:inline>
+        </w:drawing>
       </w:r>
     </w:p>
     <w:p>
       <w:pPr>
         <w:ind w:left="-426" w:right="-427" w:firstLine="0"/>
+        <w:rPr>
+          <w:sz w:val="16"/>
+          <w:szCs w:val="16"/>
+        </w:rPr>
       </w:pPr>
     </w:p>
     <w:p>
@@ -2164,6 +2220,10 @@
     <w:p>
       <w:pPr>
         <w:ind w:left="-426" w:right="-427" w:firstLine="0"/>
+        <w:rPr>
+          <w:sz w:val="16"/>
+          <w:szCs w:val="16"/>
+        </w:rPr>
       </w:pPr>
     </w:p>
     <w:p>
@@ -2357,7 +2417,15 @@
           <w:sz w:val="20"/>
           <w:szCs w:val="20"/>
         </w:rPr>
-        <w:t xml:space="preserve"> inferior</w:t>
+        <w:t xml:space="preserve"> </w:t>
+      </w:r>
+      <w:r>
+        <w:rPr>
+          <w:sz w:val="20"/>
+          <w:szCs w:val="20"/>
+        </w:rPr>
+        <w:lastRenderedPageBreak/>
+        <w:t>inferior</w:t>
       </w:r>
       <w:r>
         <w:rPr>
@@ -2499,6 +2567,10 @@
     <w:p>
       <w:pPr>
         <w:ind w:left="-426" w:right="-427" w:firstLine="0"/>
+        <w:rPr>
+          <w:sz w:val="16"/>
+          <w:szCs w:val="16"/>
+        </w:rPr>
       </w:pPr>
     </w:p>
     <w:p>
@@ -2694,6 +2766,10 @@
     <w:p>
       <w:pPr>
         <w:ind w:left="2124" w:right="-427" w:hanging="2550"/>
+        <w:rPr>
+          <w:sz w:val="16"/>
+          <w:szCs w:val="16"/>
+        </w:rPr>
       </w:pPr>
     </w:p>
     <w:p>
@@ -2708,7 +2784,6 @@
       <w:bookmarkStart w:id="4" w:name="_Toc240331164"/>
       <w:proofErr w:type="spellStart"/>
       <w:r>
-        <w:lastRenderedPageBreak/>
         <w:t>EduRoute</w:t>
       </w:r>
       <w:proofErr w:type="spellEnd"/>
@@ -2850,6 +2925,10 @@
     <w:p>
       <w:pPr>
         <w:ind w:right="-427"/>
+        <w:rPr>
+          <w:sz w:val="16"/>
+          <w:szCs w:val="16"/>
+        </w:rPr>
       </w:pPr>
     </w:p>
     <w:p>
@@ -2892,6 +2971,10 @@
     <w:p>
       <w:pPr>
         <w:ind w:left="-426" w:right="-427" w:firstLine="0"/>
+        <w:rPr>
+          <w:sz w:val="16"/>
+          <w:szCs w:val="16"/>
+        </w:rPr>
       </w:pPr>
     </w:p>
     <w:p>
@@ -2929,7 +3012,84 @@
     <w:p>
       <w:pPr>
         <w:ind w:left="-426" w:right="-427" w:firstLine="0"/>
-      </w:pPr>
+        <w:rPr>
+          <w:b/>
+          <w:bCs/>
+        </w:rPr>
+      </w:pPr>
+      <w:r>
+        <w:rPr>
+          <w:b/>
+          <w:bCs/>
+        </w:rPr>
+        <w:t>Nivel 1 (Navegación principal)</w:t>
+      </w:r>
+      <w:r>
+        <w:rPr>
+          <w:b/>
+          <w:bCs/>
+        </w:rPr>
+        <w:t>:</w:t>
+      </w:r>
+    </w:p>
+    <w:p>
+      <w:pPr>
+        <w:spacing w:after="120"/>
+        <w:ind w:left="-425" w:right="-425" w:firstLine="0"/>
+        <w:rPr>
+          <w:sz w:val="20"/>
+          <w:szCs w:val="20"/>
+        </w:rPr>
+      </w:pPr>
+      <w:r>
+        <w:rPr>
+          <w:sz w:val="20"/>
+          <w:szCs w:val="20"/>
+        </w:rPr>
+        <w:t>Panel de control principal</w:t>
+      </w:r>
+    </w:p>
+    <w:p>
+      <w:pPr>
+        <w:spacing w:after="120"/>
+        <w:ind w:left="-425" w:right="-425" w:firstLine="0"/>
+        <w:rPr>
+          <w:sz w:val="20"/>
+          <w:szCs w:val="20"/>
+        </w:rPr>
+      </w:pPr>
+      <w:r>
+        <w:rPr>
+          <w:sz w:val="20"/>
+          <w:szCs w:val="20"/>
+        </w:rPr>
+        <w:lastRenderedPageBreak/>
+        <w:t xml:space="preserve">Listado de </w:t>
+      </w:r>
+      <w:r>
+        <w:rPr>
+          <w:sz w:val="20"/>
+          <w:szCs w:val="20"/>
+        </w:rPr>
+        <w:t>asignaturas matriculadas</w:t>
+      </w:r>
+    </w:p>
+    <w:p>
+      <w:pPr>
+        <w:spacing w:after="120"/>
+        <w:ind w:left="-425" w:right="-425" w:firstLine="0"/>
+        <w:rPr>
+          <w:sz w:val="20"/>
+          <w:szCs w:val="20"/>
+        </w:rPr>
+      </w:pPr>
+      <w:r>
+        <w:rPr>
+          <w:sz w:val="20"/>
+          <w:szCs w:val="20"/>
+        </w:rPr>
+        <w:t>Sección de proyectos en grupo (chat y tablón de tareas)</w:t>
+      </w:r>
     </w:p>
     <w:p>
       <w:pPr>
@@ -2944,7 +3104,7 @@
           <w:b/>
           <w:bCs/>
         </w:rPr>
-        <w:t>Nivel 1 (Navegación principal)</w:t>
+        <w:t>Nivel 2 (Niveles Secundarios)</w:t>
       </w:r>
       <w:r>
         <w:rPr>
@@ -2956,90 +3116,8 @@
     </w:p>
     <w:p>
       <w:pPr>
-        <w:ind w:left="-426" w:right="-427" w:firstLine="0"/>
-        <w:rPr>
-          <w:sz w:val="20"/>
-          <w:szCs w:val="20"/>
-        </w:rPr>
-      </w:pPr>
-      <w:r>
-        <w:rPr>
-          <w:sz w:val="20"/>
-          <w:szCs w:val="20"/>
-        </w:rPr>
-        <w:t>Panel de control principal</w:t>
-      </w:r>
-    </w:p>
-    <w:p>
-      <w:pPr>
-        <w:ind w:left="-426" w:right="-427" w:firstLine="0"/>
-        <w:rPr>
-          <w:sz w:val="20"/>
-          <w:szCs w:val="20"/>
-        </w:rPr>
-      </w:pPr>
-      <w:r>
-        <w:rPr>
-          <w:sz w:val="20"/>
-          <w:szCs w:val="20"/>
-        </w:rPr>
-        <w:t xml:space="preserve">Listado de </w:t>
-      </w:r>
-      <w:r>
-        <w:rPr>
-          <w:sz w:val="20"/>
-          <w:szCs w:val="20"/>
-        </w:rPr>
-        <w:t>asignaturas matriculadas</w:t>
-      </w:r>
-    </w:p>
-    <w:p>
-      <w:pPr>
-        <w:ind w:left="-426" w:right="-427" w:firstLine="0"/>
-        <w:rPr>
-          <w:sz w:val="20"/>
-          <w:szCs w:val="20"/>
-        </w:rPr>
-      </w:pPr>
-      <w:r>
-        <w:rPr>
-          <w:sz w:val="20"/>
-          <w:szCs w:val="20"/>
-        </w:rPr>
-        <w:t>Sección de proyectos en grupo (chat y tablón de tareas)</w:t>
-      </w:r>
-    </w:p>
-    <w:p>
-      <w:pPr>
-        <w:ind w:left="-426" w:right="-427" w:firstLine="0"/>
-      </w:pPr>
-    </w:p>
-    <w:p>
-      <w:pPr>
-        <w:ind w:left="-426" w:right="-427" w:firstLine="0"/>
-        <w:rPr>
-          <w:b/>
-          <w:bCs/>
-        </w:rPr>
-      </w:pPr>
-      <w:r>
-        <w:rPr>
-          <w:b/>
-          <w:bCs/>
-        </w:rPr>
-        <w:t>Nivel 2 (Niveles Secundarios)</w:t>
-      </w:r>
-      <w:r>
-        <w:rPr>
-          <w:b/>
-          <w:bCs/>
-        </w:rPr>
-        <w:t>:</w:t>
-      </w:r>
-    </w:p>
-    <w:p>
-      <w:pPr>
-        <w:ind w:left="-426" w:right="-427" w:firstLine="0"/>
+        <w:spacing w:after="120"/>
+        <w:ind w:left="-426" w:right="-425" w:firstLine="0"/>
         <w:rPr>
           <w:sz w:val="20"/>
           <w:szCs w:val="20"/>
@@ -3152,7 +3230,8 @@
     </w:p>
     <w:p>
       <w:pPr>
-        <w:ind w:left="-426" w:right="-427" w:firstLine="992"/>
+        <w:spacing w:after="120"/>
+        <w:ind w:left="-426" w:right="-425" w:firstLine="992"/>
         <w:rPr>
           <w:sz w:val="20"/>
           <w:szCs w:val="20"/>
@@ -3228,7 +3307,8 @@
     </w:p>
     <w:p>
       <w:pPr>
-        <w:ind w:left="282" w:right="-427" w:firstLine="1134"/>
+        <w:spacing w:after="120"/>
+        <w:ind w:left="282" w:right="-425" w:firstLine="1134"/>
         <w:rPr>
           <w:sz w:val="20"/>
           <w:szCs w:val="20"/>
@@ -3277,7 +3357,8 @@
     </w:p>
     <w:p>
       <w:pPr>
-        <w:ind w:left="-426" w:right="-427" w:firstLine="0"/>
+        <w:spacing w:after="120"/>
+        <w:ind w:left="-426" w:right="-425" w:firstLine="0"/>
         <w:rPr>
           <w:sz w:val="20"/>
           <w:szCs w:val="20"/>
@@ -3406,7 +3487,12 @@
     </w:p>
     <w:p>
       <w:pPr>
-        <w:ind w:left="-426" w:right="-427" w:firstLine="0"/>
+        <w:spacing w:after="120"/>
+        <w:ind w:left="-426" w:right="-425" w:firstLine="0"/>
+        <w:rPr>
+          <w:sz w:val="16"/>
+          <w:szCs w:val="16"/>
+        </w:rPr>
       </w:pPr>
     </w:p>
     <w:p>
@@ -3447,21 +3533,76 @@
         <w:t xml:space="preserve"> resultante de la agrupación y priorización</w:t>
       </w:r>
       <w:r>
-        <w:t>.</w:t>
-      </w:r>
+        <w:t>:</w:t>
+      </w:r>
+    </w:p>
+    <w:p>
+      <w:pPr>
+        <w:ind w:left="-426" w:right="-427" w:firstLine="426"/>
+        <w:rPr>
+          <w:sz w:val="16"/>
+          <w:szCs w:val="16"/>
+        </w:rPr>
+      </w:pPr>
     </w:p>
     <w:p>
       <w:pPr>
         <w:ind w:left="-426" w:right="-427" w:firstLine="0"/>
       </w:pPr>
       <w:r>
-        <w:lastRenderedPageBreak/>
-        <w:t>------------------------------------------------------------------------Diagrama</w:t>
+        <w:rPr>
+          <w:noProof/>
+        </w:rPr>
+        <w:drawing>
+          <wp:inline distT="0" distB="0" distL="0" distR="0" wp14:anchorId="293CF1F3" wp14:editId="379EDEFC">
+            <wp:extent cx="5832764" cy="4417783"/>
+            <wp:effectExtent l="0" t="0" r="0" b="1905"/>
+            <wp:docPr id="12876670" name="Imagen 6"/>
+            <wp:cNvGraphicFramePr>
+              <a:graphicFrameLocks xmlns:a="http://schemas.openxmlformats.org/drawingml/2006/main" noChangeAspect="1"/>
+            </wp:cNvGraphicFramePr>
+            <a:graphic xmlns:a="http://schemas.openxmlformats.org/drawingml/2006/main">
+              <a:graphicData uri="http://schemas.openxmlformats.org/drawingml/2006/picture">
+                <pic:pic xmlns:pic="http://schemas.openxmlformats.org/drawingml/2006/picture">
+                  <pic:nvPicPr>
+                    <pic:cNvPr id="12876670" name="Imagen 12876670"/>
+                    <pic:cNvPicPr/>
+                  </pic:nvPicPr>
+                  <pic:blipFill>
+                    <a:blip r:embed="rId12">
+                      <a:extLst>
+                        <a:ext uri="{28A0092B-C50C-407E-A947-70E740481C1C}">
+                          <a14:useLocalDpi xmlns:a14="http://schemas.microsoft.com/office/drawing/2010/main" val="0"/>
+                        </a:ext>
+                      </a:extLst>
+                    </a:blip>
+                    <a:stretch>
+                      <a:fillRect/>
+                    </a:stretch>
+                  </pic:blipFill>
+                  <pic:spPr>
+                    <a:xfrm>
+                      <a:off x="0" y="0"/>
+                      <a:ext cx="5861110" cy="4439253"/>
+                    </a:xfrm>
+                    <a:prstGeom prst="rect">
+                      <a:avLst/>
+                    </a:prstGeom>
+                  </pic:spPr>
+                </pic:pic>
+              </a:graphicData>
+            </a:graphic>
+          </wp:inline>
+        </w:drawing>
       </w:r>
     </w:p>
     <w:p>
       <w:pPr>
         <w:ind w:left="-426" w:right="-427" w:firstLine="0"/>
+        <w:rPr>
+          <w:sz w:val="16"/>
+          <w:szCs w:val="16"/>
+        </w:rPr>
       </w:pPr>
     </w:p>
     <w:p>
@@ -3484,19 +3625,327 @@
         <w:ind w:right="-427" w:firstLine="0"/>
       </w:pPr>
       <w:r>
-        <w:t>Elección del menú principal en base al dispositivo utilizado.</w:t>
+        <w:t>Elección del menú principal en base al dispositivo utilizado</w:t>
+      </w:r>
+      <w:r>
+        <w:t>.</w:t>
       </w:r>
     </w:p>
     <w:p>
       <w:pPr>
         <w:ind w:left="-426" w:right="-427" w:firstLine="0"/>
       </w:pPr>
+      <w:r>
+        <w:t xml:space="preserve">Si se desarrolla como </w:t>
+      </w:r>
+      <w:r>
+        <w:rPr>
+          <w:b/>
+          <w:bCs/>
+        </w:rPr>
+        <w:t>App Móvil Nativa</w:t>
+      </w:r>
+      <w:r>
+        <w:t>:</w:t>
+      </w:r>
     </w:p>
     <w:p>
       <w:pPr>
         <w:ind w:left="-426" w:right="-427" w:firstLine="0"/>
       </w:pPr>
       <w:r>
+        <w:rPr>
+          <w:b/>
+          <w:bCs/>
+        </w:rPr>
+        <w:lastRenderedPageBreak/>
+        <w:t>Menú elegido:</w:t>
+      </w:r>
+      <w:r>
+        <w:tab/>
+      </w:r>
+      <w:r>
+        <w:tab/>
+      </w:r>
+      <w:r>
+        <w:rPr>
+          <w:sz w:val="20"/>
+          <w:szCs w:val="20"/>
+        </w:rPr>
+        <w:t xml:space="preserve">Barra de Navegación Inferior (Bottom </w:t>
+      </w:r>
+      <w:proofErr w:type="spellStart"/>
+      <w:r>
+        <w:rPr>
+          <w:sz w:val="20"/>
+          <w:szCs w:val="20"/>
+        </w:rPr>
+        <w:t>Navigation</w:t>
+      </w:r>
+      <w:proofErr w:type="spellEnd"/>
+      <w:r>
+        <w:rPr>
+          <w:sz w:val="20"/>
+          <w:szCs w:val="20"/>
+        </w:rPr>
+        <w:t>).</w:t>
+      </w:r>
+    </w:p>
+    <w:p>
+      <w:pPr>
+        <w:ind w:left="2124" w:right="-427" w:hanging="2550"/>
+      </w:pPr>
+      <w:r>
+        <w:rPr>
+          <w:b/>
+          <w:bCs/>
+        </w:rPr>
+        <w:t>¿Por qué?:</w:t>
+      </w:r>
+      <w:r>
+        <w:tab/>
+      </w:r>
+      <w:r>
+        <w:rPr>
+          <w:sz w:val="20"/>
+          <w:szCs w:val="20"/>
+        </w:rPr>
+        <w:t>U</w:t>
+      </w:r>
+      <w:r>
+        <w:rPr>
+          <w:sz w:val="20"/>
+          <w:szCs w:val="20"/>
+        </w:rPr>
+        <w:t xml:space="preserve">na </w:t>
+      </w:r>
+      <w:proofErr w:type="gramStart"/>
+      <w:r>
+        <w:rPr>
+          <w:sz w:val="20"/>
+          <w:szCs w:val="20"/>
+        </w:rPr>
+        <w:t>app</w:t>
+      </w:r>
+      <w:proofErr w:type="gramEnd"/>
+      <w:r>
+        <w:rPr>
+          <w:sz w:val="20"/>
+          <w:szCs w:val="20"/>
+        </w:rPr>
+        <w:t xml:space="preserve"> móvil de por sí </w:t>
+      </w:r>
+      <w:r>
+        <w:rPr>
+          <w:sz w:val="20"/>
+          <w:szCs w:val="20"/>
+        </w:rPr>
+        <w:t>ya implica un</w:t>
+      </w:r>
+      <w:r>
+        <w:rPr>
+          <w:sz w:val="20"/>
+          <w:szCs w:val="20"/>
+        </w:rPr>
+        <w:t xml:space="preserve"> acceso rápido al menú, y siendo la </w:t>
+      </w:r>
+      <w:proofErr w:type="gramStart"/>
+      <w:r>
+        <w:rPr>
+          <w:sz w:val="20"/>
+          <w:szCs w:val="20"/>
+        </w:rPr>
+        <w:t>app</w:t>
+      </w:r>
+      <w:proofErr w:type="gramEnd"/>
+      <w:r>
+        <w:rPr>
+          <w:sz w:val="20"/>
+          <w:szCs w:val="20"/>
+        </w:rPr>
+        <w:t xml:space="preserve"> de </w:t>
+      </w:r>
+      <w:r>
+        <w:rPr>
+          <w:sz w:val="20"/>
+          <w:szCs w:val="20"/>
+        </w:rPr>
+        <w:t>estudios</w:t>
+      </w:r>
+      <w:r>
+        <w:rPr>
+          <w:sz w:val="20"/>
+          <w:szCs w:val="20"/>
+        </w:rPr>
+        <w:t xml:space="preserve">, </w:t>
+      </w:r>
+      <w:r>
+        <w:rPr>
+          <w:sz w:val="20"/>
+          <w:szCs w:val="20"/>
+        </w:rPr>
+        <w:t>la organización y el rápido acceso deben estar garantizados</w:t>
+      </w:r>
+      <w:r>
+        <w:rPr>
+          <w:sz w:val="20"/>
+          <w:szCs w:val="20"/>
+        </w:rPr>
+        <w:t xml:space="preserve">, </w:t>
+      </w:r>
+      <w:r>
+        <w:rPr>
+          <w:sz w:val="20"/>
+          <w:szCs w:val="20"/>
+        </w:rPr>
+        <w:t>por lo que</w:t>
+      </w:r>
+      <w:r>
+        <w:rPr>
+          <w:sz w:val="20"/>
+          <w:szCs w:val="20"/>
+        </w:rPr>
+        <w:t xml:space="preserve"> las opciones clave del menú </w:t>
+      </w:r>
+      <w:r>
+        <w:rPr>
+          <w:sz w:val="20"/>
+          <w:szCs w:val="20"/>
+        </w:rPr>
+        <w:t xml:space="preserve">ganan accesibilidad </w:t>
+      </w:r>
+      <w:r>
+        <w:rPr>
+          <w:sz w:val="20"/>
+          <w:szCs w:val="20"/>
+        </w:rPr>
+        <w:t xml:space="preserve">en la zona de </w:t>
+      </w:r>
+      <w:r>
+        <w:rPr>
+          <w:sz w:val="20"/>
+          <w:szCs w:val="20"/>
+        </w:rPr>
+        <w:t>alcance</w:t>
+      </w:r>
+      <w:r>
+        <w:rPr>
+          <w:sz w:val="20"/>
+          <w:szCs w:val="20"/>
+        </w:rPr>
+        <w:t xml:space="preserve"> </w:t>
+      </w:r>
+      <w:r>
+        <w:rPr>
+          <w:sz w:val="20"/>
+          <w:szCs w:val="20"/>
+        </w:rPr>
+        <w:t xml:space="preserve">para </w:t>
+      </w:r>
+      <w:r>
+        <w:rPr>
+          <w:sz w:val="20"/>
+          <w:szCs w:val="20"/>
+        </w:rPr>
+        <w:t>el pulgar.</w:t>
+      </w:r>
+    </w:p>
+    <w:p>
+      <w:pPr>
+        <w:ind w:left="2124" w:right="-427" w:hanging="2550"/>
+        <w:rPr>
+          <w:sz w:val="20"/>
+          <w:szCs w:val="20"/>
+        </w:rPr>
+      </w:pPr>
+      <w:r>
+        <w:rPr>
+          <w:b/>
+          <w:bCs/>
+        </w:rPr>
+        <w:t>Secciones en el menú:</w:t>
+      </w:r>
+      <w:r>
+        <w:tab/>
+      </w:r>
+      <w:r>
+        <w:rPr>
+          <w:sz w:val="20"/>
+          <w:szCs w:val="20"/>
+        </w:rPr>
+        <w:t xml:space="preserve">Buscador </w:t>
+      </w:r>
+      <w:r>
+        <w:rPr>
+          <w:sz w:val="20"/>
+          <w:szCs w:val="20"/>
+        </w:rPr>
+        <w:t>general de apuntes</w:t>
+      </w:r>
+      <w:r>
+        <w:rPr>
+          <w:sz w:val="20"/>
+          <w:szCs w:val="20"/>
+        </w:rPr>
+        <w:t xml:space="preserve">, </w:t>
+      </w:r>
+      <w:r>
+        <w:rPr>
+          <w:sz w:val="20"/>
+          <w:szCs w:val="20"/>
+        </w:rPr>
+        <w:t>Perfil de usuario</w:t>
+      </w:r>
+      <w:r>
+        <w:rPr>
+          <w:sz w:val="20"/>
+          <w:szCs w:val="20"/>
+        </w:rPr>
+        <w:t xml:space="preserve"> y Ajustes de la Ap</w:t>
+      </w:r>
+      <w:r>
+        <w:rPr>
+          <w:sz w:val="20"/>
+          <w:szCs w:val="20"/>
+        </w:rPr>
+        <w:t>licación</w:t>
+      </w:r>
+      <w:r>
+        <w:rPr>
+          <w:sz w:val="20"/>
+          <w:szCs w:val="20"/>
+        </w:rPr>
+        <w:t xml:space="preserve"> </w:t>
+      </w:r>
+      <w:r>
+        <w:rPr>
+          <w:sz w:val="20"/>
+          <w:szCs w:val="20"/>
+        </w:rPr>
+        <w:t>conforman la barra de navegación</w:t>
+      </w:r>
+      <w:r>
+        <w:rPr>
+          <w:sz w:val="20"/>
+          <w:szCs w:val="20"/>
+        </w:rPr>
+        <w:t>.</w:t>
+      </w:r>
+    </w:p>
+    <w:p>
+      <w:pPr>
+        <w:ind w:left="-426" w:right="-427" w:firstLine="0"/>
+        <w:rPr>
+          <w:sz w:val="16"/>
+          <w:szCs w:val="16"/>
+        </w:rPr>
+      </w:pPr>
+    </w:p>
+    <w:p>
+      <w:pPr>
+        <w:ind w:left="-426" w:right="-427" w:firstLine="0"/>
+      </w:pPr>
+      <w:r>
         <w:t xml:space="preserve">Si se desarrolla como </w:t>
       </w:r>
       <w:r>
@@ -3504,7 +3953,7 @@
           <w:b/>
           <w:bCs/>
         </w:rPr>
-        <w:t>App Móvil Nativa</w:t>
+        <w:t>Aplicación Web</w:t>
       </w:r>
       <w:r>
         <w:t>:</w:t>
@@ -3512,7 +3961,7 @@
     </w:p>
     <w:p>
       <w:pPr>
-        <w:ind w:left="-426" w:right="-427" w:firstLine="0"/>
+        <w:ind w:left="2124" w:right="-427" w:hanging="2550"/>
       </w:pPr>
       <w:r>
         <w:rPr>
@@ -3525,6 +3974,33 @@
         <w:tab/>
       </w:r>
       <w:r>
+        <w:rPr>
+          <w:sz w:val="20"/>
+          <w:szCs w:val="20"/>
+        </w:rPr>
+        <w:t>Barra de Navegación Superior (Top Bar).</w:t>
+      </w:r>
+    </w:p>
+    <w:p>
+      <w:pPr>
+        <w:ind w:left="2124" w:right="-427" w:hanging="2550"/>
+        <w:rPr>
+          <w:sz w:val="20"/>
+          <w:szCs w:val="20"/>
+        </w:rPr>
+      </w:pPr>
+      <w:r>
+        <w:rPr>
+          <w:b/>
+          <w:bCs/>
+        </w:rPr>
+        <w:t>¿Por qué?:</w:t>
+      </w:r>
+      <w:r>
+        <w:rPr>
+          <w:b/>
+          <w:bCs/>
+        </w:rPr>
         <w:tab/>
       </w:r>
       <w:r>
@@ -3532,23 +4008,35 @@
           <w:sz w:val="20"/>
           <w:szCs w:val="20"/>
         </w:rPr>
-        <w:t xml:space="preserve">Barra de Navegación Inferior (Bottom </w:t>
-      </w:r>
-      <w:proofErr w:type="spellStart"/>
-      <w:r>
-        <w:rPr>
-          <w:sz w:val="20"/>
-          <w:szCs w:val="20"/>
-        </w:rPr>
-        <w:t>Navigation</w:t>
-      </w:r>
-      <w:proofErr w:type="spellEnd"/>
-      <w:r>
-        <w:rPr>
-          <w:sz w:val="20"/>
-          <w:szCs w:val="20"/>
-        </w:rPr>
-        <w:t>).</w:t>
+        <w:t xml:space="preserve">Gracias al mayor espacio que ofrece </w:t>
+      </w:r>
+      <w:r>
+        <w:rPr>
+          <w:sz w:val="20"/>
+          <w:szCs w:val="20"/>
+        </w:rPr>
+        <w:t>el entorno web</w:t>
+      </w:r>
+      <w:r>
+        <w:rPr>
+          <w:sz w:val="20"/>
+          <w:szCs w:val="20"/>
+        </w:rPr>
+        <w:t xml:space="preserve">, </w:t>
+      </w:r>
+      <w:r>
+        <w:rPr>
+          <w:sz w:val="20"/>
+          <w:szCs w:val="20"/>
+        </w:rPr>
+        <w:t>la barra de navegación puede situarse en la parte superior, agrandando las opciones o transformando el acceso a los subniveles mediante desplegables</w:t>
+      </w:r>
+      <w:r>
+        <w:rPr>
+          <w:sz w:val="20"/>
+          <w:szCs w:val="20"/>
+        </w:rPr>
+        <w:t>.</w:t>
       </w:r>
     </w:p>
     <w:p>
@@ -3560,7 +4048,7 @@
           <w:b/>
           <w:bCs/>
         </w:rPr>
-        <w:t>¿Por qué?:</w:t>
+        <w:t>Secciones en el menú:</w:t>
       </w:r>
       <w:r>
         <w:tab/>
@@ -3570,67 +4058,14 @@
           <w:sz w:val="20"/>
           <w:szCs w:val="20"/>
         </w:rPr>
-        <w:t>U</w:t>
-      </w:r>
-      <w:r>
-        <w:rPr>
-          <w:sz w:val="20"/>
-          <w:szCs w:val="20"/>
-        </w:rPr>
-        <w:t xml:space="preserve">na </w:t>
-      </w:r>
-      <w:proofErr w:type="gramStart"/>
-      <w:r>
-        <w:rPr>
-          <w:sz w:val="20"/>
-          <w:szCs w:val="20"/>
-        </w:rPr>
-        <w:t>app</w:t>
-      </w:r>
-      <w:proofErr w:type="gramEnd"/>
-      <w:r>
-        <w:rPr>
-          <w:sz w:val="20"/>
-          <w:szCs w:val="20"/>
-        </w:rPr>
-        <w:t xml:space="preserve"> móvil de por sí </w:t>
-      </w:r>
-      <w:r>
-        <w:rPr>
-          <w:sz w:val="20"/>
-          <w:szCs w:val="20"/>
-        </w:rPr>
-        <w:t>ya implica un</w:t>
-      </w:r>
-      <w:r>
-        <w:rPr>
-          <w:sz w:val="20"/>
-          <w:szCs w:val="20"/>
-        </w:rPr>
-        <w:t xml:space="preserve"> acceso rápido al menú, y siendo la </w:t>
-      </w:r>
-      <w:proofErr w:type="gramStart"/>
-      <w:r>
-        <w:rPr>
-          <w:sz w:val="20"/>
-          <w:szCs w:val="20"/>
-        </w:rPr>
-        <w:t>app</w:t>
-      </w:r>
-      <w:proofErr w:type="gramEnd"/>
-      <w:r>
-        <w:rPr>
-          <w:sz w:val="20"/>
-          <w:szCs w:val="20"/>
-        </w:rPr>
-        <w:t xml:space="preserve"> de </w:t>
-      </w:r>
-      <w:r>
-        <w:rPr>
-          <w:sz w:val="20"/>
-          <w:szCs w:val="20"/>
-        </w:rPr>
-        <w:t>estudios</w:t>
+        <w:t xml:space="preserve">Buscador </w:t>
+      </w:r>
+      <w:r>
+        <w:rPr>
+          <w:sz w:val="20"/>
+          <w:szCs w:val="20"/>
+        </w:rPr>
+        <w:t>general de apuntes (con espacio para mostrar quizás los últimos apuntes buscados)</w:t>
       </w:r>
       <w:r>
         <w:rPr>
@@ -3644,145 +4079,35 @@
           <w:sz w:val="20"/>
           <w:szCs w:val="20"/>
         </w:rPr>
-        <w:t>la organización y el rápido acceso deben estar garantizados</w:t>
-      </w:r>
-      <w:r>
-        <w:rPr>
-          <w:sz w:val="20"/>
-          <w:szCs w:val="20"/>
-        </w:rPr>
-        <w:t xml:space="preserve">, </w:t>
-      </w:r>
-      <w:r>
-        <w:rPr>
-          <w:sz w:val="20"/>
-          <w:szCs w:val="20"/>
-        </w:rPr>
-        <w:t>por lo que</w:t>
-      </w:r>
-      <w:r>
-        <w:rPr>
-          <w:sz w:val="20"/>
-          <w:szCs w:val="20"/>
-        </w:rPr>
-        <w:t xml:space="preserve"> las opciones clave del menú </w:t>
-      </w:r>
-      <w:r>
-        <w:rPr>
-          <w:sz w:val="20"/>
-          <w:szCs w:val="20"/>
-        </w:rPr>
-        <w:t xml:space="preserve">ganan accesibilidad </w:t>
-      </w:r>
-      <w:r>
-        <w:rPr>
-          <w:sz w:val="20"/>
-          <w:szCs w:val="20"/>
-        </w:rPr>
-        <w:t xml:space="preserve">en la zona de </w:t>
-      </w:r>
-      <w:r>
-        <w:rPr>
-          <w:sz w:val="20"/>
-          <w:szCs w:val="20"/>
-        </w:rPr>
-        <w:t>alcance</w:t>
-      </w:r>
-      <w:r>
-        <w:rPr>
-          <w:sz w:val="20"/>
-          <w:szCs w:val="20"/>
-        </w:rPr>
-        <w:t xml:space="preserve"> </w:t>
-      </w:r>
-      <w:r>
-        <w:rPr>
-          <w:sz w:val="20"/>
-          <w:szCs w:val="20"/>
-        </w:rPr>
-        <w:t xml:space="preserve">para </w:t>
-      </w:r>
-      <w:r>
-        <w:rPr>
-          <w:sz w:val="20"/>
-          <w:szCs w:val="20"/>
-        </w:rPr>
-        <w:t>el pulgar.</w:t>
-      </w:r>
-    </w:p>
-    <w:p>
-      <w:pPr>
-        <w:ind w:left="2124" w:right="-427" w:hanging="2550"/>
-        <w:rPr>
-          <w:sz w:val="20"/>
-          <w:szCs w:val="20"/>
-        </w:rPr>
-      </w:pPr>
-      <w:r>
-        <w:rPr>
-          <w:b/>
-          <w:bCs/>
-        </w:rPr>
-        <w:t>Secciones en el menú:</w:t>
-      </w:r>
-      <w:r>
-        <w:tab/>
-      </w:r>
-      <w:r>
-        <w:rPr>
-          <w:sz w:val="20"/>
-          <w:szCs w:val="20"/>
-        </w:rPr>
-        <w:t xml:space="preserve">Buscador </w:t>
-      </w:r>
-      <w:r>
-        <w:rPr>
-          <w:sz w:val="20"/>
-          <w:szCs w:val="20"/>
-        </w:rPr>
-        <w:t>general de apuntes</w:t>
-      </w:r>
-      <w:r>
-        <w:rPr>
-          <w:sz w:val="20"/>
-          <w:szCs w:val="20"/>
-        </w:rPr>
-        <w:t xml:space="preserve">, </w:t>
-      </w:r>
-      <w:r>
-        <w:rPr>
-          <w:sz w:val="20"/>
-          <w:szCs w:val="20"/>
-        </w:rPr>
-        <w:t>Perfil de usuario</w:t>
-      </w:r>
-      <w:r>
-        <w:rPr>
-          <w:sz w:val="20"/>
-          <w:szCs w:val="20"/>
-        </w:rPr>
-        <w:t xml:space="preserve"> y Ajustes de la Ap</w:t>
-      </w:r>
-      <w:r>
-        <w:rPr>
-          <w:sz w:val="20"/>
-          <w:szCs w:val="20"/>
-        </w:rPr>
-        <w:t>licación</w:t>
-      </w:r>
-      <w:r>
-        <w:rPr>
-          <w:sz w:val="20"/>
-          <w:szCs w:val="20"/>
-        </w:rPr>
-        <w:t xml:space="preserve"> </w:t>
-      </w:r>
-      <w:r>
-        <w:rPr>
-          <w:sz w:val="20"/>
-          <w:szCs w:val="20"/>
-        </w:rPr>
-        <w:t>conforman la barra de navegación</w:t>
+        <w:t>Perfil de usuario con desplegable</w:t>
+      </w:r>
+      <w:r>
+        <w:rPr>
+          <w:sz w:val="20"/>
+          <w:szCs w:val="20"/>
+        </w:rPr>
+        <w:t xml:space="preserve"> y Ajustes de la a</w:t>
+      </w:r>
+      <w:r>
+        <w:rPr>
+          <w:sz w:val="20"/>
+          <w:szCs w:val="20"/>
+        </w:rPr>
+        <w:t>plicación</w:t>
+      </w:r>
+      <w:r>
+        <w:rPr>
+          <w:sz w:val="20"/>
+          <w:szCs w:val="20"/>
+        </w:rPr>
+        <w:t xml:space="preserve"> forma</w:t>
+      </w:r>
+      <w:r>
+        <w:rPr>
+          <w:sz w:val="20"/>
+          <w:szCs w:val="20"/>
+        </w:rPr>
+        <w:t>n la barra superior de navegación</w:t>
       </w:r>
       <w:r>
         <w:rPr>
@@ -3794,193 +4119,11 @@
     </w:p>
     <w:p>
       <w:pPr>
-        <w:ind w:left="-426" w:right="-427" w:firstLine="0"/>
-      </w:pPr>
-    </w:p>
-    <w:p>
-      <w:pPr>
-        <w:ind w:left="-426" w:right="-427" w:firstLine="0"/>
-      </w:pPr>
-      <w:r>
-        <w:t xml:space="preserve">Si se desarrolla como </w:t>
-      </w:r>
-      <w:r>
-        <w:rPr>
-          <w:b/>
-          <w:bCs/>
-        </w:rPr>
-        <w:t>Aplicación Web</w:t>
-      </w:r>
-      <w:r>
-        <w:t>:</w:t>
-      </w:r>
-    </w:p>
-    <w:p>
-      <w:pPr>
-        <w:ind w:left="2124" w:right="-427" w:hanging="2550"/>
-      </w:pPr>
-      <w:r>
-        <w:rPr>
-          <w:b/>
-          <w:bCs/>
-        </w:rPr>
-        <w:t>Menú elegido:</w:t>
-      </w:r>
-      <w:r>
-        <w:tab/>
-      </w:r>
-      <w:r>
-        <w:rPr>
-          <w:sz w:val="20"/>
-          <w:szCs w:val="20"/>
-        </w:rPr>
-        <w:t>Barra de Navegación Superior (Top Bar).</w:t>
-      </w:r>
-    </w:p>
-    <w:p>
-      <w:pPr>
-        <w:ind w:left="2124" w:right="-427" w:hanging="2550"/>
-        <w:rPr>
-          <w:sz w:val="20"/>
-          <w:szCs w:val="20"/>
-        </w:rPr>
-      </w:pPr>
-      <w:r>
-        <w:rPr>
-          <w:b/>
-          <w:bCs/>
-        </w:rPr>
-        <w:t>¿Por qué?:</w:t>
-      </w:r>
-      <w:r>
-        <w:rPr>
-          <w:b/>
-          <w:bCs/>
-        </w:rPr>
-        <w:tab/>
-      </w:r>
-      <w:r>
-        <w:rPr>
-          <w:sz w:val="20"/>
-          <w:szCs w:val="20"/>
-        </w:rPr>
-        <w:t xml:space="preserve">Gracias al mayor espacio que ofrece </w:t>
-      </w:r>
-      <w:r>
-        <w:rPr>
-          <w:sz w:val="20"/>
-          <w:szCs w:val="20"/>
-        </w:rPr>
-        <w:t>el entorno web</w:t>
-      </w:r>
-      <w:r>
-        <w:rPr>
-          <w:sz w:val="20"/>
-          <w:szCs w:val="20"/>
-        </w:rPr>
-        <w:t xml:space="preserve">, </w:t>
-      </w:r>
-      <w:r>
-        <w:rPr>
-          <w:sz w:val="20"/>
-          <w:szCs w:val="20"/>
-        </w:rPr>
-        <w:t>la barra de navegación puede situarse en la parte superior, agrandando las opciones o transformando el acceso a los subniveles mediante desplegables</w:t>
-      </w:r>
-      <w:r>
-        <w:rPr>
-          <w:sz w:val="20"/>
-          <w:szCs w:val="20"/>
-        </w:rPr>
-        <w:t>.</w:t>
-      </w:r>
-    </w:p>
-    <w:p>
-      <w:pPr>
-        <w:ind w:left="2124" w:right="-427" w:hanging="2550"/>
-      </w:pPr>
-      <w:r>
-        <w:rPr>
-          <w:b/>
-          <w:bCs/>
-        </w:rPr>
-        <w:t>Secciones en el menú:</w:t>
-      </w:r>
-      <w:r>
-        <w:tab/>
-      </w:r>
-      <w:r>
-        <w:rPr>
-          <w:sz w:val="20"/>
-          <w:szCs w:val="20"/>
-        </w:rPr>
-        <w:t xml:space="preserve">Buscador </w:t>
-      </w:r>
-      <w:r>
-        <w:rPr>
-          <w:sz w:val="20"/>
-          <w:szCs w:val="20"/>
-        </w:rPr>
-        <w:t>general de apuntes (con espacio para mostrar quizás los últimos apuntes buscados)</w:t>
-      </w:r>
-      <w:r>
-        <w:rPr>
-          <w:sz w:val="20"/>
-          <w:szCs w:val="20"/>
-        </w:rPr>
-        <w:t xml:space="preserve">, </w:t>
-      </w:r>
-      <w:r>
-        <w:rPr>
-          <w:sz w:val="20"/>
-          <w:szCs w:val="20"/>
-        </w:rPr>
-        <w:t>Perfil de usuario con desplegable</w:t>
-      </w:r>
-      <w:r>
-        <w:rPr>
-          <w:sz w:val="20"/>
-          <w:szCs w:val="20"/>
-        </w:rPr>
-        <w:t xml:space="preserve"> y Ajustes de la a</w:t>
-      </w:r>
-      <w:r>
-        <w:rPr>
-          <w:sz w:val="20"/>
-          <w:szCs w:val="20"/>
-        </w:rPr>
-        <w:t>plicación</w:t>
-      </w:r>
-      <w:r>
-        <w:rPr>
-          <w:sz w:val="20"/>
-          <w:szCs w:val="20"/>
-        </w:rPr>
-        <w:t xml:space="preserve"> forma</w:t>
-      </w:r>
-      <w:r>
-        <w:rPr>
-          <w:sz w:val="20"/>
-          <w:szCs w:val="20"/>
-        </w:rPr>
-        <w:t>n la barra superior de navegación</w:t>
-      </w:r>
-      <w:r>
-        <w:rPr>
-          <w:sz w:val="20"/>
-          <w:szCs w:val="20"/>
-        </w:rPr>
-        <w:t>.</w:t>
-      </w:r>
-    </w:p>
-    <w:p>
-      <w:pPr>
-        <w:ind w:left="2124" w:right="-427" w:hanging="2550"/>
-      </w:pPr>
-    </w:p>
-    <w:p>
-      <w:pPr>
-        <w:ind w:left="2124" w:right="-427" w:hanging="2550"/>
+        <w:ind w:right="-427" w:firstLine="0"/>
+        <w:rPr>
+          <w:sz w:val="16"/>
+          <w:szCs w:val="16"/>
+        </w:rPr>
       </w:pPr>
     </w:p>
     <w:p>
@@ -4136,7 +4279,6 @@
         <w:ind w:right="-427"/>
       </w:pPr>
       <w:r>
-        <w:lastRenderedPageBreak/>
         <w:t>Centro de</w:t>
       </w:r>
       <w:r>
@@ -4146,6 +4288,10 @@
     <w:p>
       <w:pPr>
         <w:ind w:right="-427"/>
+        <w:rPr>
+          <w:sz w:val="16"/>
+          <w:szCs w:val="16"/>
+        </w:rPr>
       </w:pPr>
     </w:p>
     <w:p>
@@ -4191,545 +4337,554 @@
     <w:p>
       <w:pPr>
         <w:ind w:left="-426" w:right="-427" w:firstLine="0"/>
-      </w:pPr>
+        <w:rPr>
+          <w:sz w:val="16"/>
+          <w:szCs w:val="16"/>
+        </w:rPr>
+      </w:pPr>
+    </w:p>
+    <w:p>
+      <w:pPr>
+        <w:spacing w:before="120"/>
+        <w:ind w:left="-425" w:right="-425" w:firstLine="0"/>
+        <w:rPr>
+          <w:b/>
+          <w:bCs/>
+        </w:rPr>
+      </w:pPr>
+      <w:r>
+        <w:rPr>
+          <w:b/>
+          <w:bCs/>
+        </w:rPr>
+        <w:t>Nivel 0 (Acceso):</w:t>
+      </w:r>
     </w:p>
     <w:p>
       <w:pPr>
         <w:ind w:left="-426" w:right="-427" w:firstLine="0"/>
         <w:rPr>
-          <w:b/>
-          <w:bCs/>
-        </w:rPr>
-      </w:pPr>
-      <w:r>
-        <w:rPr>
-          <w:b/>
-          <w:bCs/>
-        </w:rPr>
-        <w:t>Nivel 0 (Acceso):</w:t>
+          <w:sz w:val="20"/>
+          <w:szCs w:val="20"/>
+        </w:rPr>
+      </w:pPr>
+      <w:r>
+        <w:rPr>
+          <w:sz w:val="20"/>
+          <w:szCs w:val="20"/>
+        </w:rPr>
+        <w:t>Pantalla de acceso y registro</w:t>
+      </w:r>
+    </w:p>
+    <w:p>
+      <w:pPr>
+        <w:spacing w:before="120"/>
+        <w:ind w:left="-425" w:right="-425" w:firstLine="0"/>
+        <w:rPr>
+          <w:b/>
+          <w:bCs/>
+        </w:rPr>
+      </w:pPr>
+      <w:r>
+        <w:rPr>
+          <w:b/>
+          <w:bCs/>
+        </w:rPr>
+        <w:lastRenderedPageBreak/>
+        <w:t>Nivel 1 (Navegación principal)</w:t>
+      </w:r>
+      <w:r>
+        <w:rPr>
+          <w:b/>
+          <w:bCs/>
+        </w:rPr>
+        <w:t>:</w:t>
+      </w:r>
+    </w:p>
+    <w:p>
+      <w:pPr>
+        <w:spacing w:after="120"/>
+        <w:ind w:left="-425" w:right="-425" w:firstLine="0"/>
+        <w:rPr>
+          <w:sz w:val="20"/>
+          <w:szCs w:val="20"/>
+        </w:rPr>
+      </w:pPr>
+      <w:r>
+        <w:rPr>
+          <w:sz w:val="20"/>
+          <w:szCs w:val="20"/>
+        </w:rPr>
+        <w:t>Pantalla principal con restaurantes destacados</w:t>
+      </w:r>
+    </w:p>
+    <w:p>
+      <w:pPr>
+        <w:spacing w:after="120"/>
+        <w:ind w:left="-425" w:right="-425" w:firstLine="0"/>
+        <w:rPr>
+          <w:sz w:val="20"/>
+          <w:szCs w:val="20"/>
+        </w:rPr>
+      </w:pPr>
+      <w:r>
+        <w:rPr>
+          <w:sz w:val="20"/>
+          <w:szCs w:val="20"/>
+        </w:rPr>
+        <w:t>Seguimiento del pedido en tiempo real</w:t>
+      </w:r>
+    </w:p>
+    <w:p>
+      <w:pPr>
+        <w:spacing w:before="120"/>
+        <w:ind w:left="-425" w:right="-425" w:firstLine="0"/>
+        <w:rPr>
+          <w:b/>
+          <w:bCs/>
+        </w:rPr>
+      </w:pPr>
+      <w:r>
+        <w:rPr>
+          <w:b/>
+          <w:bCs/>
+        </w:rPr>
+        <w:t>Nivel 2 (Niveles Secundarios)</w:t>
+      </w:r>
+      <w:r>
+        <w:rPr>
+          <w:b/>
+          <w:bCs/>
+        </w:rPr>
+        <w:t>:</w:t>
+      </w:r>
+    </w:p>
+    <w:p>
+      <w:pPr>
+        <w:spacing w:after="120"/>
+        <w:ind w:left="-426" w:right="-425" w:firstLine="0"/>
+        <w:rPr>
+          <w:sz w:val="20"/>
+          <w:szCs w:val="20"/>
+        </w:rPr>
+      </w:pPr>
+      <w:r>
+        <w:rPr>
+          <w:sz w:val="20"/>
+          <w:szCs w:val="20"/>
+        </w:rPr>
+        <w:t xml:space="preserve">Desde </w:t>
+      </w:r>
+      <w:proofErr w:type="spellStart"/>
+      <w:r>
+        <w:rPr>
+          <w:sz w:val="20"/>
+          <w:szCs w:val="20"/>
+        </w:rPr>
+        <w:t>Dashboard</w:t>
+      </w:r>
+      <w:proofErr w:type="spellEnd"/>
+      <w:r>
+        <w:rPr>
+          <w:sz w:val="20"/>
+          <w:szCs w:val="20"/>
+        </w:rPr>
+        <w:tab/>
+      </w:r>
+      <w:r>
+        <w:rPr>
+          <w:rFonts w:ascii="Montserrat" w:hAnsi="Montserrat"/>
+          <w:b/>
+          <w:bCs/>
+          <w:color w:val="5BBCB6"/>
+          <w:sz w:val="20"/>
+          <w:szCs w:val="20"/>
+        </w:rPr>
+        <w:t>-&gt;</w:t>
+      </w:r>
+      <w:r>
+        <w:rPr>
+          <w:b/>
+          <w:bCs/>
+          <w:color w:val="5BBCB6"/>
+          <w:sz w:val="20"/>
+          <w:szCs w:val="20"/>
+        </w:rPr>
+        <w:t xml:space="preserve"> </w:t>
+      </w:r>
+      <w:r>
+        <w:rPr>
+          <w:b/>
+          <w:bCs/>
+          <w:color w:val="5BBCB6"/>
+          <w:sz w:val="20"/>
+          <w:szCs w:val="20"/>
+        </w:rPr>
+        <w:t xml:space="preserve">  </w:t>
+      </w:r>
+      <w:r>
+        <w:rPr>
+          <w:sz w:val="20"/>
+          <w:szCs w:val="20"/>
+        </w:rPr>
+        <w:t xml:space="preserve">   </w:t>
+      </w:r>
+      <w:r>
+        <w:rPr>
+          <w:sz w:val="20"/>
+          <w:szCs w:val="20"/>
+        </w:rPr>
+        <w:t xml:space="preserve">Buscador </w:t>
+      </w:r>
+      <w:r>
+        <w:rPr>
+          <w:sz w:val="20"/>
+          <w:szCs w:val="20"/>
+        </w:rPr>
+        <w:t>de platos por tipo de cocina</w:t>
+      </w:r>
+    </w:p>
+    <w:p>
+      <w:pPr>
+        <w:spacing w:after="120"/>
+        <w:ind w:left="-426" w:right="-425" w:firstLine="992"/>
+        <w:rPr>
+          <w:sz w:val="20"/>
+          <w:szCs w:val="20"/>
+        </w:rPr>
+      </w:pPr>
+      <w:r>
+        <w:rPr>
+          <w:sz w:val="20"/>
+          <w:szCs w:val="20"/>
+        </w:rPr>
+        <w:t xml:space="preserve"> </w:t>
+      </w:r>
+      <w:r>
+        <w:rPr>
+          <w:sz w:val="20"/>
+          <w:szCs w:val="20"/>
+        </w:rPr>
+        <w:tab/>
+      </w:r>
+      <w:r>
+        <w:rPr>
+          <w:sz w:val="20"/>
+          <w:szCs w:val="20"/>
+        </w:rPr>
+        <w:tab/>
+      </w:r>
+      <w:r>
+        <w:rPr>
+          <w:rFonts w:ascii="Montserrat" w:hAnsi="Montserrat"/>
+          <w:b/>
+          <w:bCs/>
+          <w:color w:val="5BBCB6"/>
+          <w:sz w:val="20"/>
+          <w:szCs w:val="20"/>
+        </w:rPr>
+        <w:t>-&gt;</w:t>
+      </w:r>
+      <w:r>
+        <w:rPr>
+          <w:sz w:val="20"/>
+          <w:szCs w:val="20"/>
+        </w:rPr>
+        <w:t xml:space="preserve"> </w:t>
+      </w:r>
+      <w:r>
+        <w:rPr>
+          <w:sz w:val="20"/>
+          <w:szCs w:val="20"/>
+        </w:rPr>
+        <w:t xml:space="preserve">     </w:t>
+      </w:r>
+      <w:r>
+        <w:rPr>
+          <w:sz w:val="20"/>
+          <w:szCs w:val="20"/>
+        </w:rPr>
+        <w:t>Historial de pedidos anteriores</w:t>
+      </w:r>
+    </w:p>
+    <w:p>
+      <w:pPr>
+        <w:spacing w:after="120"/>
+        <w:ind w:left="282" w:right="-425" w:firstLine="1134"/>
+        <w:rPr>
+          <w:sz w:val="20"/>
+          <w:szCs w:val="20"/>
+        </w:rPr>
+      </w:pPr>
+      <w:r>
+        <w:rPr>
+          <w:rFonts w:ascii="Montserrat" w:hAnsi="Montserrat"/>
+          <w:b/>
+          <w:bCs/>
+          <w:color w:val="5BBCB6"/>
+          <w:sz w:val="20"/>
+          <w:szCs w:val="20"/>
+        </w:rPr>
+        <w:t>-&gt;</w:t>
+      </w:r>
+      <w:r>
+        <w:rPr>
+          <w:b/>
+          <w:bCs/>
+          <w:color w:val="5BBCB6"/>
+          <w:sz w:val="20"/>
+          <w:szCs w:val="20"/>
+        </w:rPr>
+        <w:t xml:space="preserve"> </w:t>
+      </w:r>
+      <w:r>
+        <w:rPr>
+          <w:sz w:val="20"/>
+          <w:szCs w:val="20"/>
+        </w:rPr>
+        <w:t xml:space="preserve">     </w:t>
+      </w:r>
+      <w:r>
+        <w:rPr>
+          <w:sz w:val="20"/>
+          <w:szCs w:val="20"/>
+        </w:rPr>
+        <w:t xml:space="preserve">Carrito de la compra actual </w:t>
+      </w:r>
+      <w:r>
+        <w:rPr>
+          <w:sz w:val="20"/>
+          <w:szCs w:val="20"/>
+        </w:rPr>
+        <w:t xml:space="preserve">   </w:t>
+      </w:r>
+      <w:r>
+        <w:rPr>
+          <w:b/>
+          <w:bCs/>
+          <w:color w:val="5BBCB6"/>
+          <w:sz w:val="20"/>
+          <w:szCs w:val="20"/>
+        </w:rPr>
+        <w:t xml:space="preserve">  </w:t>
+      </w:r>
+      <w:r>
+        <w:rPr>
+          <w:rFonts w:ascii="Montserrat" w:hAnsi="Montserrat"/>
+          <w:b/>
+          <w:bCs/>
+          <w:color w:val="5BBCB6"/>
+          <w:sz w:val="20"/>
+          <w:szCs w:val="20"/>
+        </w:rPr>
+        <w:t>-&gt;</w:t>
+      </w:r>
+      <w:r>
+        <w:rPr>
+          <w:color w:val="5BBCB6"/>
+          <w:sz w:val="20"/>
+          <w:szCs w:val="20"/>
+        </w:rPr>
+        <w:t xml:space="preserve">     </w:t>
+      </w:r>
+      <w:r>
+        <w:rPr>
+          <w:color w:val="5BBCB6"/>
+          <w:sz w:val="20"/>
+          <w:szCs w:val="20"/>
+        </w:rPr>
+        <w:t xml:space="preserve"> </w:t>
+      </w:r>
+      <w:r>
+        <w:rPr>
+          <w:sz w:val="20"/>
+          <w:szCs w:val="20"/>
+        </w:rPr>
+        <w:t>Pasarela de pago (dirección y tarjeta)</w:t>
+      </w:r>
+    </w:p>
+    <w:p>
+      <w:pPr>
+        <w:spacing w:after="120"/>
+        <w:ind w:left="282" w:right="-425" w:firstLine="1134"/>
+        <w:rPr>
+          <w:sz w:val="20"/>
+          <w:szCs w:val="20"/>
+        </w:rPr>
+      </w:pPr>
+      <w:r>
+        <w:rPr>
+          <w:rFonts w:ascii="Montserrat" w:hAnsi="Montserrat"/>
+          <w:b/>
+          <w:bCs/>
+          <w:color w:val="5BBCB6"/>
+          <w:sz w:val="20"/>
+          <w:szCs w:val="20"/>
+        </w:rPr>
+        <w:t>-&gt;</w:t>
+      </w:r>
+      <w:r>
+        <w:rPr>
+          <w:rFonts w:ascii="Montserrat" w:hAnsi="Montserrat"/>
+          <w:sz w:val="20"/>
+          <w:szCs w:val="20"/>
+        </w:rPr>
+        <w:t xml:space="preserve"> </w:t>
+      </w:r>
+      <w:r>
+        <w:rPr>
+          <w:sz w:val="20"/>
+          <w:szCs w:val="20"/>
+        </w:rPr>
+        <w:t xml:space="preserve">     </w:t>
+      </w:r>
+      <w:r>
+        <w:rPr>
+          <w:sz w:val="20"/>
+          <w:szCs w:val="20"/>
+        </w:rPr>
+        <w:t>Perfil de usuario</w:t>
+      </w:r>
+      <w:r>
+        <w:rPr>
+          <w:sz w:val="20"/>
+          <w:szCs w:val="20"/>
+        </w:rPr>
+        <w:t xml:space="preserve"> </w:t>
+      </w:r>
+      <w:r>
+        <w:rPr>
+          <w:sz w:val="20"/>
+          <w:szCs w:val="20"/>
+        </w:rPr>
+        <w:t xml:space="preserve">    </w:t>
+      </w:r>
+      <w:r>
+        <w:rPr>
+          <w:rFonts w:ascii="Montserrat" w:hAnsi="Montserrat"/>
+          <w:sz w:val="20"/>
+          <w:szCs w:val="20"/>
+        </w:rPr>
+        <w:t xml:space="preserve"> </w:t>
+      </w:r>
+      <w:r>
+        <w:rPr>
+          <w:rFonts w:ascii="Montserrat" w:hAnsi="Montserrat"/>
+          <w:b/>
+          <w:bCs/>
+          <w:color w:val="5BBCB6"/>
+          <w:sz w:val="20"/>
+          <w:szCs w:val="20"/>
+        </w:rPr>
+        <w:t>-&gt;</w:t>
+      </w:r>
+      <w:r>
+        <w:rPr>
+          <w:sz w:val="20"/>
+          <w:szCs w:val="20"/>
+        </w:rPr>
+        <w:t xml:space="preserve"> </w:t>
+      </w:r>
+      <w:r>
+        <w:rPr>
+          <w:sz w:val="20"/>
+          <w:szCs w:val="20"/>
+        </w:rPr>
+        <w:t xml:space="preserve">     </w:t>
+      </w:r>
+      <w:r>
+        <w:rPr>
+          <w:sz w:val="20"/>
+          <w:szCs w:val="20"/>
+        </w:rPr>
+        <w:t>Centro de soporte y chat con atención al cliente</w:t>
+      </w:r>
+    </w:p>
+    <w:p>
+      <w:pPr>
+        <w:spacing w:after="120"/>
+        <w:ind w:left="-426" w:right="-425" w:firstLine="0"/>
+        <w:rPr>
+          <w:sz w:val="20"/>
+          <w:szCs w:val="20"/>
+        </w:rPr>
+      </w:pPr>
+      <w:r>
+        <w:rPr>
+          <w:sz w:val="20"/>
+          <w:szCs w:val="20"/>
+        </w:rPr>
+        <w:t>Desde</w:t>
+      </w:r>
+      <w:r>
+        <w:rPr>
+          <w:sz w:val="20"/>
+          <w:szCs w:val="20"/>
+        </w:rPr>
+        <w:t xml:space="preserve"> Pantalla principal con restaurantes</w:t>
+      </w:r>
+      <w:r>
+        <w:rPr>
+          <w:sz w:val="20"/>
+          <w:szCs w:val="20"/>
+        </w:rPr>
+        <w:t xml:space="preserve"> </w:t>
+      </w:r>
+      <w:r>
+        <w:rPr>
+          <w:sz w:val="20"/>
+          <w:szCs w:val="20"/>
+        </w:rPr>
+        <w:t xml:space="preserve">    </w:t>
+      </w:r>
+      <w:r>
+        <w:rPr>
+          <w:rFonts w:ascii="Montserrat" w:hAnsi="Montserrat"/>
+          <w:sz w:val="20"/>
+          <w:szCs w:val="20"/>
+        </w:rPr>
+        <w:t xml:space="preserve"> </w:t>
+      </w:r>
+      <w:r>
+        <w:rPr>
+          <w:rFonts w:ascii="Montserrat" w:hAnsi="Montserrat"/>
+          <w:b/>
+          <w:bCs/>
+          <w:color w:val="5BBCB6"/>
+          <w:sz w:val="20"/>
+          <w:szCs w:val="20"/>
+        </w:rPr>
+        <w:t>-&gt;</w:t>
+      </w:r>
+      <w:r>
+        <w:rPr>
+          <w:sz w:val="20"/>
+          <w:szCs w:val="20"/>
+        </w:rPr>
+        <w:t xml:space="preserve">     </w:t>
+      </w:r>
+      <w:r>
+        <w:rPr>
+          <w:sz w:val="20"/>
+          <w:szCs w:val="20"/>
+        </w:rPr>
+        <w:t xml:space="preserve"> </w:t>
+      </w:r>
+      <w:r>
+        <w:rPr>
+          <w:sz w:val="20"/>
+          <w:szCs w:val="20"/>
+        </w:rPr>
+        <w:t>Ficha de detalle del restaurante (menú y valoraciones)</w:t>
       </w:r>
     </w:p>
     <w:p>
       <w:pPr>
         <w:ind w:left="-426" w:right="-427" w:firstLine="0"/>
         <w:rPr>
-          <w:sz w:val="20"/>
-          <w:szCs w:val="20"/>
-        </w:rPr>
-      </w:pPr>
-      <w:r>
-        <w:rPr>
-          <w:sz w:val="20"/>
-          <w:szCs w:val="20"/>
-        </w:rPr>
-        <w:t>Pantalla de acceso y registro</w:t>
-      </w:r>
-    </w:p>
-    <w:p>
-      <w:pPr>
-        <w:ind w:left="-426" w:right="-427" w:firstLine="0"/>
-      </w:pPr>
-    </w:p>
-    <w:p>
-      <w:pPr>
-        <w:ind w:left="-426" w:right="-427" w:firstLine="0"/>
-        <w:rPr>
-          <w:b/>
-          <w:bCs/>
-        </w:rPr>
-      </w:pPr>
-      <w:r>
-        <w:rPr>
-          <w:b/>
-          <w:bCs/>
-        </w:rPr>
-        <w:t>Nivel 1 (Navegación principal)</w:t>
-      </w:r>
-      <w:r>
-        <w:rPr>
-          <w:b/>
-          <w:bCs/>
-        </w:rPr>
-        <w:t>:</w:t>
-      </w:r>
-    </w:p>
-    <w:p>
-      <w:pPr>
-        <w:ind w:left="-426" w:right="-427" w:firstLine="0"/>
-        <w:rPr>
-          <w:sz w:val="20"/>
-          <w:szCs w:val="20"/>
-        </w:rPr>
-      </w:pPr>
-      <w:r>
-        <w:rPr>
-          <w:sz w:val="20"/>
-          <w:szCs w:val="20"/>
-        </w:rPr>
-        <w:t>Pantalla principal con restaurantes destacados</w:t>
-      </w:r>
-    </w:p>
-    <w:p>
-      <w:pPr>
-        <w:ind w:left="-426" w:right="-427" w:firstLine="0"/>
-        <w:rPr>
-          <w:sz w:val="20"/>
-          <w:szCs w:val="20"/>
-        </w:rPr>
-      </w:pPr>
-      <w:r>
-        <w:rPr>
-          <w:sz w:val="20"/>
-          <w:szCs w:val="20"/>
-        </w:rPr>
-        <w:t>Seguimiento del pedido en tiempo real</w:t>
-      </w:r>
-    </w:p>
-    <w:p>
-      <w:pPr>
-        <w:ind w:left="-426" w:right="-427" w:firstLine="0"/>
-      </w:pPr>
-    </w:p>
-    <w:p>
-      <w:pPr>
-        <w:ind w:left="-426" w:right="-427" w:firstLine="0"/>
-        <w:rPr>
-          <w:b/>
-          <w:bCs/>
-        </w:rPr>
-      </w:pPr>
-      <w:r>
-        <w:rPr>
-          <w:b/>
-          <w:bCs/>
-        </w:rPr>
-        <w:t>Nivel 2 (Niveles Secundarios)</w:t>
-      </w:r>
-      <w:r>
-        <w:rPr>
-          <w:b/>
-          <w:bCs/>
-        </w:rPr>
-        <w:t>:</w:t>
-      </w:r>
-    </w:p>
-    <w:p>
-      <w:pPr>
-        <w:ind w:left="-426" w:right="-427" w:firstLine="0"/>
-        <w:rPr>
-          <w:sz w:val="20"/>
-          <w:szCs w:val="20"/>
-        </w:rPr>
-      </w:pPr>
-      <w:r>
-        <w:rPr>
-          <w:sz w:val="20"/>
-          <w:szCs w:val="20"/>
-        </w:rPr>
-        <w:t xml:space="preserve">Desde </w:t>
-      </w:r>
-      <w:proofErr w:type="spellStart"/>
-      <w:r>
-        <w:rPr>
-          <w:sz w:val="20"/>
-          <w:szCs w:val="20"/>
-        </w:rPr>
-        <w:t>Dashboard</w:t>
-      </w:r>
-      <w:proofErr w:type="spellEnd"/>
-      <w:r>
-        <w:rPr>
-          <w:sz w:val="20"/>
-          <w:szCs w:val="20"/>
-        </w:rPr>
-        <w:tab/>
-      </w:r>
-      <w:r>
-        <w:rPr>
-          <w:rFonts w:ascii="Montserrat" w:hAnsi="Montserrat"/>
-          <w:b/>
-          <w:bCs/>
-          <w:color w:val="5BBCB6"/>
-          <w:sz w:val="20"/>
-          <w:szCs w:val="20"/>
-        </w:rPr>
-        <w:t>-&gt;</w:t>
-      </w:r>
-      <w:r>
-        <w:rPr>
-          <w:b/>
-          <w:bCs/>
-          <w:color w:val="5BBCB6"/>
-          <w:sz w:val="20"/>
-          <w:szCs w:val="20"/>
-        </w:rPr>
-        <w:t xml:space="preserve"> </w:t>
-      </w:r>
-      <w:r>
-        <w:rPr>
-          <w:b/>
-          <w:bCs/>
-          <w:color w:val="5BBCB6"/>
-          <w:sz w:val="20"/>
-          <w:szCs w:val="20"/>
-        </w:rPr>
-        <w:t xml:space="preserve">  </w:t>
-      </w:r>
-      <w:r>
-        <w:rPr>
-          <w:sz w:val="20"/>
-          <w:szCs w:val="20"/>
-        </w:rPr>
-        <w:t xml:space="preserve">   </w:t>
-      </w:r>
-      <w:r>
-        <w:rPr>
-          <w:sz w:val="20"/>
-          <w:szCs w:val="20"/>
-        </w:rPr>
-        <w:t xml:space="preserve">Buscador </w:t>
-      </w:r>
-      <w:r>
-        <w:rPr>
-          <w:sz w:val="20"/>
-          <w:szCs w:val="20"/>
-        </w:rPr>
-        <w:t>de platos por tipo de cocina</w:t>
-      </w:r>
-    </w:p>
-    <w:p>
-      <w:pPr>
-        <w:ind w:left="-426" w:right="-427" w:firstLine="992"/>
-        <w:rPr>
-          <w:sz w:val="20"/>
-          <w:szCs w:val="20"/>
-        </w:rPr>
-      </w:pPr>
-      <w:r>
-        <w:rPr>
-          <w:sz w:val="20"/>
-          <w:szCs w:val="20"/>
-        </w:rPr>
-        <w:t xml:space="preserve"> </w:t>
-      </w:r>
-      <w:r>
-        <w:rPr>
-          <w:sz w:val="20"/>
-          <w:szCs w:val="20"/>
-        </w:rPr>
-        <w:tab/>
-      </w:r>
-      <w:r>
-        <w:rPr>
-          <w:sz w:val="20"/>
-          <w:szCs w:val="20"/>
-        </w:rPr>
-        <w:tab/>
-      </w:r>
-      <w:r>
-        <w:rPr>
-          <w:rFonts w:ascii="Montserrat" w:hAnsi="Montserrat"/>
-          <w:b/>
-          <w:bCs/>
-          <w:color w:val="5BBCB6"/>
-          <w:sz w:val="20"/>
-          <w:szCs w:val="20"/>
-        </w:rPr>
-        <w:t>-&gt;</w:t>
-      </w:r>
-      <w:r>
-        <w:rPr>
-          <w:sz w:val="20"/>
-          <w:szCs w:val="20"/>
-        </w:rPr>
-        <w:t xml:space="preserve"> </w:t>
-      </w:r>
-      <w:r>
-        <w:rPr>
-          <w:sz w:val="20"/>
-          <w:szCs w:val="20"/>
-        </w:rPr>
-        <w:t xml:space="preserve">     </w:t>
-      </w:r>
-      <w:r>
-        <w:rPr>
-          <w:sz w:val="20"/>
-          <w:szCs w:val="20"/>
-        </w:rPr>
-        <w:t>Historial de pedidos anteriores</w:t>
-      </w:r>
-    </w:p>
-    <w:p>
-      <w:pPr>
-        <w:ind w:left="282" w:right="-427" w:firstLine="1134"/>
-        <w:rPr>
-          <w:sz w:val="20"/>
-          <w:szCs w:val="20"/>
-        </w:rPr>
-      </w:pPr>
-      <w:r>
-        <w:rPr>
-          <w:rFonts w:ascii="Montserrat" w:hAnsi="Montserrat"/>
-          <w:b/>
-          <w:bCs/>
-          <w:color w:val="5BBCB6"/>
-          <w:sz w:val="20"/>
-          <w:szCs w:val="20"/>
-        </w:rPr>
-        <w:t>-&gt;</w:t>
-      </w:r>
-      <w:r>
-        <w:rPr>
-          <w:b/>
-          <w:bCs/>
-          <w:color w:val="5BBCB6"/>
-          <w:sz w:val="20"/>
-          <w:szCs w:val="20"/>
-        </w:rPr>
-        <w:t xml:space="preserve"> </w:t>
-      </w:r>
-      <w:r>
-        <w:rPr>
-          <w:sz w:val="20"/>
-          <w:szCs w:val="20"/>
-        </w:rPr>
-        <w:t xml:space="preserve">     </w:t>
-      </w:r>
-      <w:r>
-        <w:rPr>
-          <w:sz w:val="20"/>
-          <w:szCs w:val="20"/>
-        </w:rPr>
-        <w:t xml:space="preserve">Carrito de la compra actual </w:t>
-      </w:r>
-      <w:r>
-        <w:rPr>
-          <w:sz w:val="20"/>
-          <w:szCs w:val="20"/>
-        </w:rPr>
-        <w:t xml:space="preserve">   </w:t>
-      </w:r>
-      <w:r>
-        <w:rPr>
-          <w:b/>
-          <w:bCs/>
-          <w:color w:val="5BBCB6"/>
-          <w:sz w:val="20"/>
-          <w:szCs w:val="20"/>
-        </w:rPr>
-        <w:t xml:space="preserve">  </w:t>
-      </w:r>
-      <w:r>
-        <w:rPr>
-          <w:rFonts w:ascii="Montserrat" w:hAnsi="Montserrat"/>
-          <w:b/>
-          <w:bCs/>
-          <w:color w:val="5BBCB6"/>
-          <w:sz w:val="20"/>
-          <w:szCs w:val="20"/>
-        </w:rPr>
-        <w:t>-&gt;</w:t>
-      </w:r>
-      <w:r>
-        <w:rPr>
-          <w:color w:val="5BBCB6"/>
-          <w:sz w:val="20"/>
-          <w:szCs w:val="20"/>
-        </w:rPr>
-        <w:t xml:space="preserve">     </w:t>
-      </w:r>
-      <w:r>
-        <w:rPr>
-          <w:color w:val="5BBCB6"/>
-          <w:sz w:val="20"/>
-          <w:szCs w:val="20"/>
-        </w:rPr>
-        <w:t xml:space="preserve"> </w:t>
-      </w:r>
-      <w:r>
-        <w:rPr>
-          <w:sz w:val="20"/>
-          <w:szCs w:val="20"/>
-        </w:rPr>
-        <w:t>Pasarela de pago (dirección y tarjeta)</w:t>
-      </w:r>
-    </w:p>
-    <w:p>
-      <w:pPr>
-        <w:ind w:left="282" w:right="-427" w:firstLine="1134"/>
-        <w:rPr>
-          <w:sz w:val="20"/>
-          <w:szCs w:val="20"/>
-        </w:rPr>
-      </w:pPr>
-      <w:r>
-        <w:rPr>
-          <w:rFonts w:ascii="Montserrat" w:hAnsi="Montserrat"/>
-          <w:b/>
-          <w:bCs/>
-          <w:color w:val="5BBCB6"/>
-          <w:sz w:val="20"/>
-          <w:szCs w:val="20"/>
-        </w:rPr>
-        <w:t>-&gt;</w:t>
-      </w:r>
-      <w:r>
-        <w:rPr>
-          <w:rFonts w:ascii="Montserrat" w:hAnsi="Montserrat"/>
-          <w:sz w:val="20"/>
-          <w:szCs w:val="20"/>
-        </w:rPr>
-        <w:t xml:space="preserve"> </w:t>
-      </w:r>
-      <w:r>
-        <w:rPr>
-          <w:sz w:val="20"/>
-          <w:szCs w:val="20"/>
-        </w:rPr>
-        <w:t xml:space="preserve">     </w:t>
-      </w:r>
-      <w:r>
-        <w:rPr>
-          <w:sz w:val="20"/>
-          <w:szCs w:val="20"/>
-        </w:rPr>
-        <w:t>Perfil de usuario</w:t>
-      </w:r>
-      <w:r>
-        <w:rPr>
-          <w:sz w:val="20"/>
-          <w:szCs w:val="20"/>
-        </w:rPr>
-        <w:t xml:space="preserve"> </w:t>
-      </w:r>
-      <w:r>
-        <w:rPr>
-          <w:sz w:val="20"/>
-          <w:szCs w:val="20"/>
-        </w:rPr>
-        <w:t xml:space="preserve">    </w:t>
-      </w:r>
-      <w:r>
-        <w:rPr>
-          <w:rFonts w:ascii="Montserrat" w:hAnsi="Montserrat"/>
-          <w:sz w:val="20"/>
-          <w:szCs w:val="20"/>
-        </w:rPr>
-        <w:t xml:space="preserve"> </w:t>
-      </w:r>
-      <w:r>
-        <w:rPr>
-          <w:rFonts w:ascii="Montserrat" w:hAnsi="Montserrat"/>
-          <w:b/>
-          <w:bCs/>
-          <w:color w:val="5BBCB6"/>
-          <w:sz w:val="20"/>
-          <w:szCs w:val="20"/>
-        </w:rPr>
-        <w:t>-&gt;</w:t>
-      </w:r>
-      <w:r>
-        <w:rPr>
-          <w:sz w:val="20"/>
-          <w:szCs w:val="20"/>
-        </w:rPr>
-        <w:t xml:space="preserve"> </w:t>
-      </w:r>
-      <w:r>
-        <w:rPr>
-          <w:sz w:val="20"/>
-          <w:szCs w:val="20"/>
-        </w:rPr>
-        <w:t xml:space="preserve">     </w:t>
-      </w:r>
-      <w:r>
-        <w:rPr>
-          <w:sz w:val="20"/>
-          <w:szCs w:val="20"/>
-        </w:rPr>
-        <w:t>Centro de soporte y chat con atención al cliente</w:t>
-      </w:r>
-    </w:p>
-    <w:p>
-      <w:pPr>
-        <w:ind w:left="-426" w:right="-427" w:firstLine="0"/>
-        <w:rPr>
-          <w:sz w:val="20"/>
-          <w:szCs w:val="20"/>
-        </w:rPr>
-      </w:pPr>
-      <w:r>
-        <w:rPr>
-          <w:sz w:val="20"/>
-          <w:szCs w:val="20"/>
-        </w:rPr>
-        <w:t>Desde</w:t>
-      </w:r>
-      <w:r>
-        <w:rPr>
-          <w:sz w:val="20"/>
-          <w:szCs w:val="20"/>
-        </w:rPr>
-        <w:t xml:space="preserve"> Pantalla principal con restaurantes</w:t>
-      </w:r>
-      <w:r>
-        <w:rPr>
-          <w:sz w:val="20"/>
-          <w:szCs w:val="20"/>
-        </w:rPr>
-        <w:t xml:space="preserve"> </w:t>
-      </w:r>
-      <w:r>
-        <w:rPr>
-          <w:sz w:val="20"/>
-          <w:szCs w:val="20"/>
-        </w:rPr>
-        <w:t xml:space="preserve">    </w:t>
-      </w:r>
-      <w:r>
-        <w:rPr>
-          <w:rFonts w:ascii="Montserrat" w:hAnsi="Montserrat"/>
-          <w:sz w:val="20"/>
-          <w:szCs w:val="20"/>
-        </w:rPr>
-        <w:t xml:space="preserve"> </w:t>
-      </w:r>
-      <w:r>
-        <w:rPr>
-          <w:rFonts w:ascii="Montserrat" w:hAnsi="Montserrat"/>
-          <w:b/>
-          <w:bCs/>
-          <w:color w:val="5BBCB6"/>
-          <w:sz w:val="20"/>
-          <w:szCs w:val="20"/>
-        </w:rPr>
-        <w:t>-&gt;</w:t>
-      </w:r>
-      <w:r>
-        <w:rPr>
-          <w:sz w:val="20"/>
-          <w:szCs w:val="20"/>
-        </w:rPr>
-        <w:t xml:space="preserve">     </w:t>
-      </w:r>
-      <w:r>
-        <w:rPr>
-          <w:sz w:val="20"/>
-          <w:szCs w:val="20"/>
-        </w:rPr>
-        <w:t xml:space="preserve"> </w:t>
-      </w:r>
-      <w:r>
-        <w:rPr>
-          <w:sz w:val="20"/>
-          <w:szCs w:val="20"/>
-        </w:rPr>
-        <w:t>Ficha de detalle del restaurante (menú y valoraciones)</w:t>
-      </w:r>
-    </w:p>
-    <w:p>
-      <w:pPr>
-        <w:ind w:left="-426" w:right="-427" w:firstLine="0"/>
+          <w:sz w:val="16"/>
+          <w:szCs w:val="16"/>
+        </w:rPr>
       </w:pPr>
     </w:p>
     <w:p>
@@ -4770,20 +4925,76 @@
         <w:t xml:space="preserve"> resultante de la agrupación y priorización</w:t>
       </w:r>
       <w:r>
-        <w:t>.</w:t>
-      </w:r>
+        <w:t>:</w:t>
+      </w:r>
+    </w:p>
+    <w:p>
+      <w:pPr>
+        <w:ind w:left="-426" w:right="-427" w:firstLine="426"/>
+        <w:rPr>
+          <w:sz w:val="16"/>
+          <w:szCs w:val="16"/>
+        </w:rPr>
+      </w:pPr>
     </w:p>
     <w:p>
       <w:pPr>
         <w:ind w:left="-426" w:right="-427" w:firstLine="0"/>
       </w:pPr>
       <w:r>
-        <w:t>------------------------------------------------------------------------Diagrama</w:t>
-      </w:r>
-    </w:p>
-    <w:p>
-      <w:pPr>
-        <w:ind w:left="-426" w:right="-427" w:firstLine="0"/>
+        <w:rPr>
+          <w:noProof/>
+        </w:rPr>
+        <w:drawing>
+          <wp:inline distT="0" distB="0" distL="0" distR="0" wp14:anchorId="449AF4C2" wp14:editId="37C64838">
+            <wp:extent cx="5771140" cy="4371109"/>
+            <wp:effectExtent l="0" t="0" r="1270" b="0"/>
+            <wp:docPr id="1671168349" name="Imagen 7"/>
+            <wp:cNvGraphicFramePr>
+              <a:graphicFrameLocks xmlns:a="http://schemas.openxmlformats.org/drawingml/2006/main" noChangeAspect="1"/>
+            </wp:cNvGraphicFramePr>
+            <a:graphic xmlns:a="http://schemas.openxmlformats.org/drawingml/2006/main">
+              <a:graphicData uri="http://schemas.openxmlformats.org/drawingml/2006/picture">
+                <pic:pic xmlns:pic="http://schemas.openxmlformats.org/drawingml/2006/picture">
+                  <pic:nvPicPr>
+                    <pic:cNvPr id="1671168349" name="Imagen 1671168349"/>
+                    <pic:cNvPicPr/>
+                  </pic:nvPicPr>
+                  <pic:blipFill>
+                    <a:blip r:embed="rId13">
+                      <a:extLst>
+                        <a:ext uri="{28A0092B-C50C-407E-A947-70E740481C1C}">
+                          <a14:useLocalDpi xmlns:a14="http://schemas.microsoft.com/office/drawing/2010/main" val="0"/>
+                        </a:ext>
+                      </a:extLst>
+                    </a:blip>
+                    <a:stretch>
+                      <a:fillRect/>
+                    </a:stretch>
+                  </pic:blipFill>
+                  <pic:spPr>
+                    <a:xfrm>
+                      <a:off x="0" y="0"/>
+                      <a:ext cx="5780474" cy="4378179"/>
+                    </a:xfrm>
+                    <a:prstGeom prst="rect">
+                      <a:avLst/>
+                    </a:prstGeom>
+                  </pic:spPr>
+                </pic:pic>
+              </a:graphicData>
+            </a:graphic>
+          </wp:inline>
+        </w:drawing>
+      </w:r>
+    </w:p>
+    <w:p>
+      <w:pPr>
+        <w:ind w:right="-427" w:firstLine="0"/>
+        <w:rPr>
+          <w:sz w:val="16"/>
+          <w:szCs w:val="16"/>
+        </w:rPr>
       </w:pPr>
     </w:p>
     <w:p>
@@ -4797,6 +5008,7 @@
       </w:pPr>
       <w:bookmarkStart w:id="11" w:name="_Toc240331171"/>
       <w:r>
+        <w:lastRenderedPageBreak/>
         <w:t xml:space="preserve">      </w:t>
       </w:r>
       <w:r>
@@ -4815,6 +5027,10 @@
     <w:p>
       <w:pPr>
         <w:ind w:right="-427" w:firstLine="0"/>
+        <w:rPr>
+          <w:sz w:val="16"/>
+          <w:szCs w:val="16"/>
+        </w:rPr>
       </w:pPr>
     </w:p>
     <w:p>
@@ -4893,7 +5109,6 @@
           <w:b/>
           <w:bCs/>
         </w:rPr>
-        <w:lastRenderedPageBreak/>
         <w:t>¿Por qué?:</w:t>
       </w:r>
       <w:r>
@@ -5053,6 +5268,10 @@
     <w:p>
       <w:pPr>
         <w:ind w:left="-426" w:right="-427" w:firstLine="0"/>
+        <w:rPr>
+          <w:sz w:val="16"/>
+          <w:szCs w:val="16"/>
+        </w:rPr>
       </w:pPr>
     </w:p>
     <w:p>
@@ -5283,16 +5502,11 @@
     <w:p>
       <w:pPr>
         <w:ind w:left="2124" w:right="-427" w:hanging="2550"/>
-      </w:pPr>
-    </w:p>
-    <w:p>
-      <w:pPr>
-        <w:ind w:right="-427" w:firstLine="0"/>
-        <w:rPr>
-          <w:i/>
-        </w:rPr>
-      </w:pPr>
-      <w:bookmarkStart w:id="12" w:name="_Toc209556236"/>
+        <w:rPr>
+          <w:sz w:val="16"/>
+          <w:szCs w:val="16"/>
+        </w:rPr>
+      </w:pPr>
     </w:p>
     <w:p>
       <w:pPr>
@@ -5304,6 +5518,7 @@
           <w:szCs w:val="20"/>
         </w:rPr>
       </w:pPr>
+      <w:bookmarkStart w:id="12" w:name="_Toc209556236"/>
       <w:bookmarkStart w:id="13" w:name="_Toc240331172"/>
       <w:r>
         <w:rPr>
@@ -5321,47 +5536,28 @@
         <w:pStyle w:val="Cita"/>
         <w:spacing w:before="0" w:line="240" w:lineRule="auto"/>
         <w:ind w:left="-426" w:right="-427" w:firstLine="0"/>
-        <w:rPr>
-          <w:lang w:val="en-GB"/>
-        </w:rPr>
       </w:pPr>
       <w:proofErr w:type="spellStart"/>
       <w:r>
-        <w:rPr>
-          <w:lang w:val="en-GB"/>
-        </w:rPr>
         <w:t>A</w:t>
       </w:r>
       <w:r>
-        <w:rPr>
-          <w:lang w:val="en-GB"/>
-        </w:rPr>
         <w:t>ule</w:t>
       </w:r>
       <w:r>
-        <w:rPr>
-          <w:lang w:val="en-GB"/>
-        </w:rPr>
         <w:t>s</w:t>
       </w:r>
       <w:proofErr w:type="spellEnd"/>
       <w:r>
-        <w:rPr>
-          <w:lang w:val="en-GB"/>
-        </w:rPr>
         <w:t xml:space="preserve"> </w:t>
       </w:r>
       <w:r>
-        <w:rPr>
-          <w:lang w:val="en-GB"/>
-        </w:rPr>
         <w:t xml:space="preserve">- </w:t>
       </w:r>
-      <w:hyperlink r:id="rId11" w:history="1">
+      <w:hyperlink r:id="rId14" w:history="1">
         <w:r>
           <w:rPr>
             <w:rStyle w:val="Hipervnculo"/>
-            <w:lang w:val="en-GB"/>
           </w:rPr>
           <w:t>https://aules.edu.gva.es/semipresencial/pluginfile.php/4311811/mod_assign/introattachment/0/DIN_UD1_Act1_Ejemplo.pdf?forcedownload=1</w:t>
         </w:r>
@@ -5382,7 +5578,7 @@
       <w:r>
         <w:t xml:space="preserve"> - </w:t>
       </w:r>
-      <w:hyperlink r:id="rId12" w:anchor="anchor-1" w:history="1">
+      <w:hyperlink r:id="rId15" w:anchor="anchor-1" w:history="1">
         <w:r>
           <w:rPr>
             <w:rStyle w:val="Hipervnculo"/>
@@ -5394,16 +5590,9 @@
         <w:t xml:space="preserve"> </w:t>
       </w:r>
     </w:p>
-    <w:p>
-      <w:pPr>
-        <w:pStyle w:val="Cita"/>
-        <w:spacing w:before="0" w:line="240" w:lineRule="auto"/>
-        <w:ind w:right="-427" w:firstLine="0"/>
-      </w:pPr>
-    </w:p>
     <w:sectPr>
-      <w:headerReference w:type="default" r:id="rId13"/>
-      <w:footerReference w:type="default" r:id="rId14"/>
+      <w:headerReference w:type="default" r:id="rId16"/>
+      <w:footerReference w:type="default" r:id="rId17"/>
       <w:pgSz w:w="11906" w:h="16838"/>
       <w:pgMar w:top="1560" w:right="1701" w:bottom="1417" w:left="1701" w:header="708" w:footer="708" w:gutter="0"/>
       <w:pgNumType w:start="1"/>
@@ -7971,21 +8160,6 @@
 </file>
 
 <file path=customXml/item2.xml><?xml version="1.0" encoding="utf-8"?>
-<?mso-contentType ?>
-<FormTemplates xmlns="http://schemas.microsoft.com/sharepoint/v3/contenttype/forms">
-  <Display>DocumentLibraryForm</Display>
-  <Edit>DocumentLibraryForm</Edit>
-  <New>DocumentLibraryForm</New>
-</FormTemplates>
-</file>
-
-<file path=customXml/item3.xml><?xml version="1.0" encoding="utf-8"?>
-<p:properties xmlns:p="http://schemas.microsoft.com/office/2006/metadata/properties" xmlns:xsi="http://www.w3.org/2001/XMLSchema-instance" xmlns:pc="http://schemas.microsoft.com/office/infopath/2007/PartnerControls">
-  <documentManagement/>
-</p:properties>
-</file>
-
-<file path=customXml/item4.xml><?xml version="1.0" encoding="utf-8"?>
 <ct:contentTypeSchema xmlns:ct="http://schemas.microsoft.com/office/2006/metadata/contentType" xmlns:ma="http://schemas.microsoft.com/office/2006/metadata/properties/metaAttributes" ct:_="" ma:_="" ma:contentTypeName="Documento" ma:contentTypeID="0x010100E847573596BCB242B231189B5AEC6B57" ma:contentTypeVersion="5" ma:contentTypeDescription="Crear nuevo documento." ma:contentTypeScope="" ma:versionID="5e1dd3f328a4c753ac7136579e5e4ed6">
   <xsd:schema xmlns:xsd="http://www.w3.org/2001/XMLSchema" xmlns:xs="http://www.w3.org/2001/XMLSchema" xmlns:p="http://schemas.microsoft.com/office/2006/metadata/properties" xmlns:ns3="2f97d7bb-1d95-4f44-94c4-63279acfa932" targetNamespace="http://schemas.microsoft.com/office/2006/metadata/properties" ma:root="true" ma:fieldsID="e2a6eca137e46c22dcdb3ca86b420a18" ns3:_="">
     <xsd:import namespace="2f97d7bb-1d95-4f44-94c4-63279acfa932"/>
@@ -8135,6 +8309,21 @@
 </ct:contentTypeSchema>
 </file>
 
+<file path=customXml/item3.xml><?xml version="1.0" encoding="utf-8"?>
+<p:properties xmlns:p="http://schemas.microsoft.com/office/2006/metadata/properties" xmlns:xsi="http://www.w3.org/2001/XMLSchema-instance" xmlns:pc="http://schemas.microsoft.com/office/infopath/2007/PartnerControls">
+  <documentManagement/>
+</p:properties>
+</file>
+
+<file path=customXml/item4.xml><?xml version="1.0" encoding="utf-8"?>
+<?mso-contentType ?>
+<FormTemplates xmlns="http://schemas.microsoft.com/sharepoint/v3/contenttype/forms">
+  <Display>DocumentLibraryForm</Display>
+  <Edit>DocumentLibraryForm</Edit>
+  <New>DocumentLibraryForm</New>
+</FormTemplates>
+</file>
+
 <file path=customXml/itemProps1.xml><?xml version="1.0" encoding="utf-8"?>
 <ds:datastoreItem xmlns:ds="http://schemas.openxmlformats.org/officeDocument/2006/customXml" ds:itemID="{55AF091B-3C7A-41E3-B477-F2FDAA23CFDA}">
   <ds:schemaRefs>
@@ -8144,23 +8333,6 @@
 </file>
 
 <file path=customXml/itemProps2.xml><?xml version="1.0" encoding="utf-8"?>
-<ds:datastoreItem xmlns:ds="http://schemas.openxmlformats.org/officeDocument/2006/customXml" ds:itemID="{ED5AE9E1-EFDC-4B8D-B6B1-0A6F0BD0C7CC}">
-  <ds:schemaRefs>
-    <ds:schemaRef ds:uri="http://schemas.microsoft.com/sharepoint/v3/contenttype/forms"/>
-  </ds:schemaRefs>
-</ds:datastoreItem>
-</file>
-
-<file path=customXml/itemProps3.xml><?xml version="1.0" encoding="utf-8"?>
-<ds:datastoreItem xmlns:ds="http://schemas.openxmlformats.org/officeDocument/2006/customXml" ds:itemID="{EDFFCF16-D741-4CED-AF53-5B904CDC7B44}">
-  <ds:schemaRefs>
-    <ds:schemaRef ds:uri="http://schemas.microsoft.com/office/2006/metadata/properties"/>
-    <ds:schemaRef ds:uri="http://schemas.microsoft.com/office/infopath/2007/PartnerControls"/>
-  </ds:schemaRefs>
-</ds:datastoreItem>
-</file>
-
-<file path=customXml/itemProps4.xml><?xml version="1.0" encoding="utf-8"?>
 <ds:datastoreItem xmlns:ds="http://schemas.openxmlformats.org/officeDocument/2006/customXml" ds:itemID="{C9AB1843-5927-4416-B398-4826755EDCD1}">
   <ds:schemaRefs>
     <ds:schemaRef ds:uri="http://schemas.microsoft.com/office/2006/metadata/contentType"/>
@@ -8176,4 +8348,21 @@
     <ds:schemaRef ds:uri="http://schemas.microsoft.com/internal/obd"/>
   </ds:schemaRefs>
 </ds:datastoreItem>
+</file>
+
+<file path=customXml/itemProps3.xml><?xml version="1.0" encoding="utf-8"?>
+<ds:datastoreItem xmlns:ds="http://schemas.openxmlformats.org/officeDocument/2006/customXml" ds:itemID="{EDFFCF16-D741-4CED-AF53-5B904CDC7B44}">
+  <ds:schemaRefs>
+    <ds:schemaRef ds:uri="http://schemas.microsoft.com/office/2006/metadata/properties"/>
+    <ds:schemaRef ds:uri="http://schemas.microsoft.com/office/infopath/2007/PartnerControls"/>
+  </ds:schemaRefs>
+</ds:datastoreItem>
+</file>
+
+<file path=customXml/itemProps4.xml><?xml version="1.0" encoding="utf-8"?>
+<ds:datastoreItem xmlns:ds="http://schemas.openxmlformats.org/officeDocument/2006/customXml" ds:itemID="{ED5AE9E1-EFDC-4B8D-B6B1-0A6F0BD0C7CC}">
+  <ds:schemaRefs>
+    <ds:schemaRef ds:uri="http://schemas.microsoft.com/sharepoint/v3/contenttype/forms"/>
+  </ds:schemaRefs>
+</ds:datastoreItem>
 </file>
</xml_diff>

<commit_message>
Finalización Actividad 1 DI
</commit_message>
<xml_diff>
--- a/Desarrollo_de_Interfaces/UD1_Fundamentos_y_Disenyo_de_Interfaces_de_Usuario/Análisis_3_apps.docx
+++ b/Desarrollo_de_Interfaces/UD1_Fundamentos_y_Disenyo_de_Interfaces_de_Usuario/Análisis_3_apps.docx
@@ -1478,26 +1478,54 @@
       <w:pPr>
         <w:pStyle w:val="Ttulo2"/>
         <w:ind w:left="-709" w:right="-427"/>
+        <w:rPr>
+          <w:b/>
+          <w:bCs/>
+        </w:rPr>
       </w:pPr>
       <w:bookmarkStart w:id="1" w:name="_Toc240331161"/>
       <w:r>
+        <w:rPr>
+          <w:b/>
+          <w:bCs/>
+        </w:rPr>
         <w:t>1.1</w:t>
       </w:r>
       <w:r>
+        <w:rPr>
+          <w:b/>
+          <w:bCs/>
+        </w:rPr>
         <w:tab/>
       </w:r>
       <w:r>
+        <w:rPr>
+          <w:b/>
+          <w:bCs/>
+        </w:rPr>
         <w:t>A</w:t>
       </w:r>
       <w:r>
+        <w:rPr>
+          <w:b/>
+          <w:bCs/>
+        </w:rPr>
         <w:t xml:space="preserve">grupación y priorización (Card </w:t>
       </w:r>
       <w:proofErr w:type="spellStart"/>
       <w:r>
+        <w:rPr>
+          <w:b/>
+          <w:bCs/>
+        </w:rPr>
         <w:t>Sorting</w:t>
       </w:r>
       <w:proofErr w:type="spellEnd"/>
       <w:r>
+        <w:rPr>
+          <w:b/>
+          <w:bCs/>
+        </w:rPr>
         <w:t>)</w:t>
       </w:r>
       <w:bookmarkEnd w:id="1"/>
@@ -2087,22 +2115,42 @@
       <w:pPr>
         <w:pStyle w:val="Ttulo2"/>
         <w:ind w:left="-709" w:right="-427"/>
+        <w:rPr>
+          <w:b/>
+          <w:bCs/>
+        </w:rPr>
       </w:pPr>
       <w:bookmarkStart w:id="2" w:name="_Toc240331162"/>
       <w:r>
+        <w:rPr>
+          <w:b/>
+          <w:bCs/>
+        </w:rPr>
         <w:lastRenderedPageBreak/>
         <w:t>1.2</w:t>
       </w:r>
       <w:r>
+        <w:rPr>
+          <w:b/>
+          <w:bCs/>
+        </w:rPr>
         <w:tab/>
         <w:t>Creación del Mapa de Sitio (</w:t>
       </w:r>
       <w:proofErr w:type="spellStart"/>
       <w:r>
+        <w:rPr>
+          <w:b/>
+          <w:bCs/>
+        </w:rPr>
         <w:t>Sitemap</w:t>
       </w:r>
       <w:proofErr w:type="spellEnd"/>
       <w:r>
+        <w:rPr>
+          <w:b/>
+          <w:bCs/>
+        </w:rPr>
         <w:t>)</w:t>
       </w:r>
       <w:bookmarkEnd w:id="2"/>
@@ -2198,12 +2246,24 @@
       <w:pPr>
         <w:pStyle w:val="Ttulo2"/>
         <w:ind w:left="-709" w:right="-427"/>
+        <w:rPr>
+          <w:b/>
+          <w:bCs/>
+        </w:rPr>
       </w:pPr>
       <w:bookmarkStart w:id="3" w:name="_Toc240331163"/>
       <w:r>
+        <w:rPr>
+          <w:b/>
+          <w:bCs/>
+        </w:rPr>
         <w:t>1.3</w:t>
       </w:r>
       <w:r>
+        <w:rPr>
+          <w:b/>
+          <w:bCs/>
+        </w:rPr>
         <w:tab/>
         <w:t>Adaptación tecnológica y Justificación del Menú</w:t>
       </w:r>
@@ -2935,21 +2995,41 @@
       <w:pPr>
         <w:pStyle w:val="Ttulo2"/>
         <w:ind w:left="-709" w:right="-427"/>
+        <w:rPr>
+          <w:b/>
+          <w:bCs/>
+        </w:rPr>
       </w:pPr>
       <w:bookmarkStart w:id="5" w:name="_Toc240331165"/>
       <w:r>
+        <w:rPr>
+          <w:b/>
+          <w:bCs/>
+        </w:rPr>
         <w:t>2.1</w:t>
       </w:r>
       <w:r>
+        <w:rPr>
+          <w:b/>
+          <w:bCs/>
+        </w:rPr>
         <w:tab/>
         <w:t xml:space="preserve">Agrupación y priorización (Card </w:t>
       </w:r>
       <w:proofErr w:type="spellStart"/>
       <w:r>
+        <w:rPr>
+          <w:b/>
+          <w:bCs/>
+        </w:rPr>
         <w:t>Sorting</w:t>
       </w:r>
       <w:proofErr w:type="spellEnd"/>
       <w:r>
+        <w:rPr>
+          <w:b/>
+          <w:bCs/>
+        </w:rPr>
         <w:t>)</w:t>
       </w:r>
       <w:bookmarkEnd w:id="5"/>
@@ -3499,21 +3579,41 @@
       <w:pPr>
         <w:pStyle w:val="Ttulo2"/>
         <w:ind w:left="-709" w:right="-427"/>
+        <w:rPr>
+          <w:b/>
+          <w:bCs/>
+        </w:rPr>
       </w:pPr>
       <w:bookmarkStart w:id="6" w:name="_Toc240331166"/>
       <w:r>
+        <w:rPr>
+          <w:b/>
+          <w:bCs/>
+        </w:rPr>
         <w:t>2.2</w:t>
       </w:r>
       <w:r>
+        <w:rPr>
+          <w:b/>
+          <w:bCs/>
+        </w:rPr>
         <w:tab/>
         <w:t>Creación del Mapa de Sitio (</w:t>
       </w:r>
       <w:proofErr w:type="spellStart"/>
       <w:r>
+        <w:rPr>
+          <w:b/>
+          <w:bCs/>
+        </w:rPr>
         <w:t>Sitemap</w:t>
       </w:r>
       <w:proofErr w:type="spellEnd"/>
       <w:r>
+        <w:rPr>
+          <w:b/>
+          <w:bCs/>
+        </w:rPr>
         <w:t>)</w:t>
       </w:r>
       <w:bookmarkEnd w:id="6"/>
@@ -3609,12 +3709,24 @@
       <w:pPr>
         <w:pStyle w:val="Ttulo2"/>
         <w:ind w:left="-709" w:right="-427"/>
+        <w:rPr>
+          <w:b/>
+          <w:bCs/>
+        </w:rPr>
       </w:pPr>
       <w:bookmarkStart w:id="7" w:name="_Toc240331167"/>
       <w:r>
+        <w:rPr>
+          <w:b/>
+          <w:bCs/>
+        </w:rPr>
         <w:t>2.3</w:t>
       </w:r>
       <w:r>
+        <w:rPr>
+          <w:b/>
+          <w:bCs/>
+        </w:rPr>
         <w:tab/>
         <w:t>Adaptación tecnológica y Justificación del Menú</w:t>
       </w:r>
@@ -4298,21 +4410,41 @@
       <w:pPr>
         <w:pStyle w:val="Ttulo2"/>
         <w:ind w:left="-709" w:right="-427"/>
+        <w:rPr>
+          <w:b/>
+          <w:bCs/>
+        </w:rPr>
       </w:pPr>
       <w:bookmarkStart w:id="9" w:name="_Toc240331169"/>
       <w:r>
+        <w:rPr>
+          <w:b/>
+          <w:bCs/>
+        </w:rPr>
         <w:t>3.1</w:t>
       </w:r>
       <w:r>
+        <w:rPr>
+          <w:b/>
+          <w:bCs/>
+        </w:rPr>
         <w:tab/>
         <w:t xml:space="preserve">Agrupación y priorización (Card </w:t>
       </w:r>
       <w:proofErr w:type="spellStart"/>
       <w:r>
+        <w:rPr>
+          <w:b/>
+          <w:bCs/>
+        </w:rPr>
         <w:t>Sorting</w:t>
       </w:r>
       <w:proofErr w:type="spellEnd"/>
       <w:r>
+        <w:rPr>
+          <w:b/>
+          <w:bCs/>
+        </w:rPr>
         <w:t>)</w:t>
       </w:r>
       <w:bookmarkEnd w:id="9"/>
@@ -4891,21 +5023,41 @@
       <w:pPr>
         <w:pStyle w:val="Ttulo2"/>
         <w:ind w:left="-709" w:right="-427"/>
+        <w:rPr>
+          <w:b/>
+          <w:bCs/>
+        </w:rPr>
       </w:pPr>
       <w:bookmarkStart w:id="10" w:name="_Toc240331170"/>
       <w:r>
+        <w:rPr>
+          <w:b/>
+          <w:bCs/>
+        </w:rPr>
         <w:t>3.2</w:t>
       </w:r>
       <w:r>
+        <w:rPr>
+          <w:b/>
+          <w:bCs/>
+        </w:rPr>
         <w:tab/>
         <w:t>Creación del Mapa de Sitio (</w:t>
       </w:r>
       <w:proofErr w:type="spellStart"/>
       <w:r>
+        <w:rPr>
+          <w:b/>
+          <w:bCs/>
+        </w:rPr>
         <w:t>Sitemap</w:t>
       </w:r>
       <w:proofErr w:type="spellEnd"/>
       <w:r>
+        <w:rPr>
+          <w:b/>
+          <w:bCs/>
+        </w:rPr>
         <w:t>)</w:t>
       </w:r>
       <w:bookmarkEnd w:id="10"/>
@@ -5005,13 +5157,25 @@
           <w:numId w:val="8"/>
         </w:numPr>
         <w:ind w:right="-427"/>
+        <w:rPr>
+          <w:b/>
+          <w:bCs/>
+        </w:rPr>
       </w:pPr>
       <w:bookmarkStart w:id="11" w:name="_Toc240331171"/>
       <w:r>
+        <w:rPr>
+          <w:b/>
+          <w:bCs/>
+        </w:rPr>
         <w:lastRenderedPageBreak/>
         <w:t xml:space="preserve">      </w:t>
       </w:r>
       <w:r>
+        <w:rPr>
+          <w:b/>
+          <w:bCs/>
+        </w:rPr>
         <w:t>Adaptación tecnológica y Justificación del Menú</w:t>
       </w:r>
       <w:bookmarkEnd w:id="11"/>
@@ -5514,6 +5678,8 @@
         <w:ind w:left="-284" w:right="-427"/>
         <w:rPr>
           <w:rStyle w:val="nfasisintenso"/>
+          <w:b/>
+          <w:bCs/>
           <w:sz w:val="20"/>
           <w:szCs w:val="20"/>
         </w:rPr>
@@ -5523,6 +5689,8 @@
       <w:r>
         <w:rPr>
           <w:rStyle w:val="nfasisintenso"/>
+          <w:b/>
+          <w:bCs/>
           <w:sz w:val="20"/>
           <w:szCs w:val="20"/>
         </w:rPr>
@@ -5789,7 +5957,15 @@
         <w:sz w:val="18"/>
         <w:szCs w:val="18"/>
       </w:rPr>
-      <w:t>14</w:t>
+      <w:t>1</w:t>
+    </w:r>
+    <w:r>
+      <w:rPr>
+        <w:color w:val="ADADAD" w:themeColor="background2" w:themeShade="BF"/>
+        <w:sz w:val="18"/>
+        <w:szCs w:val="18"/>
+      </w:rPr>
+      <w:t>5</w:t>
     </w:r>
     <w:r>
       <w:rPr>

</xml_diff>